<commit_message>
feat: 용례 확인 #1
</commit_message>
<xml_diff>
--- a/paper/jkiie_submit_body.docx
+++ b/paper/jkiie_submit_body.docx
@@ -69,7 +69,7 @@
           <w:color w:val="000000"/>
           <w:sz w:val="20"/>
         </w:rPr>
-        <w:t xml:space="preserve">도착 시각(release time)과 soft due date를 갖는 컴파운드 트럭 크로스도킹 스케줄링: 정확해 검증을 동반한 병목 유도 반복 지역탐색</w:t>
+        <w:t xml:space="preserve">도착 시각(release time)과 soft due date를 갖는 입출고 병행 트럭 크로스도킹 스케줄링: 정확해 검증을 동반한 병목 유도 반복 지역탐색</w:t>
       </w:r>
       <w:r>
         <w:rPr>
@@ -167,7 +167,7 @@
           <w:color w:val="000000"/>
           <w:sz w:val="20"/>
         </w:rPr>
-        <w:t xml:space="preserve">발전시킨 컴파운드 트럭 변형에서는 한 대의 트럭이 두 역할을 겸한다. 여러 목적지</w:t>
+        <w:t xml:space="preserve">발전시킨 병행 트럭(compound truck) 변형에서는 한 대의 트럭이 두 역할을 겸한다. 여러 목적지</w:t>
       </w:r>
       <w:r>
         <w:rPr>
@@ -253,7 +253,7 @@
           <w:color w:val="000000"/>
           <w:sz w:val="20"/>
         </w:rPr>
-        <w:t xml:space="preserve">기존 컴파운드 트럭 모델의 두 가정이 현실성을 제약한다. 첫째, 모든 트럭이 시각</w:t>
+        <w:t xml:space="preserve">기존 병행 트럭 모델의 두 가정이 현실성을 제약한다. 첫째, 모든 트럭이 시각</w:t>
       </w:r>
       <w:r>
         <w:rPr>
@@ -337,7 +337,7 @@
           <w:color w:val="000000"/>
           <w:sz w:val="20"/>
         </w:rPr>
-        <w:t xml:space="preserve">그러나 컴파운드 트럭 설정은 temporal constraint의 의미를 바꾼다. 컴파운드 트럭은</w:t>
+        <w:t xml:space="preserve">그러나 병행 트럭 설정은 temporal constraint의 의미를 바꾼다. 병행 트럭은</w:t>
       </w:r>
       <w:r>
         <w:rPr>
@@ -593,7 +593,7 @@
           <w:color w:val="000000"/>
           <w:sz w:val="20"/>
         </w:rPr>
-        <w:t xml:space="preserve">본 논문의 기여는 세 가지다. 첫째, 부분 하역 컴파운드 트럭 스케줄링을 트럭별</w:t>
+        <w:t xml:space="preserve">본 논문의 기여는 세 가지다. 첫째, 부분 하역 병행 트럭 스케줄링을 트럭별</w:t>
       </w:r>
       <w:r>
         <w:rPr>
@@ -696,7 +696,7 @@
           <w:color w:val="000000"/>
           <w:sz w:val="20"/>
         </w:rPr>
-        <w:t xml:space="preserve">선택의 추가 효과는 동일 예산의 균등 선택과 비교하는 보조적인 ablation으로 검토한다.</w:t>
+        <w:t xml:space="preserve">선택의 추가 효과는 동일한 반복 횟수의 균등 선택과 비교하는 보조적인 ablation으로 검토한다.</w:t>
       </w:r>
     </w:p>
     <w:bookmarkEnd w:id="9"/>
@@ -1181,7 +1181,7 @@
           <w:color w:val="000000"/>
           <w:sz w:val="20"/>
         </w:rPr>
-        <w:t xml:space="preserve">반면 본 문제의 유연성은 트럭 수준에 있어, 부분 하역된 컴파운드 트럭이 특정 목적지의</w:t>
+        <w:t xml:space="preserve">반면 본 문제의 유연성은 트럭 수준에 있어, 부분 하역된 병행 트럭이 특정 목적지의</w:t>
       </w:r>
       <w:r>
         <w:rPr>
@@ -1348,7 +1348,7 @@
           <w:color w:val="000000"/>
           <w:sz w:val="20"/>
         </w:rPr>
-        <w:t xml:space="preserve">을 각각 컴파운드 트럭, 출고 트럭, 목적지, 상품 종류,</w:t>
+        <w:t xml:space="preserve">을 각각 병행 트럭, 출고 트럭, 목적지, 상품 종류,</w:t>
       </w:r>
       <w:r>
         <w:rPr>
@@ -1487,7 +1487,7 @@
           <w:color w:val="000000"/>
           <w:sz w:val="20"/>
         </w:rPr>
-        <w:t xml:space="preserve">이라 하자. 컴파운드 트럭</w:t>
+        <w:t xml:space="preserve">이라 하자. 병행 트럭</w:t>
       </w:r>
       <w:r>
         <w:rPr>
@@ -1934,7 +1934,7 @@
           <w:color w:val="000000"/>
           <w:sz w:val="20"/>
         </w:rPr>
-        <w:t xml:space="preserve">컴파운드 트럭은 유지할 목적지 하나와 도어 하나를(도어당 컴파운드 최대 1대), 각</w:t>
+        <w:t xml:space="preserve">병행 트럭은 유지할 목적지 하나와 도어 하나를(도어당 병행 트럭 최대 1대), 각</w:t>
       </w:r>
       <w:r>
         <w:rPr>
@@ -2083,7 +2083,7 @@
           <w:color w:val="000000"/>
           <w:sz w:val="20"/>
         </w:rPr>
-        <w:t xml:space="preserve">컴파운드 트럭</w:t>
+        <w:t xml:space="preserve">병행 트럭</w:t>
       </w:r>
       <w:r>
         <w:rPr>
@@ -2272,7 +2272,7 @@
           <w:color w:val="000000"/>
           <w:sz w:val="20"/>
         </w:rPr>
-        <w:t xml:space="preserve">시간 계산은 스케줄 평가기 규칙을 따른다. 컴파운드 트럭</w:t>
+        <w:t xml:space="preserve">시간 계산은 스케줄 평가기 규칙을 따른다. 병행 트럭</w:t>
       </w:r>
       <w:r>
         <w:rPr>
@@ -2927,7 +2927,7 @@
           <w:color w:val="000000"/>
           <w:sz w:val="20"/>
         </w:rPr>
-        <w:t xml:space="preserve">은 컴파운드 트럭</w:t>
+        <w:t xml:space="preserve">은 병행 트럭</w:t>
       </w:r>
       <w:r>
         <w:rPr>
@@ -3474,21 +3474,21 @@
           <w:color w:val="000000"/>
           <w:sz w:val="20"/>
         </w:rPr>
-        <w:t xml:space="preserve">는 각각 컴파운드</w:t>
-      </w:r>
-      <w:r>
-        <w:rPr>
-          <w:color w:val="000000"/>
-          <w:sz w:val="20"/>
-        </w:rPr>
-        <w:t xml:space="preserve"> </w:t>
-      </w:r>
-      <w:r>
-        <w:rPr>
-          <w:color w:val="000000"/>
-          <w:sz w:val="20"/>
-        </w:rPr>
-        <w:t xml:space="preserve">하역 완료, 컴파운드 완료, 출고 도어 작업 시작, 출고 완료, makespan이다.</w:t>
+        <w:t xml:space="preserve">는 각각 병행 트럭의 하역 완료, 병행 트럭의 도어 작업 완료,</w:t>
+      </w:r>
+      <w:r>
+        <w:rPr>
+          <w:color w:val="000000"/>
+          <w:sz w:val="20"/>
+        </w:rPr>
+        <w:t xml:space="preserve"/>
+      </w:r>
+      <w:r>
+        <w:rPr>
+          <w:color w:val="000000"/>
+          <w:sz w:val="20"/>
+        </w:rPr>
+        <w:t xml:space="preserve"> 출고 도어 작업 시작, 출고 완료, makespan이다.</w:t>
       </w:r>
       <w:r>
         <w:rPr>
@@ -4134,7 +4134,7 @@
           <w:color w:val="000000"/>
           <w:sz w:val="20"/>
         </w:rPr>
-        <w:t xml:space="preserve">컴파운드 트럭의 시간 관계와 유입 이송 선행 제약은 다음과 같다.</w:t>
+        <w:t xml:space="preserve">병행 트럭의 시간 관계와 유입 이송 선행 제약은 다음과 같다.</w:t>
       </w:r>
     </w:p>
     <w:p>
@@ -6674,7 +6674,7 @@
           <w:color w:val="000000"/>
           <w:sz w:val="20"/>
         </w:rPr>
-        <w:t xml:space="preserve">사용한다. 컴파운드 트럭</w:t>
+        <w:t xml:space="preserve">사용한다. 병행 트럭</w:t>
       </w:r>
       <w:r>
         <w:rPr>
@@ -8461,7 +8461,7 @@
           <w:color w:val="000000"/>
           <w:sz w:val="20"/>
         </w:rPr>
-        <w:t>원 모델의 VAA는 Vogel식 regret으로 컴파운드 트럭의 유지 목적지를 정하고, 완료 시각 우선순위에 따라 출고 목적지를 배정한다. 도어 배정은 먼저 처리되는 트럭을 도어 간 이송시간 합이 가장 작은 중앙 도어에 두고, 나머지 트럭은 작업 종료가 가장 이른 도어에 차례로 삽입한다. 모든 완료 예정 시각 계산에는 release time을 반영한다.</w:t>
+        <w:t xml:space="preserve">원 모델의 VAA는 Vogel식 regret으로 병행 트럭의 유지 목적지를 정하고, 완료 시각 우선순위에 따라 출고 목적지를 배정한다. 도어 배정은 먼저 처리되는 트럭을 도어 간 이송시간 합이 가장 작은 중앙 도어에 두고, 나머지 트럭은 작업 종료가 가장 이른 도어에 차례로 삽입한다. 모든 완료 예정 시각 계산에는 release time을 반영한다.</w:t>
       </w:r>
       <w:r>
         <w:rPr>
@@ -8515,7 +8515,7 @@
           <w:color w:val="000000"/>
           <w:sz w:val="20"/>
         </w:rPr>
-        <w:t xml:space="preserve">세 가지 이동 유형(출고 트럭 재배치, 컴파운드 트럭의 도어 교환/빈 도어 이동, 두</w:t>
+        <w:t xml:space="preserve">세 가지 이동 유형(출고 트럭 재배치, 병행 트럭의 도어 교환/빈 도어 이동, 두</w:t>
       </w:r>
       <w:r>
         <w:rPr>
@@ -9015,49 +9015,49 @@
           <w:color w:val="000000"/>
           <w:sz w:val="20"/>
         </w:rPr>
-        <w:t xml:space="preserve">(k1) 두 트럭의 목적지 교환, (k2) 컴파운드 트럭 간 도어 교환, (k3) 출고 트럭 간 도어</w:t>
-      </w:r>
-      <w:r>
-        <w:rPr>
-          <w:color w:val="000000"/>
-          <w:sz w:val="20"/>
-        </w:rPr>
-        <w:t xml:space="preserve"> </w:t>
-      </w:r>
-      <w:r>
-        <w:rPr>
-          <w:color w:val="000000"/>
-          <w:sz w:val="20"/>
-        </w:rPr>
-        <w:t xml:space="preserve">교환, (k4) 출고 트럭을 다른 도어로 삽입, (k6) 하역시간 기반 룰렛 선택으로 컴파운드</w:t>
-      </w:r>
-      <w:r>
-        <w:rPr>
-          <w:color w:val="000000"/>
-          <w:sz w:val="20"/>
-        </w:rPr>
-        <w:t xml:space="preserve"> </w:t>
-      </w:r>
-      <w:r>
-        <w:rPr>
-          <w:color w:val="000000"/>
-          <w:sz w:val="20"/>
-        </w:rPr>
-        <w:t xml:space="preserve">트럭을 도어에 삽입, (k7) 적재시간 기반 룰렛 선택으로 출고 트럭을 도어에 삽입,</w:t>
-      </w:r>
-      <w:r>
-        <w:rPr>
-          <w:color w:val="000000"/>
-          <w:sz w:val="20"/>
-        </w:rPr>
-        <w:t xml:space="preserve"> </w:t>
-      </w:r>
-      <w:r>
-        <w:rPr>
-          <w:color w:val="000000"/>
-          <w:sz w:val="20"/>
-        </w:rPr>
-        <w:t xml:space="preserve">(k8) 룰렛 선택으로 컴파운드 트럭에 목적지를 배정. 원 모델은 이동을 k1–k8로</w:t>
+        <w:t xml:space="preserve">(k1) 두 트럭의 목적지 교환, (k2) 병행 트럭 간 도어 교환, (k3) 출고 트럭 간 도어</w:t>
+      </w:r>
+      <w:r>
+        <w:rPr>
+          <w:color w:val="000000"/>
+          <w:sz w:val="20"/>
+        </w:rPr>
+        <w:t xml:space="preserve"> </w:t>
+      </w:r>
+      <w:r>
+        <w:rPr>
+          <w:color w:val="000000"/>
+          <w:sz w:val="20"/>
+        </w:rPr>
+        <w:t xml:space="preserve">교환, (k4) 출고 트럭을 다른 도어로 삽입, (k6) 하역시간 기반 룰렛 선택으로 병행 트럭</w:t>
+      </w:r>
+      <w:r>
+        <w:rPr>
+          <w:color w:val="000000"/>
+          <w:sz w:val="20"/>
+        </w:rPr>
+        <w:t xml:space="preserve"/>
+      </w:r>
+      <w:r>
+        <w:rPr>
+          <w:color w:val="000000"/>
+          <w:sz w:val="20"/>
+        </w:rPr>
+        <w:t xml:space="preserve">을 도어에 삽입, (k7) 적재시간 기반 룰렛 선택으로 출고 트럭을 도어에 삽입,</w:t>
+      </w:r>
+      <w:r>
+        <w:rPr>
+          <w:color w:val="000000"/>
+          <w:sz w:val="20"/>
+        </w:rPr>
+        <w:t xml:space="preserve"> </w:t>
+      </w:r>
+      <w:r>
+        <w:rPr>
+          <w:color w:val="000000"/>
+          <w:sz w:val="20"/>
+        </w:rPr>
+        <w:t xml:space="preserve">(k8) 룰렛 선택으로 병행 트럭에 목적지를 배정. 원 모델은 이동을 k1–k8로</w:t>
       </w:r>
       <w:r>
         <w:rPr>
@@ -9246,7 +9246,7 @@
           <w:color w:val="000000"/>
           <w:sz w:val="20"/>
         </w:rPr>
-        <w:t>)은 ablation 목적으로만 평가하며 제안 방법의 일부가 아니다. tabular Q는 원 모델과 같이 무개선 구간 5-상태에서 ε-greedy 탐험과 룰렛 활용을 쓰되, 보상은 원 모델의 이진 보상(후보가 현재 해보다 나쁘지 않으면 1, 아니면 0) 대신 신규 incumbent 2·비악화 1·그 외 0의 셰이핑 보상을 사용한다. 이는 학습 신호를 강화할 뿐이므로 비교 대상 selector를 불리하게 만들지 않는다. 원 모델 SA-RL5는 RL이 단일 이동을 고르고 SA accept/reject로 한 단계가 끝나는</w:t>
+        <w:t xml:space="preserve">)은 ablation 목적으로만 평가하며 제안 방법의 일부가 아니다. tabular Q는 원 모델과 같이 무개선 구간 5-상태에서 ε-greedy 탐험과 룰렛 활용을 쓰되, 보상은 원 모델의 이진 보상(후보가 현재 해보다 나쁘지 않으면 1, 아니면 0) 대신 신규 incumbent 2·비악화 1·그 외 0의 셰이핑 보상을 사용한다. 이는 학습 신호를 강화할 뿐이므로 비교 대상 selector를 불리하게 만들지 않는다. 원 모델 SA-RL5는 RL이 단일 이동을 고르고 SA accept/reject로 한 단계가 끝나는</w:t>
       </w:r>
       <w:r>
         <w:rPr>
@@ -10189,21 +10189,21 @@
           <w:color w:val="000000"/>
           <w:sz w:val="20"/>
         </w:rPr>
-        <w:t xml:space="preserve">, 컴파운드</w:t>
-      </w:r>
-      <w:r>
-        <w:rPr>
-          <w:color w:val="000000"/>
-          <w:sz w:val="20"/>
-        </w:rPr>
-        <w:t xml:space="preserve"> </w:t>
-      </w:r>
-      <w:r>
-        <w:rPr>
-          <w:color w:val="000000"/>
-          <w:sz w:val="20"/>
-        </w:rPr>
-        <w:t xml:space="preserve">비율</w:t>
+        <w:t xml:space="preserve">, 병행 트럭 비율</w:t>
+      </w:r>
+      <w:r>
+        <w:rPr>
+          <w:color w:val="000000"/>
+          <w:sz w:val="20"/>
+        </w:rPr>
+        <w:t xml:space="preserve"/>
+      </w:r>
+      <w:r>
+        <w:rPr>
+          <w:color w:val="000000"/>
+          <w:sz w:val="20"/>
+        </w:rPr>
+        <w:t xml:space="preserve"/>
       </w:r>
       <w:r>
         <w:rPr>
@@ -10669,7 +10669,7 @@
           <w:color w:val="000000"/>
           <w:sz w:val="20"/>
         </w:rPr>
-        <w:t xml:space="preserve">동일예산·동일구조 분해이므로 원래의 5-인스턴스 설계를 유지한다. 인스턴스별로</w:t>
+        <w:t xml:space="preserve">동일한 반복 횟수·동일 구조 분해이므로 원래의 5-인스턴스 설계를 유지한다. 인스턴스별로</w:t>
       </w:r>
       <w:r>
         <w:rPr>
@@ -10697,21 +10697,21 @@
           <w:color w:val="000000"/>
           <w:sz w:val="20"/>
         </w:rPr>
-        <w:t xml:space="preserve">적용한다. GILS는 1</w:t>
-      </w:r>
-      <w:r>
-        <w:rPr>
-          <w:color w:val="000000"/>
-          <w:sz w:val="20"/>
-        </w:rPr>
-        <w:t xml:space="preserve">,</w:t>
-      </w:r>
-      <w:r>
-        <w:rPr>
-          <w:color w:val="000000"/>
-          <w:sz w:val="20"/>
-        </w:rPr>
-        <w:t xml:space="preserve">000회 반복한다. CP-SAT는 인스턴스당 1회, 8 thread로 S</w:t>
+        <w:t xml:space="preserve">적용한다. GILS의 종료 조건은 반복 횟수 1,000회다.</w:t>
+      </w:r>
+      <w:r>
+        <w:rPr>
+          <w:color w:val="000000"/>
+          <w:sz w:val="20"/>
+        </w:rPr>
+        <w:t xml:space="preserve"/>
+      </w:r>
+      <w:r>
+        <w:rPr>
+          <w:color w:val="000000"/>
+          <w:sz w:val="20"/>
+        </w:rPr>
+        <w:t xml:space="preserve"> CP-SAT는 인스턴스당 1회, 8 thread로 S</w:t>
       </w:r>
       <w:r>
         <w:rPr>
@@ -10739,7 +10739,7 @@
           <w:color w:val="000000"/>
           <w:sz w:val="20"/>
         </w:rPr>
-        <w:t xml:space="preserve">모든 방법과 예산 및 CP-SAT 결과를 포함하여 관측된 최선해에 대한 인스턴스별 gap</w:t>
+        <w:t xml:space="preserve">모든 방법과 반복 횟수 및 CP-SAT 결과를 포함하여 관측된 최선해에 대한 인스턴스별 gap</w:t>
       </w:r>
       <w:r>
         <w:rPr>
@@ -15591,21 +15591,21 @@
           <w:color w:val="000000"/>
           <w:sz w:val="20"/>
         </w:rPr>
-        <w:t xml:space="preserve">세 가지 통제된 ablation(예산 1</w:t>
-      </w:r>
-      <w:r>
-        <w:rPr>
-          <w:color w:val="000000"/>
-          <w:sz w:val="20"/>
-        </w:rPr>
-        <w:t xml:space="preserve">,</w:t>
-      </w:r>
-      <w:r>
-        <w:rPr>
-          <w:color w:val="000000"/>
-          <w:sz w:val="20"/>
-        </w:rPr>
-        <w:t xml:space="preserve">000회 고정)으로 엔진을 분해한다.</w:t>
+        <w:t xml:space="preserve">세 가지 통제된 ablation(반복 횟수 1,000회 고정)으로</w:t>
+      </w:r>
+      <w:r>
+        <w:rPr>
+          <w:color w:val="000000"/>
+          <w:sz w:val="20"/>
+        </w:rPr>
+        <w:t xml:space="preserve"/>
+      </w:r>
+      <w:r>
+        <w:rPr>
+          <w:color w:val="000000"/>
+          <w:sz w:val="20"/>
+        </w:rPr>
+        <w:t xml:space="preserve"> 엔진을 분해한다.</w:t>
       </w:r>
     </w:p>
     <w:p>
@@ -15857,7 +15857,7 @@
           <w:color w:val="000000"/>
           <w:sz w:val="18"/>
         </w:rPr>
-        <w:t xml:space="preserve">5 replications per condition, budget fixed at 1,000 iterations; two-sided Wilcoxon, positive mean favors the richer operator set).</w:t>
+        <w:t xml:space="preserve">5 replications per condition, the number of iterations fixed at 1,000; two-sided Wilcoxon, positive mean favors the richer operator set).</w:t>
       </w:r>
     </w:p>
     <w:tbl>
@@ -16979,35 +16979,35 @@
           <w:color w:val="000000"/>
           <w:sz w:val="20"/>
         </w:rPr>
-        <w:t xml:space="preserve">learned policy도 uniform을 실용적으로 능가하지 못한다. 50–3</w:t>
-      </w:r>
-      <w:r>
-        <w:rPr>
-          <w:color w:val="000000"/>
-          <w:sz w:val="20"/>
-        </w:rPr>
-        <w:t xml:space="preserve">,</w:t>
-      </w:r>
-      <w:r>
-        <w:rPr>
-          <w:color w:val="000000"/>
-          <w:sz w:val="20"/>
-        </w:rPr>
-        <w:t xml:space="preserve">000회의 모든 예산</w:t>
-      </w:r>
-      <w:r>
-        <w:rPr>
-          <w:color w:val="000000"/>
-          <w:sz w:val="20"/>
-        </w:rPr>
-        <w:t xml:space="preserve"> </w:t>
-      </w:r>
-      <w:r>
-        <w:rPr>
-          <w:color w:val="000000"/>
-          <w:sz w:val="20"/>
-        </w:rPr>
-        <w:t xml:space="preserve">구간에서도 결과는 같고 우열의 방향이 예산에 따라 뒤집히며(Figure </w:t>
+        <w:t xml:space="preserve">learned policy도 uniform을 실용적으로 능가하지 못한다. 반복 횟수를 50–3,000회로 바꾸어도 결과는 같고 우열의 방향이 반복 횟수에 따라 뒤집히며</w:t>
+      </w:r>
+      <w:r>
+        <w:rPr>
+          <w:color w:val="000000"/>
+          <w:sz w:val="20"/>
+        </w:rPr>
+        <w:t xml:space="preserve"/>
+      </w:r>
+      <w:r>
+        <w:rPr>
+          <w:color w:val="000000"/>
+          <w:sz w:val="20"/>
+        </w:rPr>
+        <w:t xml:space="preserve"/>
+      </w:r>
+      <w:r>
+        <w:rPr>
+          <w:color w:val="000000"/>
+          <w:sz w:val="20"/>
+        </w:rPr>
+        <w:t xml:space="preserve"/>
+      </w:r>
+      <w:r>
+        <w:rPr>
+          <w:color w:val="000000"/>
+          <w:sz w:val="20"/>
+        </w:rPr>
+        <w:t xml:space="preserve">(Figure </w:t>
       </w:r>
       <w:hyperlink w:anchor="fig:sel">
         <w:r>
@@ -17094,7 +17094,7 @@
           <w:color w:val="000000"/>
           <w:sz w:val="18"/>
         </w:rPr>
-        <w:t xml:space="preserve">5 replications per condition, 1,000-iteration budget; two-sided Wilcoxon, positive mean favors the first method).</w:t>
+        <w:t xml:space="preserve">5 replications per condition, 1,000 iterations; two-sided Wilcoxon, positive mean favors the first method).</w:t>
       </w:r>
     </w:p>
     <w:tbl>
@@ -17834,42 +17834,42 @@
           <w:color w:val="000000"/>
           <w:sz w:val="20"/>
         </w:rPr>
-        <w:t xml:space="preserve">학습 기반 selector가 uniform 대비 이득을 주지 못한 결과는 학습 자체에 대한 일반적</w:t>
-      </w:r>
-      <w:r>
-        <w:rPr>
-          <w:color w:val="000000"/>
-          <w:sz w:val="20"/>
-        </w:rPr>
-        <w:t xml:space="preserve"> </w:t>
-      </w:r>
-      <w:r>
-        <w:rPr>
-          <w:color w:val="000000"/>
-          <w:sz w:val="20"/>
-        </w:rPr>
-        <w:t xml:space="preserve">결론이 아니라, 본 논문의 탐색 구조 안에서 해석되어야 한다. 이 엔진은 selector가</w:t>
-      </w:r>
-      <w:r>
-        <w:rPr>
-          <w:color w:val="000000"/>
-          <w:sz w:val="20"/>
-        </w:rPr>
-        <w:t xml:space="preserve"> </w:t>
-      </w:r>
-      <w:r>
-        <w:rPr>
-          <w:color w:val="000000"/>
-          <w:sz w:val="20"/>
-        </w:rPr>
-        <w:t xml:space="preserve">개입할 여지를 거의 남기지 않기 때문이다. 후보 평가가 수십</w:t>
-      </w:r>
-      <w:r>
-        <w:rPr>
-          <w:color w:val="000000"/>
-          <w:sz w:val="20"/>
-        </w:rPr>
-        <w:t xml:space="preserve"> </w:t>
+        <w:t xml:space="preserve">학습 기반 selector가 uniform 대비 이득을 주지 못한 것은 학습 일반에 대한 결론이 아니라 본 논문의 탐색 구조가 낳은 결과다. 후보 하나의 평가에 수십 </w:t>
+      </w:r>
+      <w:r>
+        <w:rPr>
+          <w:color w:val="000000"/>
+          <w:sz w:val="20"/>
+        </w:rPr>
+        <w:t xml:space="preserve"/>
+      </w:r>
+      <w:r>
+        <w:rPr>
+          <w:color w:val="000000"/>
+          <w:sz w:val="20"/>
+        </w:rPr>
+        <w:t xml:space="preserve"/>
+      </w:r>
+      <w:r>
+        <w:rPr>
+          <w:color w:val="000000"/>
+          <w:sz w:val="20"/>
+        </w:rPr>
+        <w:t xml:space="preserve"/>
+      </w:r>
+      <w:r>
+        <w:rPr>
+          <w:color w:val="000000"/>
+          <w:sz w:val="20"/>
+        </w:rPr>
+        <w:t xml:space="preserve"/>
+      </w:r>
+      <w:r>
+        <w:rPr>
+          <w:color w:val="000000"/>
+          <w:sz w:val="20"/>
+        </w:rPr>
+        <w:t xml:space="preserve"/>
       </w:r>
       <m:oMath>
         <m:r>
@@ -17881,91 +17881,91 @@
           <w:color w:val="000000"/>
           <w:sz w:val="20"/>
         </w:rPr>
-        <w:t xml:space="preserve">s로</w:t>
-      </w:r>
-      <w:r>
-        <w:rPr>
-          <w:color w:val="000000"/>
-          <w:sz w:val="20"/>
-        </w:rPr>
-        <w:t xml:space="preserve"> </w:t>
-      </w:r>
-      <w:r>
-        <w:rPr>
-          <w:color w:val="000000"/>
-          <w:sz w:val="20"/>
-        </w:rPr>
-        <w:t xml:space="preserve">저렴하고, 모든 신규 incumbent 뒤에 결정론적 descent가 따른다. 같은 basin에</w:t>
-      </w:r>
-      <w:r>
-        <w:rPr>
-          <w:color w:val="000000"/>
-          <w:sz w:val="20"/>
-        </w:rPr>
-        <w:t xml:space="preserve"> </w:t>
-      </w:r>
-      <w:r>
-        <w:rPr>
-          <w:color w:val="000000"/>
-          <w:sz w:val="20"/>
-        </w:rPr>
-        <w:t xml:space="preserve">들어간 두 실행은 선행 이동이 달라도 같은 해로 수렴할 수 있으며, budget 곡선은 이</w:t>
-      </w:r>
-      <w:r>
-        <w:rPr>
-          <w:color w:val="000000"/>
-          <w:sz w:val="20"/>
-        </w:rPr>
-        <w:t xml:space="preserve"> </w:t>
-      </w:r>
-      <w:r>
-        <w:rPr>
-          <w:color w:val="000000"/>
-          <w:sz w:val="20"/>
-        </w:rPr>
-        <w:t xml:space="preserve">수렴이 대부분의 test 인스턴스에서 1</w:t>
-      </w:r>
-      <w:r>
-        <w:rPr>
-          <w:color w:val="000000"/>
-          <w:sz w:val="20"/>
-        </w:rPr>
-        <w:t xml:space="preserve">,</w:t>
-      </w:r>
-      <w:r>
-        <w:rPr>
-          <w:color w:val="000000"/>
-          <w:sz w:val="20"/>
-        </w:rPr>
-        <w:t xml:space="preserve">000회 이전에 일어남을 시사한다. 같은</w:t>
-      </w:r>
-      <w:r>
-        <w:rPr>
-          <w:color w:val="000000"/>
-          <w:sz w:val="20"/>
-        </w:rPr>
-        <w:t xml:space="preserve"> </w:t>
-      </w:r>
-      <w:r>
-        <w:rPr>
-          <w:color w:val="000000"/>
-          <w:sz w:val="20"/>
-        </w:rPr>
-        <w:t xml:space="preserve">이유로 SA acceptance와 reheating은 기저 SA-RL5 framework와의 comparability를 위해</w:t>
-      </w:r>
-      <w:r>
-        <w:rPr>
-          <w:color w:val="000000"/>
-          <w:sz w:val="20"/>
-        </w:rPr>
-        <w:t xml:space="preserve"> </w:t>
-      </w:r>
-      <w:r>
-        <w:rPr>
-          <w:color w:val="000000"/>
-          <w:sz w:val="20"/>
-        </w:rPr>
-        <w:t xml:space="preserve">유지하였으나, ablation은 본 설정에서 이들이 해 품질에 필수적이지 않음을 보인다.</w:t>
+        <w:t xml:space="preserve">s밖에 들지 않아 연산자를 잘 고르는 것보다 많이 시도하는 편이 유리하고, 모든 신규 최선해 뒤에 결정론적 descent가 따라붙어 어떤 연산자로 그 지점에 이르렀는지의 차이를 상당 부분 흡수한다. 반복 횟수별 gap 곡선도 대부분의 test 인스턴스에서 해 품질이 1,000회 이전에 평탄해짐을 보인다. SA acceptance와 reheating은 원 모델과 비교할 수 있도록 유지하였으나, ablation은 본 설정에서 이 둘이 해 품질에 필수적이지 않음을 보인다.</w:t>
+      </w:r>
+      <w:r>
+        <w:rPr>
+          <w:color w:val="000000"/>
+          <w:sz w:val="20"/>
+        </w:rPr>
+        <w:t xml:space="preserve"/>
+      </w:r>
+      <w:r>
+        <w:rPr>
+          <w:color w:val="000000"/>
+          <w:sz w:val="20"/>
+        </w:rPr>
+        <w:t xml:space="preserve"/>
+      </w:r>
+      <w:r>
+        <w:rPr>
+          <w:color w:val="000000"/>
+          <w:sz w:val="20"/>
+        </w:rPr>
+        <w:t xml:space="preserve"/>
+      </w:r>
+      <w:r>
+        <w:rPr>
+          <w:color w:val="000000"/>
+          <w:sz w:val="20"/>
+        </w:rPr>
+        <w:t xml:space="preserve"/>
+      </w:r>
+      <w:r>
+        <w:rPr>
+          <w:color w:val="000000"/>
+          <w:sz w:val="20"/>
+        </w:rPr>
+        <w:t xml:space="preserve"/>
+      </w:r>
+      <w:r>
+        <w:rPr>
+          <w:color w:val="000000"/>
+          <w:sz w:val="20"/>
+        </w:rPr>
+        <w:t xml:space="preserve"/>
+      </w:r>
+      <w:r>
+        <w:rPr>
+          <w:color w:val="000000"/>
+          <w:sz w:val="20"/>
+        </w:rPr>
+        <w:t xml:space="preserve"/>
+      </w:r>
+      <w:r>
+        <w:rPr>
+          <w:color w:val="000000"/>
+          <w:sz w:val="20"/>
+        </w:rPr>
+        <w:t xml:space="preserve"/>
+      </w:r>
+      <w:r>
+        <w:rPr>
+          <w:color w:val="000000"/>
+          <w:sz w:val="20"/>
+        </w:rPr>
+        <w:t xml:space="preserve"/>
+      </w:r>
+      <w:r>
+        <w:rPr>
+          <w:color w:val="000000"/>
+          <w:sz w:val="20"/>
+        </w:rPr>
+        <w:t xml:space="preserve"/>
+      </w:r>
+      <w:r>
+        <w:rPr>
+          <w:color w:val="000000"/>
+          <w:sz w:val="20"/>
+        </w:rPr>
+        <w:t xml:space="preserve"/>
+      </w:r>
+      <w:r>
+        <w:rPr>
+          <w:color w:val="000000"/>
+          <w:sz w:val="20"/>
+        </w:rPr>
+        <w:t xml:space="preserve"/>
       </w:r>
     </w:p>
     <w:p>
@@ -17979,91 +17979,79 @@
           <w:color w:val="000000"/>
           <w:sz w:val="20"/>
         </w:rPr>
-        <w:t xml:space="preserve">학습 정책이 예측할 대상도 마땅치 않다. selector가 이득을 내려면 현재 탐색 상태로부터</w:t>
-      </w:r>
-      <w:r>
-        <w:rPr>
-          <w:color w:val="000000"/>
-          <w:sz w:val="20"/>
-        </w:rPr>
-        <w:t xml:space="preserve"> </w:t>
-      </w:r>
-      <w:r>
-        <w:rPr>
-          <w:color w:val="000000"/>
-          <w:sz w:val="20"/>
-        </w:rPr>
-        <w:t xml:space="preserve">다음에 어떤 연산자가 유리한지를 예측할 수 있어야 하는데, 본 문제의 인스턴스는 정적이고</w:t>
-      </w:r>
-      <w:r>
-        <w:rPr>
-          <w:color w:val="000000"/>
-          <w:sz w:val="20"/>
-        </w:rPr>
-        <w:t xml:space="preserve"> </w:t>
-      </w:r>
-      <w:r>
-        <w:rPr>
-          <w:color w:val="000000"/>
-          <w:sz w:val="20"/>
-        </w:rPr>
-        <w:t xml:space="preserve">모든 release time이 최적화 이전에 알려져 있어 실행 도중 새로 드러나는 정보가 없다. 이는 도착 정보가 시간의 흐름에 따라 공개되는 online dock control이나 개별 이동의 평가 비용이</w:t>
-      </w:r>
-      <w:r>
-        <w:rPr>
-          <w:color w:val="000000"/>
-          <w:sz w:val="20"/>
-        </w:rPr>
-        <w:t xml:space="preserve"> </w:t>
-      </w:r>
-      <w:r>
-        <w:rPr>
-          <w:color w:val="000000"/>
-          <w:sz w:val="20"/>
-        </w:rPr>
-        <w:t xml:space="preserve">비싼 simulation 모형과 다르며, 그런 환경에서는 learned selection의 역할이 커질 수</w:t>
-      </w:r>
-      <w:r>
-        <w:rPr>
-          <w:color w:val="000000"/>
-          <w:sz w:val="20"/>
-        </w:rPr>
-        <w:t xml:space="preserve"> </w:t>
-      </w:r>
-      <w:r>
-        <w:rPr>
-          <w:color w:val="000000"/>
-          <w:sz w:val="20"/>
-        </w:rPr>
-        <w:t xml:space="preserve">있다. 본 결과가 뒷받침하는 바는 제한적이다. 즉, learned selector는 동일한 엔진과 동일한</w:t>
-      </w:r>
-      <w:r>
-        <w:rPr>
-          <w:color w:val="000000"/>
-          <w:sz w:val="20"/>
-        </w:rPr>
-        <w:t xml:space="preserve"> </w:t>
-      </w:r>
-      <w:r>
-        <w:rPr>
-          <w:color w:val="000000"/>
-          <w:sz w:val="20"/>
-        </w:rPr>
-        <w:t xml:space="preserve">예산에서 uniform sampling과 비교되어야 하며, 그 통제가 없으면 descent·restart·강한</w:t>
-      </w:r>
-      <w:r>
-        <w:rPr>
-          <w:color w:val="000000"/>
-          <w:sz w:val="20"/>
-        </w:rPr>
-        <w:t xml:space="preserve"> </w:t>
-      </w:r>
-      <w:r>
-        <w:rPr>
-          <w:color w:val="000000"/>
-          <w:sz w:val="20"/>
-        </w:rPr>
-        <w:t xml:space="preserve">이동 집합의 이득이 정책 자체의 것으로 잘못 귀속될 수 있다.</w:t>
+        <w:t xml:space="preserve">selector가 예측할 대상이 마땅치 않다는 점도 작용한다. 본 문제의 인스턴스는 정적이고 모든 release time이 최적화 이전에 알려져 있어, 실행 도중 새로 드러나 정책이 활용할 정보가 없다. 도착 정보가 시간에 따라 공개되는 동적 도크 운영이나 이동 하나의 평가가 비싼 시뮬레이션 기반 모형에서는 판단이 달라질 수 있다. 따라서 본 결과의 함의는 학습이 무용하다는 것이 아니라 비교 조건에 있다. learned selector는 동일한 엔진과 동일한 반복 횟수 아래 uniform sampling과 견주어야 하며, 그 통제가 없으면 descent·restart·강한 연산자 집합의 이득이 정책의 성과로 잘못 귀속될 수 있다.</w:t>
+      </w:r>
+      <w:r>
+        <w:rPr>
+          <w:color w:val="000000"/>
+          <w:sz w:val="20"/>
+        </w:rPr>
+      </w:r>
+      <w:r>
+        <w:rPr>
+          <w:color w:val="000000"/>
+          <w:sz w:val="20"/>
+        </w:rPr>
+      </w:r>
+      <w:r>
+        <w:rPr>
+          <w:color w:val="000000"/>
+          <w:sz w:val="20"/>
+        </w:rPr>
+      </w:r>
+      <w:r>
+        <w:rPr>
+          <w:color w:val="000000"/>
+          <w:sz w:val="20"/>
+        </w:rPr>
+      </w:r>
+      <w:r>
+        <w:rPr>
+          <w:color w:val="000000"/>
+          <w:sz w:val="20"/>
+        </w:rPr>
+      </w:r>
+      <w:r>
+        <w:rPr>
+          <w:color w:val="000000"/>
+          <w:sz w:val="20"/>
+        </w:rPr>
+      </w:r>
+      <w:r>
+        <w:rPr>
+          <w:color w:val="000000"/>
+          <w:sz w:val="20"/>
+        </w:rPr>
+      </w:r>
+      <w:r>
+        <w:rPr>
+          <w:color w:val="000000"/>
+          <w:sz w:val="20"/>
+        </w:rPr>
+      </w:r>
+      <w:r>
+        <w:rPr>
+          <w:color w:val="000000"/>
+          <w:sz w:val="20"/>
+        </w:rPr>
+      </w:r>
+      <w:r>
+        <w:rPr>
+          <w:color w:val="000000"/>
+          <w:sz w:val="20"/>
+        </w:rPr>
+      </w:r>
+      <w:r>
+        <w:rPr>
+          <w:color w:val="000000"/>
+          <w:sz w:val="20"/>
+        </w:rPr>
+      </w:r>
+      <w:r>
+        <w:rPr>
+          <w:color w:val="000000"/>
+          <w:sz w:val="20"/>
+        </w:rPr>
       </w:r>
     </w:p>
     <w:bookmarkEnd w:id="40"/>
@@ -18092,7 +18080,7 @@
           <w:color w:val="000000"/>
           <w:sz w:val="20"/>
         </w:rPr>
-        <w:t xml:space="preserve">본 연구는 부분 하역 컴파운드 트럭 스케줄링에 release time과 soft due date를</w:t>
+        <w:t xml:space="preserve">본 연구는 부분 하역 병행 트럭 스케줄링에 release time과 soft due date를</w:t>
       </w:r>
       <w:r>
         <w:rPr>
@@ -18603,7 +18591,7 @@
           <w:color w:val="000000"/>
           <w:sz w:val="18"/>
         </w:rPr>
-        <w:t xml:space="preserve">Figure 4. Mean gap to the best observed solution across iteration budgets.</w:t>
+        <w:t xml:space="preserve">Figure 4. Mean gap to the best observed solution versus the number of iterations.</w:t>
       </w:r>
     </w:p>
     <w:bookmarkEnd w:id="45"/>

</xml_diff>

<commit_message>
feat: 용례 확인 #2
</commit_message>
<xml_diff>
--- a/paper/jkiie_submit_body.docx
+++ b/paper/jkiie_submit_body.docx
@@ -5,7 +5,7 @@
     <w:p>
       <w:pPr>
         <w:pStyle w:val="AbstractTitle"/>
-        <w:spacing w:line="360" w:lineRule="auto"/>
+        <w:spacing w:line="300" w:lineRule="exact"/>
       </w:pPr>
       <w:r>
         <w:rPr>
@@ -18,7 +18,7 @@
     <w:p>
       <w:pPr>
         <w:pStyle w:val="Abstract"/>
-        <w:spacing w:line="360" w:lineRule="auto"/>
+        <w:spacing w:line="300" w:lineRule="exact"/>
       </w:pPr>
       <w:r>
         <w:rPr>
@@ -31,7 +31,7 @@
     <w:p>
       <w:pPr>
         <w:pStyle w:val="Abstract"/>
-        <w:spacing w:line="360" w:lineRule="auto"/>
+        <w:spacing w:line="300" w:lineRule="exact"/>
       </w:pPr>
       <w:r>
         <w:rPr>
@@ -60,7 +60,7 @@
     <w:p>
       <w:pPr>
         <w:pStyle w:val="FirstParagraph"/>
-        <w:spacing w:line="360" w:lineRule="auto"/>
+        <w:spacing w:line="300" w:lineRule="exact"/>
       </w:pPr>
       <w:r>
         <w:rPr>
@@ -104,7 +104,7 @@
     <w:p>
       <w:pPr>
         <w:pStyle w:val="Heading1"/>
-        <w:spacing w:line="360" w:lineRule="auto"/>
+        <w:spacing w:line="448" w:lineRule="exact"/>
       </w:pPr>
       <w:r>
         <w:rPr>
@@ -112,20 +112,20 @@
           <w:color w:val="000000"/>
           <w:sz w:val="28"/>
         </w:rPr>
-        <w:t xml:space="preserve">1. 서론</w:t>
+        <w:t xml:space="preserve">1. 서 론</w:t>
       </w:r>
     </w:p>
     <w:p>
       <w:pPr>
         <w:pStyle w:val="FirstParagraph"/>
-        <w:spacing w:line="360" w:lineRule="auto"/>
+        <w:spacing w:line="300" w:lineRule="exact"/>
       </w:pPr>
       <w:r>
         <w:rPr>
           <w:color w:val="000000"/>
           <w:sz w:val="20"/>
         </w:rPr>
-        <w:t xml:space="preserve">크로스도킹은 입고 화물을 창고에 보관하지 않고 곧바로 출고 트럭으로 환적하여</w:t>
+        <w:t xml:space="preserve">크로스도킹은 입고 화물을 창고에 보관하지 않고 곧바로 출고트럭으로 환적하여</w:t>
       </w:r>
       <w:r>
         <w:rPr>
@@ -239,13 +239,13 @@
           <w:color w:val="000000"/>
           <w:sz w:val="20"/>
         </w:rPr>
-        <w:t xml:space="preserve">makespan을 크게 줄이는 것으로 보고되어 LTL 통합 네트워크에서 실용적 매력이 크다.</w:t>
+        <w:t xml:space="preserve">총 작업완료시간을 크게 줄이는 것으로 보고되어 LTL 통합 네트워크에서 실용적 매력이 크다.</w:t>
       </w:r>
     </w:p>
     <w:p>
       <w:pPr>
         <w:pStyle w:val="BodyText"/>
-        <w:spacing w:line="360" w:lineRule="auto"/>
+        <w:spacing w:line="300" w:lineRule="exact"/>
         <w:ind w:firstLine="216"/>
       </w:pPr>
       <w:r>
@@ -281,7 +281,7 @@
           <w:color w:val="000000"/>
           <w:sz w:val="20"/>
         </w:rPr>
-        <w:t xml:space="preserve">목적함수가 순수 makespan이지만 출고 트럭의 출발은 위반 시 비용이 발생하는 due date에</w:t>
+        <w:t xml:space="preserve">목적식이 순수 총 작업완료시간이지만 출고트럭의 출발은 위반 시 비용이 발생하는 due date에</w:t>
       </w:r>
       <w:r>
         <w:rPr>
@@ -301,7 +301,7 @@
     <w:p>
       <w:pPr>
         <w:pStyle w:val="BodyText"/>
-        <w:spacing w:line="360" w:lineRule="auto"/>
+        <w:spacing w:line="300" w:lineRule="exact"/>
         <w:ind w:firstLine="216"/>
       </w:pPr>
       <w:r>
@@ -309,7 +309,7 @@
           <w:color w:val="000000"/>
           <w:sz w:val="20"/>
         </w:rPr>
-        <w:t xml:space="preserve">도착 시각(release time), 시간창(time window), 납기지연(tardiness)은 일반 크로스도킹 스케줄링에서 이미</w:t>
+        <w:t xml:space="preserve">도착 시각, 시간창(time window), 납기지연은 일반 크로스도킹 스케줄링에서 이미</w:t>
       </w:r>
       <w:r>
         <w:rPr>
@@ -351,7 +351,7 @@
           <w:color w:val="000000"/>
           <w:sz w:val="20"/>
         </w:rPr>
-        <w:t xml:space="preserve">순수 입고 트럭도 출고 트럭도 아니다. 부분 하역 후 한 목적지의 화물을 유지하고, 해당</w:t>
+        <w:t xml:space="preserve">순수 입고트럭도 출고트럭도 아니다. 부분 하역 후 한 목적지의 화물을 유지하고, 해당</w:t>
       </w:r>
       <w:r>
         <w:rPr>
@@ -509,7 +509,7 @@
           <w:color w:val="000000"/>
           <w:sz w:val="20"/>
         </w:rPr>
-        <w:t xml:space="preserve">을 만들고, 이 chain은 트럭들을 공유 목적지를 통해 결합한다. 따라서 release time을</w:t>
+        <w:t xml:space="preserve">을 만들고, 이 chain은 트럭들을 공유 목적지를 통해 결합한다. 따라서 도착 시각을</w:t>
       </w:r>
       <w:r>
         <w:rPr>
@@ -551,7 +551,7 @@
           <w:color w:val="000000"/>
           <w:sz w:val="20"/>
         </w:rPr>
-        <w:t xml:space="preserve">tardiness 비용으로 바꾼다. 본 연구의 기여는 이 상호작용 — 알려진 release time과</w:t>
+        <w:t xml:space="preserve">납기지연 비용으로 바꾼다. 본 연구의 기여는 이 상호작용 — 알려진 도착 시각과</w:t>
       </w:r>
       <w:r>
         <w:rPr>
@@ -585,7 +585,7 @@
     <w:p>
       <w:pPr>
         <w:pStyle w:val="BodyText"/>
-        <w:spacing w:line="360" w:lineRule="auto"/>
+        <w:spacing w:line="300" w:lineRule="exact"/>
         <w:ind w:firstLine="216"/>
       </w:pPr>
       <w:r>
@@ -607,7 +607,7 @@
           <w:color w:val="000000"/>
           <w:sz w:val="20"/>
         </w:rPr>
-        <w:t xml:space="preserve">release time과 soft due date를 갖는 문제로 확장하고, 이를 독립적인 스케줄 평가기와</w:t>
+        <w:t xml:space="preserve">도착 시각과 soft due date를 갖는 문제로 확장하고, 이를 독립적인 스케줄 평가기와</w:t>
       </w:r>
       <w:r>
         <w:rPr>
@@ -654,7 +654,7 @@
           <w:color w:val="000000"/>
           <w:sz w:val="20"/>
         </w:rPr>
-        <w:t xml:space="preserve">generic neighborhood에 full best-improvement descent, 병목 유도 연산자, kick</w:t>
+        <w:t xml:space="preserve">기본 이웃 구조에 full best-improvement descent, 병목 유도 연산자, kick</w:t>
       </w:r>
       <w:r>
         <w:rPr>
@@ -697,6 +697,118 @@
           <w:sz w:val="20"/>
         </w:rPr>
         <w:t xml:space="preserve">선택의 추가 효과는 동일한 반복 횟수의 균등 선택과 비교하는 보조적인 ablation으로 검토한다.</w:t>
+      </w:r>
+    </w:p>
+    <w:p>
+      <w:pPr>
+        <w:pStyle w:val="BodyText"/>
+        <w:spacing w:line="300" w:lineRule="exact"/>
+        <w:ind w:firstLine="216"/>
+      </w:pPr>
+      <w:r>
+        <w:rPr>
+          <w:color w:val="000000"/>
+          <w:sz w:val="20"/>
+        </w:rPr>
+        <w:t xml:space="preserve">본 논문의 구성은 다음과 같다. 제 2장에서 관련 연구를 정리하고, 제 3장에서 문제를 정의하며 혼합정수계획 모형과 CP-SAT 모형을 제시한다. 제 4장에서 제안 알고리즘인 VAA-GILS를 서술하고, 제 5장과 제 6장에서 실험 설계와 결과를 제시한다. 제 7장에서 결과를 논의하고 제 8장에서 결론을 맺는다.</w:t>
+      </w:r>
+      <w:r>
+        <w:rPr>
+          <w:color w:val="000000"/>
+          <w:sz w:val="20"/>
+        </w:rPr>
+        <w:t xml:space="preserve"/>
+      </w:r>
+      <w:r>
+        <w:rPr>
+          <w:color w:val="000000"/>
+          <w:sz w:val="20"/>
+        </w:rPr>
+        <w:t xml:space="preserve"/>
+      </w:r>
+      <w:r>
+        <w:rPr>
+          <w:color w:val="000000"/>
+          <w:sz w:val="20"/>
+        </w:rPr>
+        <w:t xml:space="preserve"/>
+      </w:r>
+      <w:r>
+        <w:rPr>
+          <w:color w:val="000000"/>
+          <w:sz w:val="20"/>
+        </w:rPr>
+        <w:t xml:space="preserve"/>
+      </w:r>
+      <w:r>
+        <w:rPr>
+          <w:color w:val="000000"/>
+          <w:sz w:val="20"/>
+        </w:rPr>
+        <w:t xml:space="preserve"/>
+      </w:r>
+      <w:r>
+        <w:rPr>
+          <w:color w:val="000000"/>
+          <w:sz w:val="20"/>
+        </w:rPr>
+        <w:t xml:space="preserve"/>
+      </w:r>
+      <w:r>
+        <w:rPr>
+          <w:color w:val="000000"/>
+          <w:sz w:val="20"/>
+        </w:rPr>
+        <w:t xml:space="preserve"/>
+      </w:r>
+      <w:r>
+        <w:rPr>
+          <w:color w:val="000000"/>
+          <w:sz w:val="20"/>
+        </w:rPr>
+        <w:t xml:space="preserve"/>
+      </w:r>
+      <w:r>
+        <w:rPr>
+          <w:color w:val="000000"/>
+          <w:sz w:val="20"/>
+        </w:rPr>
+        <w:t xml:space="preserve"/>
+      </w:r>
+      <w:r>
+        <w:rPr>
+          <w:color w:val="000000"/>
+          <w:sz w:val="20"/>
+        </w:rPr>
+        <w:t xml:space="preserve"/>
+      </w:r>
+      <w:r>
+        <w:rPr>
+          <w:color w:val="000000"/>
+          <w:sz w:val="20"/>
+        </w:rPr>
+        <w:t xml:space="preserve"/>
+      </w:r>
+      <w:r>
+        <w:rPr>
+          <w:color w:val="000000"/>
+          <w:sz w:val="20"/>
+        </w:rPr>
+        <w:t xml:space="preserve"/>
+      </w:r>
+      <w:r>
+        <w:rPr>
+          <w:color w:val="000000"/>
+          <w:sz w:val="20"/>
+        </w:rPr>
+        <w:t xml:space="preserve"/>
+      </w:r>
+      <w:r>
+        <w:rPr>
+          <w:color w:val="000000"/>
+          <w:sz w:val="20"/>
+        </w:rPr>
+        <w:t xml:space="preserve"/>
       </w:r>
     </w:p>
     <w:bookmarkEnd w:id="9"/>
@@ -704,7 +816,7 @@
     <w:p>
       <w:pPr>
         <w:pStyle w:val="Heading1"/>
-        <w:spacing w:line="360" w:lineRule="auto"/>
+        <w:spacing w:line="448" w:lineRule="exact"/>
       </w:pPr>
       <w:r>
         <w:rPr>
@@ -718,7 +830,7 @@
     <w:p>
       <w:pPr>
         <w:pStyle w:val="FirstParagraph"/>
-        <w:spacing w:line="360" w:lineRule="auto"/>
+        <w:spacing w:line="300" w:lineRule="exact"/>
       </w:pPr>
       <w:r>
         <w:rPr>
@@ -769,7 +881,7 @@
           <w:color w:val="000000"/>
           <w:sz w:val="20"/>
         </w:rPr>
-        <w:t xml:space="preserve">조망하였다. 여러 결정론적 모형이 기존 입고·출고 트럭에 대해 시간</w:t>
+        <w:t xml:space="preserve">조망하였다. 여러 결정론적 모형이 기존 입고·출고트럭에 대해 시간</w:t>
       </w:r>
       <w:r>
         <w:rPr>
@@ -797,21 +909,21 @@
           <w:color w:val="000000"/>
           <w:sz w:val="20"/>
         </w:rPr>
-        <w:t xml:space="preserve">tardiness를, Assadi와 Bagheri(2016)는 ready time과 outbound</w:t>
-      </w:r>
-      <w:r>
-        <w:rPr>
-          <w:color w:val="000000"/>
-          <w:sz w:val="20"/>
-        </w:rPr>
-        <w:t xml:space="preserve"> </w:t>
-      </w:r>
-      <w:r>
-        <w:rPr>
-          <w:color w:val="000000"/>
-          <w:sz w:val="20"/>
-        </w:rPr>
-        <w:t xml:space="preserve">earliness/tardiness를, Bodnar 등(2017)은 time window와 mixed-service</w:t>
+        <w:t xml:space="preserve">납기지연을, Assadi와 Bagheri(2016)는 ready time과 outbound</w:t>
+      </w:r>
+      <w:r>
+        <w:rPr>
+          <w:color w:val="000000"/>
+          <w:sz w:val="20"/>
+        </w:rPr>
+        <w:t xml:space="preserve"> </w:t>
+      </w:r>
+      <w:r>
+        <w:rPr>
+          <w:color w:val="000000"/>
+          <w:sz w:val="20"/>
+        </w:rPr>
+        <w:t xml:space="preserve">조기완료와 납기지연(earliness/납기지연)을, Bodnar 등(2017)은 time window와 mixed-service</w:t>
       </w:r>
       <w:r>
         <w:rPr>
@@ -853,7 +965,7 @@
           <w:color w:val="000000"/>
           <w:sz w:val="20"/>
         </w:rPr>
-        <w:t xml:space="preserve">release/due date가 새롭지 않음을 보이나, 입고·출고 트럭을 구분하며 부분</w:t>
+        <w:t xml:space="preserve">release/due date가 새롭지 않음을 보이나, 입고·출고트럭을 구분하며 부분</w:t>
       </w:r>
       <w:r>
         <w:rPr>
@@ -873,7 +985,7 @@
     <w:p>
       <w:pPr>
         <w:pStyle w:val="BodyText"/>
-        <w:spacing w:line="360" w:lineRule="auto"/>
+        <w:spacing w:line="300" w:lineRule="exact"/>
         <w:ind w:firstLine="216"/>
       </w:pPr>
       <w:r>
@@ -939,7 +1051,7 @@
           <w:color w:val="000000"/>
           <w:sz w:val="20"/>
         </w:rPr>
-        <w:t xml:space="preserve">full/partial/absent를 구분하고, Ladier와 Alpan(2016)은 time window</w:t>
+        <w:t xml:space="preserve">완전·부분·부재(full/partial/absent) 정보를 구분하고, Ladier와 Alpan(2016)은 time window</w:t>
       </w:r>
       <w:r>
         <w:rPr>
@@ -967,7 +1079,7 @@
           <w:color w:val="000000"/>
           <w:sz w:val="20"/>
         </w:rPr>
-        <w:t xml:space="preserve">optimization을 제시한다. 본 모형은 결정론적이며 각 release time은 스케줄 구성</w:t>
+        <w:t xml:space="preserve">optimization을 제시한다. 본 모형은 결정론적이며 각 도착 시각은 스케줄 구성</w:t>
       </w:r>
       <w:r>
         <w:rPr>
@@ -1001,7 +1113,7 @@
     <w:p>
       <w:pPr>
         <w:pStyle w:val="BodyText"/>
-        <w:spacing w:line="360" w:lineRule="auto"/>
+        <w:spacing w:line="300" w:lineRule="exact"/>
         <w:ind w:firstLine="216"/>
       </w:pPr>
       <w:r>
@@ -1125,7 +1237,7 @@
           <w:color w:val="000000"/>
           <w:sz w:val="20"/>
         </w:rPr>
-        <w:t xml:space="preserve">로 두고 tardiness와 makespan을 목적에 포함하므로,</w:t>
+        <w:t xml:space="preserve">로 두고 납기지연과 총 작업완료시간을 목적에 포함하므로,</w:t>
       </w:r>
       <w:r>
         <w:rPr>
@@ -1153,7 +1265,7 @@
           <w:color w:val="000000"/>
           <w:sz w:val="20"/>
         </w:rPr>
-        <w:t xml:space="preserve">적재 전용·하역 전용·혼합 모드 중 하나를 선택하고 트럭은 순수 입고·출고 트럭으로</w:t>
+        <w:t xml:space="preserve">적재 전용·하역 전용·혼합 모드 중 하나를 선택하고 트럭은 순수 입고·출고트럭으로</w:t>
       </w:r>
       <w:r>
         <w:rPr>
@@ -1209,21 +1321,21 @@
           <w:color w:val="000000"/>
           <w:sz w:val="20"/>
         </w:rPr>
-        <w:t xml:space="preserve">operator selection이 메타휴리스틱을 개선한다는 보고가 많으나, 본 연구는 강한 지역</w:t>
-      </w:r>
-      <w:r>
-        <w:rPr>
-          <w:color w:val="000000"/>
-          <w:sz w:val="20"/>
-        </w:rPr>
-        <w:t xml:space="preserve"> </w:t>
-      </w:r>
-      <w:r>
-        <w:rPr>
-          <w:color w:val="000000"/>
-          <w:sz w:val="20"/>
-        </w:rPr>
-        <w:t xml:space="preserve">탐색을 갖춘 뒤에는 learned selector의 이득이 작다는 통제된 반례를 더한다.</w:t>
+        <w:t xml:space="preserve">연산자 선택이 메타휴리스틱을 개선한다는 보고가 많으나, 본 연구는 강한 지역</w:t>
+      </w:r>
+      <w:r>
+        <w:rPr>
+          <w:color w:val="000000"/>
+          <w:sz w:val="20"/>
+        </w:rPr>
+        <w:t xml:space="preserve"> </w:t>
+      </w:r>
+      <w:r>
+        <w:rPr>
+          <w:color w:val="000000"/>
+          <w:sz w:val="20"/>
+        </w:rPr>
+        <w:t xml:space="preserve">탐색을 갖춘 뒤에는 학습 기반 선택 정책의 이득이 작다는 통제된 반례를 더한다.</w:t>
       </w:r>
     </w:p>
     <w:bookmarkEnd w:id="10"/>
@@ -1231,7 +1343,7 @@
     <w:p>
       <w:pPr>
         <w:pStyle w:val="Heading1"/>
-        <w:spacing w:line="360" w:lineRule="auto"/>
+        <w:spacing w:line="448" w:lineRule="exact"/>
       </w:pPr>
       <w:r>
         <w:rPr>
@@ -1246,7 +1358,7 @@
     <w:p>
       <w:pPr>
         <w:pStyle w:val="Heading2"/>
-        <w:spacing w:line="360" w:lineRule="auto"/>
+        <w:spacing w:line="384" w:lineRule="exact"/>
       </w:pPr>
       <w:r>
         <w:rPr>
@@ -1260,7 +1372,7 @@
     <w:p>
       <w:pPr>
         <w:pStyle w:val="FirstParagraph"/>
-        <w:spacing w:line="360" w:lineRule="auto"/>
+        <w:spacing w:line="300" w:lineRule="exact"/>
       </w:pPr>
       <m:oMath>
         <m:r>
@@ -1348,7 +1460,7 @@
           <w:color w:val="000000"/>
           <w:sz w:val="20"/>
         </w:rPr>
-        <w:t xml:space="preserve">을 각각 병행 트럭, 출고 트럭, 목적지, 상품 종류,</w:t>
+        <w:t xml:space="preserve">을 각각 병행 트럭, 출고트럭, 목적지, 상품 종류,</w:t>
       </w:r>
       <w:r>
         <w:rPr>
@@ -1948,7 +2060,7 @@
           <w:color w:val="000000"/>
           <w:sz w:val="20"/>
         </w:rPr>
-        <w:t xml:space="preserve">출고 트럭은 남은 목적지 하나와 도어를 고르며, 같은 도어의 출고 트럭은</w:t>
+        <w:t xml:space="preserve">출고트럭은 남은 목적지 하나와 도어를 고르며, 같은 도어의 출고트럭은</w:t>
       </w:r>
       <w:r>
         <w:rPr>
@@ -1968,7 +2080,7 @@
     <w:p>
       <w:pPr>
         <w:pStyle w:val="BodyText"/>
-        <w:spacing w:line="360" w:lineRule="auto"/>
+        <w:spacing w:line="300" w:lineRule="exact"/>
         <w:ind w:firstLine="216"/>
       </w:pPr>
       <w:r>
@@ -2013,7 +2125,7 @@
           <w:color w:val="000000"/>
           <w:sz w:val="20"/>
         </w:rPr>
-        <w:t xml:space="preserve">의 release time을</w:t>
+        <w:t xml:space="preserve">의 도착 시각을</w:t>
       </w:r>
       <w:r>
         <w:rPr>
@@ -2153,7 +2265,7 @@
           <w:color w:val="000000"/>
           <w:sz w:val="20"/>
         </w:rPr>
-        <w:t xml:space="preserve">출고 트럭</w:t>
+        <w:t xml:space="preserve">출고트럭</w:t>
       </w:r>
       <w:r>
         <w:rPr>
@@ -2264,7 +2376,7 @@
     <w:p>
       <w:pPr>
         <w:pStyle w:val="BodyText"/>
-        <w:spacing w:line="360" w:lineRule="auto"/>
+        <w:spacing w:line="300" w:lineRule="exact"/>
         <w:ind w:firstLine="216"/>
       </w:pPr>
       <w:r>
@@ -2824,7 +2936,7 @@
           <w:color w:val="000000"/>
           <w:sz w:val="20"/>
         </w:rPr>
-        <w:t xml:space="preserve">에 시작한다. makespan</w:t>
+        <w:t xml:space="preserve">에 시작한다. 총 작업완료시간</w:t>
       </w:r>
       <w:r>
         <w:rPr>
@@ -2872,7 +2984,7 @@
     <w:p>
       <w:pPr>
         <w:pStyle w:val="Heading2"/>
-        <w:spacing w:line="360" w:lineRule="auto"/>
+        <w:spacing w:line="384" w:lineRule="exact"/>
       </w:pPr>
       <w:r>
         <w:rPr>
@@ -2886,7 +2998,7 @@
     <w:p>
       <w:pPr>
         <w:pStyle w:val="FirstParagraph"/>
-        <w:spacing w:line="360" w:lineRule="auto"/>
+        <w:spacing w:line="300" w:lineRule="exact"/>
       </w:pPr>
       <w:r>
         <w:rPr>
@@ -3027,7 +3139,7 @@
           <w:color w:val="000000"/>
           <w:sz w:val="20"/>
         </w:rPr>
-        <w:t xml:space="preserve">은 출고 트럭</w:t>
+        <w:t xml:space="preserve">은 출고트럭</w:t>
       </w:r>
       <w:r>
         <w:rPr>
@@ -3488,7 +3600,7 @@
           <w:color w:val="000000"/>
           <w:sz w:val="20"/>
         </w:rPr>
-        <w:t xml:space="preserve"> 출고 도어 작업 시작, 출고 완료, makespan이다.</w:t>
+        <w:t xml:space="preserve"> 출고 도어 작업 시작, 출고 완료, 총 작업완료시간이다.</w:t>
       </w:r>
       <w:r>
         <w:rPr>
@@ -3663,7 +3775,7 @@
     <w:p>
       <w:pPr>
         <w:pStyle w:val="BodyText"/>
-        <w:spacing w:line="360" w:lineRule="auto"/>
+        <w:spacing w:line="300" w:lineRule="exact"/>
         <w:ind w:firstLine="216"/>
       </w:pPr>
       <w:r>
@@ -3677,7 +3789,7 @@
     <w:p>
       <w:pPr>
         <w:pStyle w:val="BodyText"/>
-        <w:spacing w:line="360" w:lineRule="auto"/>
+        <w:spacing w:line="300" w:lineRule="exact"/>
         <w:ind w:firstLine="216"/>
       </w:pPr>
       <m:oMathPara>
@@ -3777,7 +3889,7 @@
     <w:p>
       <w:pPr>
         <w:pStyle w:val="FirstParagraph"/>
-        <w:spacing w:line="360" w:lineRule="auto"/>
+        <w:spacing w:line="300" w:lineRule="exact"/>
       </w:pPr>
       <m:oMathPara>
         <m:oMathParaPr>
@@ -3876,7 +3988,7 @@
     <w:p>
       <w:pPr>
         <w:pStyle w:val="FirstParagraph"/>
-        <w:spacing w:line="360" w:lineRule="auto"/>
+        <w:spacing w:line="300" w:lineRule="exact"/>
       </w:pPr>
       <m:oMathPara>
         <m:oMathParaPr>
@@ -4028,7 +4140,7 @@
     <w:p>
       <w:pPr>
         <w:pStyle w:val="FirstParagraph"/>
-        <w:spacing w:line="360" w:lineRule="auto"/>
+        <w:spacing w:line="300" w:lineRule="exact"/>
       </w:pPr>
       <m:oMathPara>
         <m:oMathParaPr>
@@ -4127,7 +4239,7 @@
     <w:p>
       <w:pPr>
         <w:pStyle w:val="FirstParagraph"/>
-        <w:spacing w:line="360" w:lineRule="auto"/>
+        <w:spacing w:line="300" w:lineRule="exact"/>
       </w:pPr>
       <w:r>
         <w:rPr>
@@ -4140,7 +4252,7 @@
     <w:p>
       <w:pPr>
         <w:pStyle w:val="BodyText"/>
-        <w:spacing w:line="360" w:lineRule="auto"/>
+        <w:spacing w:line="300" w:lineRule="exact"/>
         <w:ind w:firstLine="216"/>
       </w:pPr>
       <m:oMathPara>
@@ -4321,7 +4433,7 @@
     <w:p>
       <w:pPr>
         <w:pStyle w:val="FirstParagraph"/>
-        <w:spacing w:line="360" w:lineRule="auto"/>
+        <w:spacing w:line="300" w:lineRule="exact"/>
       </w:pPr>
       <m:oMathPara>
         <m:oMathParaPr>
@@ -4502,7 +4614,7 @@
     <w:p>
       <w:pPr>
         <w:pStyle w:val="FirstParagraph"/>
-        <w:spacing w:line="360" w:lineRule="auto"/>
+        <w:spacing w:line="300" w:lineRule="exact"/>
       </w:pPr>
       <m:oMathPara>
         <m:oMathParaPr>
@@ -4695,7 +4807,7 @@
     <w:p>
       <w:pPr>
         <w:pStyle w:val="FirstParagraph"/>
-        <w:spacing w:line="360" w:lineRule="auto"/>
+        <w:spacing w:line="300" w:lineRule="exact"/>
       </w:pPr>
       <w:r>
         <w:rPr>
@@ -4845,7 +4957,7 @@
     <w:p>
       <w:pPr>
         <w:pStyle w:val="BodyText"/>
-        <w:spacing w:line="360" w:lineRule="auto"/>
+        <w:spacing w:line="300" w:lineRule="exact"/>
         <w:ind w:firstLine="216"/>
       </w:pPr>
       <w:r>
@@ -4859,7 +4971,7 @@
     <w:p>
       <w:pPr>
         <w:pStyle w:val="BodyText"/>
-        <w:spacing w:line="360" w:lineRule="auto"/>
+        <w:spacing w:line="300" w:lineRule="exact"/>
         <w:ind w:firstLine="216"/>
       </w:pPr>
       <m:oMathPara>
@@ -4933,7 +5045,7 @@
     <w:p>
       <w:pPr>
         <w:pStyle w:val="FirstParagraph"/>
-        <w:spacing w:line="360" w:lineRule="auto"/>
+        <w:spacing w:line="300" w:lineRule="exact"/>
       </w:pPr>
       <m:oMathPara>
         <m:oMathParaPr>
@@ -5120,7 +5232,7 @@
     <w:p>
       <w:pPr>
         <w:pStyle w:val="FirstParagraph"/>
-        <w:spacing w:line="360" w:lineRule="auto"/>
+        <w:spacing w:line="300" w:lineRule="exact"/>
       </w:pPr>
       <m:oMathPara>
         <m:oMathParaPr>
@@ -5271,7 +5383,7 @@
     <w:p>
       <w:pPr>
         <w:pStyle w:val="FirstParagraph"/>
-        <w:spacing w:line="360" w:lineRule="auto"/>
+        <w:spacing w:line="300" w:lineRule="exact"/>
       </w:pPr>
       <m:oMathPara>
         <m:oMathParaPr>
@@ -5428,7 +5540,7 @@
     <w:p>
       <w:pPr>
         <w:pStyle w:val="FirstParagraph"/>
-        <w:spacing w:line="360" w:lineRule="auto"/>
+        <w:spacing w:line="300" w:lineRule="exact"/>
       </w:pPr>
       <w:r>
         <w:rPr>
@@ -5454,7 +5566,7 @@
           <w:color w:val="000000"/>
           <w:sz w:val="20"/>
         </w:rPr>
-        <w:t xml:space="preserve">을 쓰는 출고 트럭 쌍</w:t>
+        <w:t xml:space="preserve">을 쓰는 출고트럭 쌍</w:t>
       </w:r>
       <w:r>
         <w:rPr>
@@ -5502,7 +5614,7 @@
     <w:p>
       <w:pPr>
         <w:pStyle w:val="BodyText"/>
-        <w:spacing w:line="360" w:lineRule="auto"/>
+        <w:spacing w:line="300" w:lineRule="exact"/>
         <w:ind w:firstLine="216"/>
       </w:pPr>
       <m:oMathPara>
@@ -5723,7 +5835,7 @@
     <w:p>
       <w:pPr>
         <w:pStyle w:val="FirstParagraph"/>
-        <w:spacing w:line="360" w:lineRule="auto"/>
+        <w:spacing w:line="300" w:lineRule="exact"/>
       </w:pPr>
       <m:oMathPara>
         <m:oMathParaPr>
@@ -5832,7 +5944,7 @@
     <w:p>
       <w:pPr>
         <w:pStyle w:val="FirstParagraph"/>
-        <w:spacing w:line="360" w:lineRule="auto"/>
+        <w:spacing w:line="300" w:lineRule="exact"/>
       </w:pPr>
       <m:oMathPara>
         <m:oMathParaPr>
@@ -5941,20 +6053,20 @@
     <w:p>
       <w:pPr>
         <w:pStyle w:val="FirstParagraph"/>
-        <w:spacing w:line="360" w:lineRule="auto"/>
+        <w:spacing w:line="300" w:lineRule="exact"/>
       </w:pPr>
       <w:r>
         <w:rPr>
           <w:color w:val="000000"/>
           <w:sz w:val="20"/>
         </w:rPr>
-        <w:t xml:space="preserve">끝으로 makespan은 다음으로 정의된다.</w:t>
+        <w:t xml:space="preserve">끝으로 총 작업완료시간은 다음으로 정의된다.</w:t>
       </w:r>
     </w:p>
     <w:p>
       <w:pPr>
         <w:pStyle w:val="BodyText"/>
-        <w:spacing w:line="360" w:lineRule="auto"/>
+        <w:spacing w:line="300" w:lineRule="exact"/>
         <w:ind w:firstLine="216"/>
       </w:pPr>
       <m:oMathPara>
@@ -6085,7 +6197,7 @@
     <w:p>
       <w:pPr>
         <w:pStyle w:val="FirstParagraph"/>
-        <w:spacing w:line="360" w:lineRule="auto"/>
+        <w:spacing w:line="300" w:lineRule="exact"/>
       </w:pPr>
       <w:r>
         <w:rPr>
@@ -6161,7 +6273,7 @@
     <w:p>
       <w:pPr>
         <w:pStyle w:val="Heading2"/>
-        <w:spacing w:line="360" w:lineRule="auto"/>
+        <w:spacing w:line="384" w:lineRule="exact"/>
       </w:pPr>
       <w:r>
         <w:rPr>
@@ -6169,13 +6281,13 @@
           <w:color w:val="000000"/>
           <w:sz w:val="24"/>
         </w:rPr>
-        <w:t xml:space="preserve">3.3 시간 제약 확장과 목적함수</w:t>
+        <w:t xml:space="preserve">3.3 시간 제약 확장과 목적식</w:t>
       </w:r>
     </w:p>
     <w:p>
       <w:pPr>
         <w:pStyle w:val="FirstParagraph"/>
-        <w:spacing w:line="360" w:lineRule="auto"/>
+        <w:spacing w:line="300" w:lineRule="exact"/>
       </w:pPr>
       <w:r>
         <w:rPr>
@@ -6219,7 +6331,7 @@
           <w:color w:val="000000"/>
           <w:sz w:val="20"/>
         </w:rPr>
-        <w:t xml:space="preserve">는 앞서 정의한 release time</w:t>
+        <w:t xml:space="preserve">는 앞서 정의한 도착 시각</w:t>
       </w:r>
       <w:r>
         <w:rPr>
@@ -6389,13 +6501,13 @@
           <w:color w:val="000000"/>
           <w:sz w:val="20"/>
         </w:rPr>
-        <w:t xml:space="preserve">이다. 목적함수는</w:t>
+        <w:t xml:space="preserve">이다. 목적식은</w:t>
       </w:r>
     </w:p>
     <w:p>
       <w:pPr>
         <w:pStyle w:val="BodyText"/>
-        <w:spacing w:line="360" w:lineRule="auto"/>
+        <w:spacing w:line="300" w:lineRule="exact"/>
         <w:ind w:firstLine="216"/>
       </w:pPr>
       <m:oMathPara>
@@ -6540,7 +6652,7 @@
     <w:p>
       <w:pPr>
         <w:pStyle w:val="FirstParagraph"/>
-        <w:spacing w:line="360" w:lineRule="auto"/>
+        <w:spacing w:line="300" w:lineRule="exact"/>
       </w:pPr>
       <m:oMath>
         <m:sSub>
@@ -6617,7 +6729,7 @@
           <w:color w:val="000000"/>
           <w:sz w:val="20"/>
         </w:rPr>
-        <w:t xml:space="preserve">이면 기존 makespan 모델로 환원된다. CP-SAT는 incumbent와</w:t>
+        <w:t xml:space="preserve">이면 기존 총 작업완료시간 모델로 환원된다. CP-SAT는 incumbent와</w:t>
       </w:r>
       <w:r>
         <w:rPr>
@@ -6639,7 +6751,7 @@
     <w:p>
       <w:pPr>
         <w:pStyle w:val="Heading2"/>
-        <w:spacing w:line="360" w:lineRule="auto"/>
+        <w:spacing w:line="384" w:lineRule="exact"/>
       </w:pPr>
       <w:r>
         <w:rPr>
@@ -6653,14 +6765,14 @@
     <w:p>
       <w:pPr>
         <w:pStyle w:val="FirstParagraph"/>
-        <w:spacing w:line="360" w:lineRule="auto"/>
+        <w:spacing w:line="300" w:lineRule="exact"/>
       </w:pPr>
       <w:r>
         <w:rPr>
           <w:color w:val="000000"/>
           <w:sz w:val="20"/>
         </w:rPr>
-        <w:t xml:space="preserve">CP-SAT가 제공하는 하한이 약한 실험 조건에서 gap을 보고하기 위해 도어 경합을 완화한 두 유효 하한을</w:t>
+        <w:t xml:space="preserve">CP-SAT가 제공하는 하한이 약한 실험 조건에서 격차를 보고하기 위해 도어 경합을 완화한 두 유효 하한을</w:t>
       </w:r>
       <w:r>
         <w:rPr>
@@ -6719,7 +6831,7 @@
           <w:color w:val="000000"/>
           <w:sz w:val="20"/>
         </w:rPr>
-        <w:t xml:space="preserve">유지)의 최속 완료와 출고 트럭</w:t>
+        <w:t xml:space="preserve">유지)의 최속 완료와 출고트럭</w:t>
       </w:r>
       <w:r>
         <w:rPr>
@@ -6758,7 +6870,7 @@
     <w:p>
       <w:pPr>
         <w:pStyle w:val="BodyText"/>
-        <w:spacing w:line="360" w:lineRule="auto"/>
+        <w:spacing w:line="300" w:lineRule="exact"/>
         <w:ind w:firstLine="216"/>
       </w:pPr>
       <m:oMathPara>
@@ -7009,7 +7121,7 @@
     <w:p>
       <w:pPr>
         <w:pStyle w:val="FirstParagraph"/>
-        <w:spacing w:line="360" w:lineRule="auto"/>
+        <w:spacing w:line="300" w:lineRule="exact"/>
       </w:pPr>
       <m:oMathPara>
         <m:oMathParaPr>
@@ -7189,7 +7301,7 @@
     <w:p>
       <w:pPr>
         <w:pStyle w:val="FirstParagraph"/>
-        <w:spacing w:line="360" w:lineRule="auto"/>
+        <w:spacing w:line="300" w:lineRule="exact"/>
       </w:pPr>
       <w:r>
         <w:rPr>
@@ -7310,7 +7422,7 @@
     <w:p>
       <w:pPr>
         <w:pStyle w:val="BodyText"/>
-        <w:spacing w:line="360" w:lineRule="auto"/>
+        <w:spacing w:line="300" w:lineRule="exact"/>
         <w:ind w:firstLine="216"/>
       </w:pPr>
       <m:oMathPara>
@@ -7546,7 +7658,7 @@
     <w:p>
       <w:pPr>
         <w:pStyle w:val="FirstParagraph"/>
-        <w:spacing w:line="360" w:lineRule="auto"/>
+        <w:spacing w:line="300" w:lineRule="exact"/>
       </w:pPr>
       <m:oMathPara>
         <m:oMathParaPr>
@@ -7696,7 +7808,7 @@
     <w:p>
       <w:pPr>
         <w:pStyle w:val="FirstParagraph"/>
-        <w:spacing w:line="360" w:lineRule="auto"/>
+        <w:spacing w:line="300" w:lineRule="exact"/>
       </w:pPr>
       <w:r>
         <w:rPr>
@@ -7709,7 +7821,7 @@
     <w:p>
       <w:pPr>
         <w:pStyle w:val="BodyText"/>
-        <w:spacing w:line="360" w:lineRule="auto"/>
+        <w:spacing w:line="300" w:lineRule="exact"/>
         <w:ind w:firstLine="216"/>
       </w:pPr>
       <m:oMathPara>
@@ -7878,7 +7990,7 @@
     <w:p>
       <w:pPr>
         <w:pStyle w:val="FirstParagraph"/>
-        <w:spacing w:line="360" w:lineRule="auto"/>
+        <w:spacing w:line="300" w:lineRule="exact"/>
       </w:pPr>
       <w:r>
         <w:rPr>
@@ -7994,7 +8106,7 @@
           <w:color w:val="000000"/>
           <w:sz w:val="20"/>
         </w:rPr>
-        <w:t xml:space="preserve">는 makespan의 유효 하한이다.</w:t>
+        <w:t xml:space="preserve">는 총 작업완료시간의 유효 하한이다.</w:t>
       </w:r>
       <w:r>
         <w:rPr>
@@ -8073,7 +8185,7 @@
     <w:p>
       <w:pPr>
         <w:pStyle w:val="BodyText"/>
-        <w:spacing w:line="360" w:lineRule="auto"/>
+        <w:spacing w:line="300" w:lineRule="exact"/>
         <w:ind w:firstLine="216"/>
       </w:pPr>
       <m:oMathPara>
@@ -8253,7 +8365,7 @@
     <w:p>
       <w:pPr>
         <w:pStyle w:val="FirstParagraph"/>
-        <w:spacing w:line="360" w:lineRule="auto"/>
+        <w:spacing w:line="300" w:lineRule="exact"/>
       </w:pPr>
       <w:r>
         <w:rPr>
@@ -8345,7 +8457,7 @@
     <w:p>
       <w:pPr>
         <w:pStyle w:val="Heading1"/>
-        <w:spacing w:line="360" w:lineRule="auto"/>
+        <w:spacing w:line="448" w:lineRule="exact"/>
       </w:pPr>
       <w:r>
         <w:rPr>
@@ -8353,13 +8465,13 @@
           <w:color w:val="000000"/>
           <w:sz w:val="28"/>
         </w:rPr>
-        <w:t xml:space="preserve">4. VAA-GILS</w:t>
+        <w:t xml:space="preserve">4. 휴리스틱 알고리즘</w:t>
       </w:r>
     </w:p>
     <w:p>
       <w:pPr>
         <w:pStyle w:val="FirstParagraph"/>
-        <w:spacing w:line="360" w:lineRule="auto"/>
+        <w:spacing w:line="300" w:lineRule="exact"/>
       </w:pPr>
       <w:r>
         <w:rPr>
@@ -8431,13 +8543,13 @@
           <w:color w:val="000000"/>
           <w:sz w:val="20"/>
         </w:rPr>
-        <w:t xml:space="preserve">generic 이웃 7종은 이 모델에서 가져왔다.</w:t>
+        <w:t xml:space="preserve">기본 이웃 7종은 이 모델에서 가져왔다.</w:t>
       </w:r>
     </w:p>
     <w:p>
       <w:pPr>
         <w:pStyle w:val="BodyText"/>
-        <w:spacing w:line="360" w:lineRule="auto"/>
+        <w:spacing w:line="300" w:lineRule="exact"/>
         <w:ind w:firstLine="216"/>
       </w:pPr>
       <w:r>
@@ -8461,7 +8573,7 @@
           <w:color w:val="000000"/>
           <w:sz w:val="20"/>
         </w:rPr>
-        <w:t xml:space="preserve">원 모델의 VAA는 Vogel식 regret으로 병행 트럭의 유지 목적지를 정하고, 완료 시각 우선순위에 따라 출고 목적지를 배정한다. 도어 배정은 먼저 처리되는 트럭을 도어 간 이송시간 합이 가장 작은 중앙 도어에 두고, 나머지 트럭은 작업 종료가 가장 이른 도어에 차례로 삽입한다. 모든 완료 예정 시각 계산에는 release time을 반영한다.</w:t>
+        <w:t xml:space="preserve">원 모델의 VAA는 Vogel식 regret으로 병행 트럭의 유지 목적지를 정하고, 완료 시각 우선순위에 따라 출고 목적지를 배정한다. 도어 배정은 먼저 처리되는 트럭을 도어 간 이송시간 합이 가장 작은 중앙 도어에 두고, 나머지 트럭은 작업 종료가 가장 이른 도어에 차례로 삽입한다. 모든 완료 예정 시각 계산에는 도착 시각을 반영한다.</w:t>
       </w:r>
       <w:r>
         <w:rPr>
@@ -8491,7 +8603,7 @@
     <w:p>
       <w:pPr>
         <w:pStyle w:val="BodyText"/>
-        <w:spacing w:line="360" w:lineRule="auto"/>
+        <w:spacing w:line="300" w:lineRule="exact"/>
         <w:ind w:firstLine="216"/>
       </w:pPr>
       <w:r>
@@ -8515,21 +8627,21 @@
           <w:color w:val="000000"/>
           <w:sz w:val="20"/>
         </w:rPr>
-        <w:t xml:space="preserve">세 가지 이동 유형(출고 트럭 재배치, 병행 트럭의 도어 교환/빈 도어 이동, 두</w:t>
-      </w:r>
-      <w:r>
-        <w:rPr>
-          <w:color w:val="000000"/>
-          <w:sz w:val="20"/>
-        </w:rPr>
-        <w:t xml:space="preserve"> </w:t>
-      </w:r>
-      <w:r>
-        <w:rPr>
-          <w:color w:val="000000"/>
-          <w:sz w:val="20"/>
-        </w:rPr>
-        <w:t xml:space="preserve">트럭의 목적지 교환)에 대한 best-improvement 지역탐색으로, local optimum에서</w:t>
+        <w:t xml:space="preserve">세 가지 이동 유형(출고트럭 재배치, 병행 트럭의 도어 교환/빈 도어 이동, 두</w:t>
+      </w:r>
+      <w:r>
+        <w:rPr>
+          <w:color w:val="000000"/>
+          <w:sz w:val="20"/>
+        </w:rPr>
+        <w:t xml:space="preserve"> </w:t>
+      </w:r>
+      <w:r>
+        <w:rPr>
+          <w:color w:val="000000"/>
+          <w:sz w:val="20"/>
+        </w:rPr>
+        <w:t xml:space="preserve">트럭의 목적지 교환)에 대한 best-improvement 지역탐색으로, 지역 최적해(Local Optimum)에서</w:t>
       </w:r>
       <w:r>
         <w:rPr>
@@ -8549,7 +8661,7 @@
     <w:p>
       <w:pPr>
         <w:pStyle w:val="BodyText"/>
-        <w:spacing w:line="360" w:lineRule="auto"/>
+        <w:spacing w:line="300" w:lineRule="exact"/>
         <w:ind w:firstLine="216"/>
       </w:pPr>
       <w:r>
@@ -8763,7 +8875,7 @@
     <w:p>
       <w:pPr>
         <w:pStyle w:val="BodyText"/>
-        <w:spacing w:line="360" w:lineRule="auto"/>
+        <w:spacing w:line="300" w:lineRule="exact"/>
         <w:ind w:firstLine="216"/>
       </w:pPr>
       <w:r>
@@ -8855,7 +8967,7 @@
           <w:color w:val="000000"/>
           <w:sz w:val="20"/>
         </w:rPr>
-        <w:t xml:space="preserve">의 복사본에서 다시 시작하되, 아래 generic 이웃 7종에서</w:t>
+        <w:t xml:space="preserve">의 복사본에서 다시 시작하되, 아래 기본 이웃 7종에서</w:t>
       </w:r>
       <w:r>
         <w:rPr>
@@ -8977,7 +9089,7 @@
     <w:p>
       <w:pPr>
         <w:pStyle w:val="BodyText"/>
-        <w:spacing w:line="360" w:lineRule="auto"/>
+        <w:spacing w:line="300" w:lineRule="exact"/>
         <w:ind w:firstLine="216"/>
       </w:pPr>
       <w:r>
@@ -9001,35 +9113,35 @@
           <w:color w:val="000000"/>
           <w:sz w:val="20"/>
         </w:rPr>
-        <w:t xml:space="preserve">generic 이웃 7종은 원 모델의 이웃 구조를 그대로 사용한다:</w:t>
-      </w:r>
-      <w:r>
-        <w:rPr>
-          <w:color w:val="000000"/>
-          <w:sz w:val="20"/>
-        </w:rPr>
-        <w:t xml:space="preserve"> </w:t>
-      </w:r>
-      <w:r>
-        <w:rPr>
-          <w:color w:val="000000"/>
-          <w:sz w:val="20"/>
-        </w:rPr>
-        <w:t xml:space="preserve">(k1) 두 트럭의 목적지 교환, (k2) 병행 트럭 간 도어 교환, (k3) 출고 트럭 간 도어</w:t>
-      </w:r>
-      <w:r>
-        <w:rPr>
-          <w:color w:val="000000"/>
-          <w:sz w:val="20"/>
-        </w:rPr>
-        <w:t xml:space="preserve"> </w:t>
-      </w:r>
-      <w:r>
-        <w:rPr>
-          <w:color w:val="000000"/>
-          <w:sz w:val="20"/>
-        </w:rPr>
-        <w:t xml:space="preserve">교환, (k4) 출고 트럭을 다른 도어로 삽입, (k6) 하역시간 기반 룰렛 선택으로 병행 트럭</w:t>
+        <w:t xml:space="preserve">기본 이웃 7종은 원 모델의 이웃 구조를 그대로 사용한다:</w:t>
+      </w:r>
+      <w:r>
+        <w:rPr>
+          <w:color w:val="000000"/>
+          <w:sz w:val="20"/>
+        </w:rPr>
+        <w:t xml:space="preserve"> </w:t>
+      </w:r>
+      <w:r>
+        <w:rPr>
+          <w:color w:val="000000"/>
+          <w:sz w:val="20"/>
+        </w:rPr>
+        <w:t xml:space="preserve">(k1) 두 트럭의 목적지 교환, (k2) 병행 트럭 간 도어 교환, (k3) 출고트럭 간 도어</w:t>
+      </w:r>
+      <w:r>
+        <w:rPr>
+          <w:color w:val="000000"/>
+          <w:sz w:val="20"/>
+        </w:rPr>
+        <w:t xml:space="preserve"> </w:t>
+      </w:r>
+      <w:r>
+        <w:rPr>
+          <w:color w:val="000000"/>
+          <w:sz w:val="20"/>
+        </w:rPr>
+        <w:t xml:space="preserve">교환, (k4) 출고트럭을 다른 도어로 삽입, (k6) 하역시간 기반 룰렛 선택으로 병행 트럭</w:t>
       </w:r>
       <w:r>
         <w:rPr>
@@ -9043,7 +9155,7 @@
           <w:color w:val="000000"/>
           <w:sz w:val="20"/>
         </w:rPr>
-        <w:t xml:space="preserve">을 도어에 삽입, (k7) 적재시간 기반 룰렛 선택으로 출고 트럭을 도어에 삽입,</w:t>
+        <w:t xml:space="preserve">을 도어에 삽입, (k7) 적재시간 기반 룰렛 선택으로 출고트럭을 도어에 삽입,</w:t>
       </w:r>
       <w:r>
         <w:rPr>
@@ -9099,7 +9211,7 @@
           <w:color w:val="000000"/>
           <w:sz w:val="20"/>
         </w:rPr>
-        <w:t xml:space="preserve">출고 트럭을 최선 도어·위치로 재배치, (g2) critical 트럭의 목적지를 전 트럭과</w:t>
+        <w:t xml:space="preserve">출고트럭을 최선 도어·위치로 재배치, (g2) critical 트럭의 목적지를 전 트럭과</w:t>
       </w:r>
       <w:r>
         <w:rPr>
@@ -9166,7 +9278,7 @@
     <w:p>
       <w:pPr>
         <w:pStyle w:val="BodyText"/>
-        <w:spacing w:line="360" w:lineRule="auto"/>
+        <w:spacing w:line="300" w:lineRule="exact"/>
         <w:ind w:firstLine="216"/>
       </w:pPr>
       <w:r>
@@ -9246,7 +9358,7 @@
           <w:color w:val="000000"/>
           <w:sz w:val="20"/>
         </w:rPr>
-        <w:t xml:space="preserve">)은 ablation 목적으로만 평가하며 제안 방법의 일부가 아니다. tabular Q는 원 모델과 같이 무개선 구간 5-상태에서 ε-greedy 탐험과 룰렛 활용을 쓰되, 보상은 원 모델의 이진 보상(후보가 현재 해보다 나쁘지 않으면 1, 아니면 0) 대신 신규 incumbent 2·비악화 1·그 외 0의 셰이핑 보상을 사용한다. 이는 학습 신호를 강화할 뿐이므로 비교 대상 selector를 불리하게 만들지 않는다. 원 모델 SA-RL5는 RL이 단일 이동을 고르고 SA accept/reject로 한 단계가 끝나는</w:t>
+        <w:t xml:space="preserve">)은 ablation 목적으로만 평가하며 제안 방법의 일부가 아니다. tabular Q는 원 모델과 같이 무개선 구간 5-상태에서 ε-greedy 탐험과 룰렛 활용을 쓰되, 보상은 원 모델의 이진 보상(후보가 현재 해보다 나쁘지 않으면 1, 아니면 0) 대신 신규 incumbent 2·비악화 1·그 외 0의 셰이핑 보상을 사용한다. 이는 학습 신호를 강화할 뿐이므로 비교 대상 선택 정책을 불리하게 만들지 않는다. 원 모델 SA-RL5는 RL이 단일 이동을 고르고 SA accept/reject로 한 단계가 끝나는</w:t>
       </w:r>
       <w:r>
         <w:rPr>
@@ -9318,14 +9430,14 @@
           <w:color w:val="000000"/>
           <w:sz w:val="20"/>
         </w:rPr>
-        <w:t xml:space="preserve">이것이 품질 이득의 대부분을 설명함을 보인다. Table </w:t>
+        <w:t xml:space="preserve">이것이 품질 이득의 대부분을 설명함을 보인다. 두 방법의 구조적 차이는 &lt;Table 1&gt;에 정리하였다.</w:t>
       </w:r>
       <w:hyperlink w:anchor="tab:base">
         <w:r>
           <w:rPr>
             <w:rStyle w:val="Hyperlink"/>
           </w:rPr>
-          <w:t xml:space="preserve">1</w:t>
+          <w:t xml:space="preserve"/>
         </w:r>
       </w:hyperlink>
       <w:r>
@@ -9333,21 +9445,21 @@
           <w:color w:val="000000"/>
           <w:sz w:val="20"/>
         </w:rPr>
-        <w:t xml:space="preserve">가 두 방법의 구조적</w:t>
-      </w:r>
-      <w:r>
-        <w:rPr>
-          <w:color w:val="000000"/>
-          <w:sz w:val="20"/>
-        </w:rPr>
-        <w:t xml:space="preserve"> </w:t>
-      </w:r>
-      <w:r>
-        <w:rPr>
-          <w:color w:val="000000"/>
-          <w:sz w:val="20"/>
-        </w:rPr>
-        <w:t xml:space="preserve">차이를 요약한다.</w:t>
+        <w:t xml:space="preserve"/>
+      </w:r>
+      <w:r>
+        <w:rPr>
+          <w:color w:val="000000"/>
+          <w:sz w:val="20"/>
+        </w:rPr>
+        <w:t xml:space="preserve"/>
+      </w:r>
+      <w:r>
+        <w:rPr>
+          <w:color w:val="000000"/>
+          <w:sz w:val="20"/>
+        </w:rPr>
+        <w:t xml:space="preserve"/>
       </w:r>
     </w:p>
     <w:bookmarkStart w:id="16" w:name="tab:base"/>
@@ -9936,7 +10048,7 @@
     <w:p>
       <w:pPr>
         <w:pStyle w:val="Heading1"/>
-        <w:spacing w:line="360" w:lineRule="auto"/>
+        <w:spacing w:line="448" w:lineRule="exact"/>
       </w:pPr>
       <w:r>
         <w:rPr>
@@ -9945,19 +10057,234 @@
           <w:sz w:val="28"/>
         </w:rPr>
         <w:t xml:space="preserve">5. 실험 설계</w:t>
+      </w:r>
+    </w:p>
+    <w:p>
+      <w:pPr>
+        <w:pStyle w:val="Heading2"/>
+        <w:spacing w:line="384" w:lineRule="exact"/>
+      </w:pPr>
+      <w:r>
+        <w:rPr>
+          <w:b/>
+          <w:color w:val="000000"/>
+          <w:sz w:val="24"/>
+        </w:rPr>
+        <w:t xml:space="preserve">5.1 인스턴스 생성</w:t>
       </w:r>
     </w:p>
     <w:p>
       <w:pPr>
         <w:pStyle w:val="FirstParagraph"/>
-        <w:spacing w:line="360" w:lineRule="auto"/>
+        <w:spacing w:line="300" w:lineRule="exact"/>
       </w:pPr>
       <w:r>
         <w:rPr>
           <w:color w:val="000000"/>
           <w:sz w:val="20"/>
         </w:rPr>
-        <w:t xml:space="preserve">세 규모</w:t>
+        <w:t xml:space="preserve">병행 트럭</w:t>
+      </w:r>
+      <w:r>
+        <w:rPr>
+          <w:color w:val="000000"/>
+          <w:sz w:val="20"/>
+        </w:rPr>
+        <w:t xml:space="preserve"> </w:t>
+      </w:r>
+      <m:oMath>
+        <m:r>
+          <m:rPr>
+            <m:sty m:val="p"/>
+          </m:rPr>
+          <m:t>|</m:t>
+        </m:r>
+        <m:r>
+          <m:t>I</m:t>
+        </m:r>
+        <m:r>
+          <m:rPr>
+            <m:sty m:val="p"/>
+          </m:rPr>
+          <m:t>|</m:t>
+        </m:r>
+      </m:oMath>
+      <w:r>
+        <w:rPr>
+          <w:color w:val="000000"/>
+          <w:sz w:val="20"/>
+        </w:rPr>
+        <w:t xml:space="preserve">, 출고트럭</w:t>
+      </w:r>
+      <w:r>
+        <w:rPr>
+          <w:color w:val="000000"/>
+          <w:sz w:val="20"/>
+        </w:rPr>
+        <w:t xml:space="preserve"> </w:t>
+      </w:r>
+      <m:oMath>
+        <m:r>
+          <m:rPr>
+            <m:sty m:val="p"/>
+          </m:rPr>
+          <m:t>|</m:t>
+        </m:r>
+        <m:r>
+          <m:t>F</m:t>
+        </m:r>
+        <m:r>
+          <m:rPr>
+            <m:sty m:val="p"/>
+          </m:rPr>
+          <m:t>|</m:t>
+        </m:r>
+      </m:oMath>
+      <w:r>
+        <w:rPr>
+          <w:color w:val="000000"/>
+          <w:sz w:val="20"/>
+        </w:rPr>
+        <w:t xml:space="preserve">, 목적지</w:t>
+      </w:r>
+      <w:r>
+        <w:rPr>
+          <w:color w:val="000000"/>
+          <w:sz w:val="20"/>
+        </w:rPr>
+        <w:t xml:space="preserve"> </w:t>
+      </w:r>
+      <m:oMath>
+        <m:r>
+          <m:rPr>
+            <m:sty m:val="p"/>
+          </m:rPr>
+          <m:t>|</m:t>
+        </m:r>
+        <m:r>
+          <m:t>D</m:t>
+        </m:r>
+        <m:r>
+          <m:rPr>
+            <m:sty m:val="p"/>
+          </m:rPr>
+          <m:t>|</m:t>
+        </m:r>
+        <m:r>
+          <m:rPr>
+            <m:sty m:val="p"/>
+          </m:rPr>
+          <m:t>=</m:t>
+        </m:r>
+        <m:r>
+          <m:rPr>
+            <m:sty m:val="p"/>
+          </m:rPr>
+          <m:t>|</m:t>
+        </m:r>
+        <m:r>
+          <m:t>I</m:t>
+        </m:r>
+        <m:r>
+          <m:rPr>
+            <m:sty m:val="p"/>
+          </m:rPr>
+          <m:t>|</m:t>
+        </m:r>
+        <m:r>
+          <m:rPr>
+            <m:sty m:val="p"/>
+          </m:rPr>
+          <m:t>+</m:t>
+        </m:r>
+        <m:r>
+          <m:rPr>
+            <m:sty m:val="p"/>
+          </m:rPr>
+          <m:t>|</m:t>
+        </m:r>
+        <m:r>
+          <m:t>F</m:t>
+        </m:r>
+        <m:r>
+          <m:rPr>
+            <m:sty m:val="p"/>
+          </m:rPr>
+          <m:t>|</m:t>
+        </m:r>
+      </m:oMath>
+      <w:r>
+        <w:rPr>
+          <w:color w:val="000000"/>
+          <w:sz w:val="20"/>
+        </w:rPr>
+        <w:t xml:space="preserve">, 도어</w:t>
+      </w:r>
+      <w:r>
+        <w:rPr>
+          <w:color w:val="000000"/>
+          <w:sz w:val="20"/>
+        </w:rPr>
+        <w:t xml:space="preserve"> </w:t>
+      </w:r>
+      <m:oMath>
+        <m:r>
+          <m:rPr>
+            <m:sty m:val="p"/>
+          </m:rPr>
+          <m:t>|</m:t>
+        </m:r>
+        <m:r>
+          <m:t>M</m:t>
+        </m:r>
+        <m:r>
+          <m:rPr>
+            <m:sty m:val="p"/>
+          </m:rPr>
+          <m:t>|</m:t>
+        </m:r>
+        <m:r>
+          <m:rPr>
+            <m:sty m:val="p"/>
+          </m:rPr>
+          <m:t>=</m:t>
+        </m:r>
+        <m:r>
+          <m:rPr>
+            <m:sty m:val="p"/>
+          </m:rPr>
+          <m:t>|</m:t>
+        </m:r>
+        <m:r>
+          <m:t>I</m:t>
+        </m:r>
+        <m:r>
+          <m:rPr>
+            <m:sty m:val="p"/>
+          </m:rPr>
+          <m:t>|</m:t>
+        </m:r>
+      </m:oMath>
+      <w:r>
+        <w:rPr>
+          <w:color w:val="000000"/>
+          <w:sz w:val="20"/>
+        </w:rPr>
+        <w:t xml:space="preserve">로 두고 세 규모를</w:t>
+      </w:r>
+      <w:r>
+        <w:rPr>
+          <w:color w:val="000000"/>
+          <w:sz w:val="20"/>
+        </w:rPr>
+        <w:t xml:space="preserve"> </w:t>
+      </w:r>
+      <w:r>
+        <w:rPr>
+          <w:color w:val="000000"/>
+          <w:sz w:val="20"/>
+        </w:rPr>
+        <w:t xml:space="preserve">사용한다: S</w:t>
       </w:r>
       <w:r>
         <w:rPr>
@@ -10001,7 +10328,7 @@
           <m:t>|</m:t>
         </m:r>
         <m:r>
-          <m:t>D</m:t>
+          <m:t>F</m:t>
         </m:r>
         <m:r>
           <m:rPr>
@@ -10013,7 +10340,139 @@
           <m:rPr>
             <m:sty m:val="p"/>
           </m:rPr>
+          <m:t>)</m:t>
+        </m:r>
+        <m:r>
+          <m:rPr>
+            <m:sty m:val="p"/>
+          </m:rPr>
+          <m:t>=</m:t>
+        </m:r>
+        <m:r>
+          <m:rPr>
+            <m:sty m:val="p"/>
+          </m:rPr>
+          <m:t>(</m:t>
+        </m:r>
+        <m:r>
+          <m:t>6</m:t>
+        </m:r>
+        <m:r>
+          <m:rPr>
+            <m:sty m:val="p"/>
+          </m:rPr>
           <m:t>,</m:t>
+        </m:r>
+        <m:r>
+          <m:t>3</m:t>
+        </m:r>
+        <m:r>
+          <m:rPr>
+            <m:sty m:val="p"/>
+          </m:rPr>
+          <m:t>)</m:t>
+        </m:r>
+      </m:oMath>
+      <w:r>
+        <w:rPr>
+          <w:color w:val="000000"/>
+          <w:sz w:val="20"/>
+        </w:rPr>
+        <w:t xml:space="preserve">, M</w:t>
+      </w:r>
+      <w:r>
+        <w:rPr>
+          <w:color w:val="000000"/>
+          <w:sz w:val="20"/>
+        </w:rPr>
+        <w:t xml:space="preserve"> </w:t>
+      </w:r>
+      <m:oMath>
+        <m:r>
+          <m:rPr>
+            <m:sty m:val="p"/>
+          </m:rPr>
+          <m:t>(</m:t>
+        </m:r>
+        <m:r>
+          <m:t>12</m:t>
+        </m:r>
+        <m:r>
+          <m:rPr>
+            <m:sty m:val="p"/>
+          </m:rPr>
+          <m:t>,</m:t>
+        </m:r>
+        <m:r>
+          <m:t>6</m:t>
+        </m:r>
+        <m:r>
+          <m:rPr>
+            <m:sty m:val="p"/>
+          </m:rPr>
+          <m:t>)</m:t>
+        </m:r>
+      </m:oMath>
+      <w:r>
+        <w:rPr>
+          <w:color w:val="000000"/>
+          <w:sz w:val="20"/>
+        </w:rPr>
+        <w:t xml:space="preserve">, L</w:t>
+      </w:r>
+      <w:r>
+        <w:rPr>
+          <w:color w:val="000000"/>
+          <w:sz w:val="20"/>
+        </w:rPr>
+        <w:t xml:space="preserve"> </w:t>
+      </w:r>
+      <m:oMath>
+        <m:r>
+          <m:rPr>
+            <m:sty m:val="p"/>
+          </m:rPr>
+          <m:t>(</m:t>
+        </m:r>
+        <m:r>
+          <m:t>20</m:t>
+        </m:r>
+        <m:r>
+          <m:rPr>
+            <m:sty m:val="p"/>
+          </m:rPr>
+          <m:t>,</m:t>
+        </m:r>
+        <m:r>
+          <m:t>10</m:t>
+        </m:r>
+        <m:r>
+          <m:rPr>
+            <m:sty m:val="p"/>
+          </m:rPr>
+          <m:t>)</m:t>
+        </m:r>
+      </m:oMath>
+      <w:r>
+        <w:rPr>
+          <w:color w:val="000000"/>
+          <w:sz w:val="20"/>
+        </w:rPr>
+        <w:t xml:space="preserve">. 따라서</w:t>
+      </w:r>
+      <w:r>
+        <w:rPr>
+          <w:color w:val="000000"/>
+          <w:sz w:val="20"/>
+        </w:rPr>
+        <w:t xml:space="preserve"> </w:t>
+      </w:r>
+      <m:oMath>
+        <m:r>
+          <m:rPr>
+            <m:sty m:val="p"/>
+          </m:rPr>
+          <m:t>(</m:t>
         </m:r>
         <m:r>
           <m:rPr>
@@ -10022,7 +10481,7 @@
           <m:t>|</m:t>
         </m:r>
         <m:r>
-          <m:t>M</m:t>
+          <m:t>I</m:t>
         </m:r>
         <m:r>
           <m:rPr>
@@ -10034,6 +10493,48 @@
           <m:rPr>
             <m:sty m:val="p"/>
           </m:rPr>
+          <m:t>,</m:t>
+        </m:r>
+        <m:r>
+          <m:rPr>
+            <m:sty m:val="p"/>
+          </m:rPr>
+          <m:t>|</m:t>
+        </m:r>
+        <m:r>
+          <m:t>D</m:t>
+        </m:r>
+        <m:r>
+          <m:rPr>
+            <m:sty m:val="p"/>
+          </m:rPr>
+          <m:t>|</m:t>
+        </m:r>
+        <m:r>
+          <m:rPr>
+            <m:sty m:val="p"/>
+          </m:rPr>
+          <m:t>,</m:t>
+        </m:r>
+        <m:r>
+          <m:rPr>
+            <m:sty m:val="p"/>
+          </m:rPr>
+          <m:t>|</m:t>
+        </m:r>
+        <m:r>
+          <m:t>M</m:t>
+        </m:r>
+        <m:r>
+          <m:rPr>
+            <m:sty m:val="p"/>
+          </m:rPr>
+          <m:t>|</m:t>
+        </m:r>
+        <m:r>
+          <m:rPr>
+            <m:sty m:val="p"/>
+          </m:rPr>
           <m:t>)</m:t>
         </m:r>
       </m:oMath>
@@ -10042,7 +10543,7 @@
           <w:color w:val="000000"/>
           <w:sz w:val="20"/>
         </w:rPr>
-        <w:t xml:space="preserve">: S</w:t>
+        <w:t xml:space="preserve">는 각각</w:t>
       </w:r>
       <w:r>
         <w:rPr>
@@ -10091,7 +10592,7 @@
           <w:color w:val="000000"/>
           <w:sz w:val="20"/>
         </w:rPr>
-        <w:t xml:space="preserve">, M</w:t>
+        <w:t xml:space="preserve">,</w:t>
       </w:r>
       <w:r>
         <w:rPr>
@@ -10140,7 +10641,7 @@
           <w:color w:val="000000"/>
           <w:sz w:val="20"/>
         </w:rPr>
-        <w:t xml:space="preserve">, L</w:t>
+        <w:t xml:space="preserve">,</w:t>
       </w:r>
       <w:r>
         <w:rPr>
@@ -10189,21 +10690,7 @@
           <w:color w:val="000000"/>
           <w:sz w:val="20"/>
         </w:rPr>
-        <w:t xml:space="preserve">, 병행 트럭 비율</w:t>
-      </w:r>
-      <w:r>
-        <w:rPr>
-          <w:color w:val="000000"/>
-          <w:sz w:val="20"/>
-        </w:rPr>
-        <w:t xml:space="preserve"/>
-      </w:r>
-      <w:r>
-        <w:rPr>
-          <w:color w:val="000000"/>
-          <w:sz w:val="20"/>
-        </w:rPr>
-        <w:t xml:space="preserve"/>
+        <w:t xml:space="preserve">이고 병행 트럭 비율</w:t>
       </w:r>
       <w:r>
         <w:rPr>
@@ -10214,7 +10701,19 @@
       </w:r>
       <m:oMath>
         <m:r>
-          <m:t>2</m:t>
+          <m:rPr>
+            <m:sty m:val="p"/>
+          </m:rPr>
+          <m:t>|</m:t>
+        </m:r>
+        <m:r>
+          <m:t>I</m:t>
+        </m:r>
+        <m:r>
+          <m:rPr>
+            <m:sty m:val="p"/>
+          </m:rPr>
+          <m:t>|</m:t>
         </m:r>
         <m:r>
           <m:rPr>
@@ -10223,6 +10722,46 @@
           <m:t>/</m:t>
         </m:r>
         <m:r>
+          <m:rPr>
+            <m:sty m:val="p"/>
+          </m:rPr>
+          <m:t>|</m:t>
+        </m:r>
+        <m:r>
+          <m:t>D</m:t>
+        </m:r>
+        <m:r>
+          <m:rPr>
+            <m:sty m:val="p"/>
+          </m:rPr>
+          <m:t>|</m:t>
+        </m:r>
+      </m:oMath>
+      <w:r>
+        <w:rPr>
+          <w:color w:val="000000"/>
+          <w:sz w:val="20"/>
+        </w:rPr>
+        <w:t xml:space="preserve">는 모두</w:t>
+      </w:r>
+      <w:r>
+        <w:rPr>
+          <w:color w:val="000000"/>
+          <w:sz w:val="20"/>
+        </w:rPr>
+        <w:t xml:space="preserve"> </w:t>
+      </w:r>
+      <m:oMath>
+        <m:r>
+          <m:t>2</m:t>
+        </m:r>
+        <m:r>
+          <m:rPr>
+            <m:sty m:val="p"/>
+          </m:rPr>
+          <m:t>/</m:t>
+        </m:r>
+        <m:r>
           <m:t>3</m:t>
         </m:r>
       </m:oMath>
@@ -10231,7 +10770,63 @@
           <w:color w:val="000000"/>
           <w:sz w:val="20"/>
         </w:rPr>
-        <w:t xml:space="preserve">을 사용한다. flow는 상품 3종에 대해</w:t>
+        <w:t xml:space="preserve">이다. S는</w:t>
+      </w:r>
+      <w:r>
+        <w:rPr>
+          <w:color w:val="000000"/>
+          <w:sz w:val="20"/>
+        </w:rPr>
+        <w:t xml:space="preserve"> </w:t>
+      </w:r>
+      <w:r>
+        <w:rPr>
+          <w:color w:val="000000"/>
+          <w:sz w:val="20"/>
+        </w:rPr>
+        <w:t xml:space="preserve">CP-SAT가 제한시간 안에 최적성을 증명할 수 있는 규모이고 L은 실행 가능해조차 얻기 어려운</w:t>
+      </w:r>
+      <w:r>
+        <w:rPr>
+          <w:color w:val="000000"/>
+          <w:sz w:val="20"/>
+        </w:rPr>
+        <w:t xml:space="preserve"> </w:t>
+      </w:r>
+      <w:r>
+        <w:rPr>
+          <w:color w:val="000000"/>
+          <w:sz w:val="20"/>
+        </w:rPr>
+        <w:t xml:space="preserve">규모여서 두 극단을 함께 본다. 병행 트럭 비율을 높게 잡은 것은, 이 비율이 낮으면 문제가</w:t>
+      </w:r>
+      <w:r>
+        <w:rPr>
+          <w:color w:val="000000"/>
+          <w:sz w:val="20"/>
+        </w:rPr>
+        <w:t xml:space="preserve"> </w:t>
+      </w:r>
+      <w:r>
+        <w:rPr>
+          <w:color w:val="000000"/>
+          <w:sz w:val="20"/>
+        </w:rPr>
+        <w:t xml:space="preserve">일반 크로스도킹 스케줄링에 가까워져 부분 하역 구조의 영향이 드러나지 않기 때문이다.</w:t>
+      </w:r>
+    </w:p>
+    <w:p>
+      <w:pPr>
+        <w:pStyle w:val="BodyText"/>
+        <w:spacing w:line="300" w:lineRule="exact"/>
+        <w:ind w:firstLine="216"/>
+      </w:pPr>
+      <w:r>
+        <w:rPr>
+          <w:color w:val="000000"/>
+          <w:sz w:val="20"/>
+        </w:rPr>
+        <w:t xml:space="preserve">상품은 3종이며 트럭</w:t>
       </w:r>
       <w:r>
         <w:rPr>
@@ -10241,6 +10836,70 @@
         <w:t xml:space="preserve"> </w:t>
       </w:r>
       <m:oMath>
+        <m:r>
+          <m:t>q</m:t>
+        </m:r>
+        <m:r>
+          <m:rPr>
+            <m:sty m:val="p"/>
+          </m:rPr>
+          <m:t>∈</m:t>
+        </m:r>
+        <m:r>
+          <m:t>I</m:t>
+        </m:r>
+        <m:r>
+          <m:rPr>
+            <m:sty m:val="p"/>
+          </m:rPr>
+          <m:t>∪</m:t>
+        </m:r>
+        <m:r>
+          <m:t>F</m:t>
+        </m:r>
+      </m:oMath>
+      <w:r>
+        <w:rPr>
+          <w:color w:val="000000"/>
+          <w:sz w:val="20"/>
+        </w:rPr>
+        <w:t xml:space="preserve">에 대해</w:t>
+      </w:r>
+      <w:r>
+        <w:rPr>
+          <w:color w:val="000000"/>
+          <w:sz w:val="20"/>
+        </w:rPr>
+        <w:t xml:space="preserve"> </w:t>
+      </w:r>
+      <m:oMath>
+        <m:sSub>
+          <m:e>
+            <m:r>
+              <m:t>f</m:t>
+            </m:r>
+          </m:e>
+          <m:sub>
+            <m:r>
+              <m:t>i</m:t>
+            </m:r>
+            <m:r>
+              <m:t>d</m:t>
+            </m:r>
+            <m:r>
+              <m:t>k</m:t>
+            </m:r>
+          </m:sub>
+        </m:sSub>
+        <m:r>
+          <m:rPr>
+            <m:sty m:val="p"/>
+          </m:rPr>
+          <m:t>∼</m:t>
+        </m:r>
+        <m:r>
+          <m:t>U</m:t>
+        </m:r>
         <m:r>
           <m:rPr>
             <m:sty m:val="p"/>
@@ -10271,7 +10930,7 @@
           <w:color w:val="000000"/>
           <w:sz w:val="20"/>
         </w:rPr>
-        <w:t xml:space="preserve">의 균등 정수,</w:t>
+        <w:t xml:space="preserve">,</w:t>
       </w:r>
       <w:r>
         <w:rPr>
@@ -10318,7 +10977,7 @@
           <m:t>,</m:t>
         </m:r>
         <m:r>
-          <m:t>5</m:t>
+          <m:t>4</m:t>
         </m:r>
         <m:r>
           <m:rPr>
@@ -10332,7 +10991,7 @@
           <w:color w:val="000000"/>
           <w:sz w:val="20"/>
         </w:rPr>
-        <w:t xml:space="preserve">, 도어는</w:t>
+        <w:t xml:space="preserve">,</w:t>
       </w:r>
       <w:r>
         <w:rPr>
@@ -10343,57 +11002,41 @@
       </w:r>
       <m:oMath>
         <m:r>
-          <m:t>100</m:t>
-        </m:r>
+          <m:t>D</m:t>
+        </m:r>
+        <m:sSub>
+          <m:e>
+            <m:r>
+              <m:t>E</m:t>
+            </m:r>
+          </m:e>
+          <m:sub>
+            <m:r>
+              <m:t>q</m:t>
+            </m:r>
+          </m:sub>
+        </m:sSub>
         <m:r>
           <m:rPr>
             <m:sty m:val="p"/>
           </m:rPr>
-          <m:t>×</m:t>
-        </m:r>
-        <m:r>
-          <m:t>100</m:t>
-        </m:r>
-      </m:oMath>
-      <w:r>
-        <w:rPr>
-          <w:color w:val="000000"/>
-          <w:sz w:val="20"/>
-        </w:rPr>
-        <w:t xml:space="preserve"> </w:t>
-      </w:r>
-      <w:r>
-        <w:rPr>
-          <w:color w:val="000000"/>
-          <w:sz w:val="20"/>
-        </w:rPr>
-        <w:t xml:space="preserve">랜덤 배치이다. 시간 제약 수준은</w:t>
-      </w:r>
-      <w:r>
-        <w:rPr>
-          <w:color w:val="000000"/>
-          <w:sz w:val="20"/>
-        </w:rPr>
-        <w:t xml:space="preserve"> </w:t>
-      </w:r>
-      <w:r>
-        <w:rPr>
-          <w:color w:val="000000"/>
-          <w:sz w:val="20"/>
-        </w:rPr>
-        <w:t xml:space="preserve">none/medium/tight이며 medium/tight에서</w:t>
-      </w:r>
-      <w:r>
-        <w:rPr>
-          <w:color w:val="000000"/>
-          <w:sz w:val="20"/>
-        </w:rPr>
-        <w:t xml:space="preserve"> </w:t>
-      </w:r>
-      <m:oMath>
-        <m:r>
-          <m:t>r</m:t>
-        </m:r>
+          <m:t>,</m:t>
+        </m:r>
+        <m:r>
+          <m:t>D</m:t>
+        </m:r>
+        <m:sSub>
+          <m:e>
+            <m:r>
+              <m:t>L</m:t>
+            </m:r>
+          </m:e>
+          <m:sub>
+            <m:r>
+              <m:t>q</m:t>
+            </m:r>
+          </m:sub>
+        </m:sSub>
         <m:r>
           <m:rPr>
             <m:sty m:val="p"/>
@@ -10410,7 +11053,7 @@
           <m:t>[</m:t>
         </m:r>
         <m:r>
-          <m:t>0</m:t>
+          <m:t>1</m:t>
         </m:r>
         <m:r>
           <m:rPr>
@@ -10419,10 +11062,7 @@
           <m:t>,</m:t>
         </m:r>
         <m:r>
-          <m:t>ρ</m:t>
-        </m:r>
-        <m:r>
-          <m:t>H</m:t>
+          <m:t>5</m:t>
         </m:r>
         <m:r>
           <m:rPr>
@@ -10436,7 +11076,35 @@
           <w:color w:val="000000"/>
           <w:sz w:val="20"/>
         </w:rPr>
-        <w:t xml:space="preserve">,</w:t>
+        <w:t xml:space="preserve">로 모두 정수 균등분포에서 뽑는다. 화물이 특정 목적지로 쏠리는</w:t>
+      </w:r>
+      <w:r>
+        <w:rPr>
+          <w:color w:val="000000"/>
+          <w:sz w:val="20"/>
+        </w:rPr>
+        <w:t xml:space="preserve"> </w:t>
+      </w:r>
+      <w:r>
+        <w:rPr>
+          <w:color w:val="000000"/>
+          <w:sz w:val="20"/>
+        </w:rPr>
+        <w:t xml:space="preserve">정도는 이와 별개의 조건이며, 보고하는 모든 실험은 쏠림이 없는 조건을 사용한다(쏠린</w:t>
+      </w:r>
+      <w:r>
+        <w:rPr>
+          <w:color w:val="000000"/>
+          <w:sz w:val="20"/>
+        </w:rPr>
+        <w:t xml:space="preserve"> </w:t>
+      </w:r>
+      <w:r>
+        <w:rPr>
+          <w:color w:val="000000"/>
+          <w:sz w:val="20"/>
+        </w:rPr>
+        <w:t xml:space="preserve">조건과 군집 조건은 부록 A의 transfer DQN 학습에만 쓴다). 도어는</w:t>
       </w:r>
       <w:r>
         <w:rPr>
@@ -10446,16 +11114,181 @@
         <w:t xml:space="preserve"> </w:t>
       </w:r>
       <m:oMath>
-        <m:acc>
-          <m:accPr>
-            <m:chr m:val="‾"/>
-          </m:accPr>
+        <m:r>
+          <m:rPr>
+            <m:sty m:val="p"/>
+          </m:rPr>
+          <m:t>[</m:t>
+        </m:r>
+        <m:r>
+          <m:t>0</m:t>
+        </m:r>
+        <m:r>
+          <m:rPr>
+            <m:sty m:val="p"/>
+          </m:rPr>
+          <m:t>,</m:t>
+        </m:r>
+        <m:r>
+          <m:t>100</m:t>
+        </m:r>
+        <m:sSup>
           <m:e>
             <m:r>
-              <m:t>d</m:t>
+              <m:rPr>
+                <m:sty m:val="p"/>
+              </m:rPr>
+              <m:t>]</m:t>
             </m:r>
           </m:e>
-        </m:acc>
+          <m:sup>
+            <m:r>
+              <m:t>2</m:t>
+            </m:r>
+          </m:sup>
+        </m:sSup>
+      </m:oMath>
+      <w:r>
+        <w:rPr>
+          <w:color w:val="000000"/>
+          <w:sz w:val="20"/>
+        </w:rPr>
+        <w:t xml:space="preserve">에 균등 랜덤</w:t>
+      </w:r>
+      <w:r>
+        <w:rPr>
+          <w:color w:val="000000"/>
+          <w:sz w:val="20"/>
+        </w:rPr>
+        <w:t xml:space="preserve"> </w:t>
+      </w:r>
+      <w:r>
+        <w:rPr>
+          <w:color w:val="000000"/>
+          <w:sz w:val="20"/>
+        </w:rPr>
+        <w:t xml:space="preserve">좌표로 배치하고 도어 간 이송시간</w:t>
+      </w:r>
+      <w:r>
+        <w:rPr>
+          <w:color w:val="000000"/>
+          <w:sz w:val="20"/>
+        </w:rPr>
+        <w:t xml:space="preserve"> </w:t>
+      </w:r>
+      <m:oMath>
+        <m:sSub>
+          <m:e>
+            <m:r>
+              <m:t>t</m:t>
+            </m:r>
+          </m:e>
+          <m:sub>
+            <m:r>
+              <m:t>m</m:t>
+            </m:r>
+            <m:r>
+              <m:t>n</m:t>
+            </m:r>
+          </m:sub>
+        </m:sSub>
+      </m:oMath>
+      <w:r>
+        <w:rPr>
+          <w:color w:val="000000"/>
+          <w:sz w:val="20"/>
+        </w:rPr>
+        <w:t xml:space="preserve">은 두 좌표 사이 유클리드 거리를 10으로 나눈</w:t>
+      </w:r>
+      <w:r>
+        <w:rPr>
+          <w:color w:val="000000"/>
+          <w:sz w:val="20"/>
+        </w:rPr>
+        <w:t xml:space="preserve"> </w:t>
+      </w:r>
+      <w:r>
+        <w:rPr>
+          <w:color w:val="000000"/>
+          <w:sz w:val="20"/>
+        </w:rPr>
+        <w:t xml:space="preserve">값이다. 도어를 일렬로 늘어놓으면 이송시간이 도어 번호 차이로 정해져 도어 배정이 해에</w:t>
+      </w:r>
+      <w:r>
+        <w:rPr>
+          <w:color w:val="000000"/>
+          <w:sz w:val="20"/>
+        </w:rPr>
+        <w:t xml:space="preserve"> </w:t>
+      </w:r>
+      <w:r>
+        <w:rPr>
+          <w:color w:val="000000"/>
+          <w:sz w:val="20"/>
+        </w:rPr>
+        <w:t xml:space="preserve">미치는 영향이 작아지므로, 배정 결정이 실제로 품질을 가르도록 무작위 배치를 쓴다. 거리를</w:t>
+      </w:r>
+      <w:r>
+        <w:rPr>
+          <w:color w:val="000000"/>
+          <w:sz w:val="20"/>
+        </w:rPr>
+        <w:t xml:space="preserve"> </w:t>
+      </w:r>
+      <w:r>
+        <w:rPr>
+          <w:color w:val="000000"/>
+          <w:sz w:val="20"/>
+        </w:rPr>
+        <w:t xml:space="preserve">10으로 나누는 것은 이송시간을 처리시간과 같은 크기 범위에 두기 위해서다.</w:t>
+      </w:r>
+    </w:p>
+    <w:p>
+      <w:pPr>
+        <w:pStyle w:val="Heading2"/>
+        <w:spacing w:line="384" w:lineRule="exact"/>
+      </w:pPr>
+      <w:r>
+        <w:rPr>
+          <w:b/>
+          <w:color w:val="000000"/>
+          <w:sz w:val="24"/>
+        </w:rPr>
+        <w:t xml:space="preserve">5.2 시간 제약 수준</w:t>
+      </w:r>
+    </w:p>
+    <w:p>
+      <w:pPr>
+        <w:pStyle w:val="FirstParagraph"/>
+        <w:spacing w:line="300" w:lineRule="exact"/>
+      </w:pPr>
+      <w:r>
+        <w:rPr>
+          <w:color w:val="000000"/>
+          <w:sz w:val="20"/>
+        </w:rPr>
+        <w:t xml:space="preserve">시간 제약은 none, medium, tight 세 수준이다. none은</w:t>
+      </w:r>
+      <w:r>
+        <w:rPr>
+          <w:color w:val="000000"/>
+          <w:sz w:val="20"/>
+        </w:rPr>
+        <w:t xml:space="preserve"> </w:t>
+      </w:r>
+      <m:oMath>
+        <m:sSub>
+          <m:e>
+            <m:r>
+              <m:t>r</m:t>
+            </m:r>
+          </m:e>
+          <m:sub>
+            <m:r>
+              <m:t>q</m:t>
+            </m:r>
+          </m:sub>
+        </m:sSub>
         <m:r>
           <m:rPr>
             <m:sty m:val="p"/>
@@ -10463,8 +11296,200 @@
           <m:t>=</m:t>
         </m:r>
         <m:r>
-          <m:t>r</m:t>
-        </m:r>
+          <m:t>0</m:t>
+        </m:r>
+      </m:oMath>
+      <w:r>
+        <w:rPr>
+          <w:color w:val="000000"/>
+          <w:sz w:val="20"/>
+        </w:rPr>
+        <w:t xml:space="preserve">,</w:t>
+      </w:r>
+      <w:r>
+        <w:rPr>
+          <w:color w:val="000000"/>
+          <w:sz w:val="20"/>
+        </w:rPr>
+        <w:t xml:space="preserve"> </w:t>
+      </w:r>
+      <m:oMath>
+        <m:sSub>
+          <m:e>
+            <m:acc>
+              <m:accPr>
+                <m:chr m:val="‾"/>
+              </m:accPr>
+              <m:e>
+                <m:r>
+                  <m:t>d</m:t>
+                </m:r>
+              </m:e>
+            </m:acc>
+          </m:e>
+          <m:sub>
+            <m:r>
+              <m:t>q</m:t>
+            </m:r>
+          </m:sub>
+        </m:sSub>
+        <m:r>
+          <m:rPr>
+            <m:sty m:val="p"/>
+          </m:rPr>
+          <m:t>=</m:t>
+        </m:r>
+        <m:r>
+          <m:rPr>
+            <m:sty m:val="p"/>
+          </m:rPr>
+          <m:t>∞</m:t>
+        </m:r>
+      </m:oMath>
+      <w:r>
+        <w:rPr>
+          <w:color w:val="000000"/>
+          <w:sz w:val="20"/>
+        </w:rPr>
+        <w:t xml:space="preserve">로 두어</w:t>
+      </w:r>
+      <w:r>
+        <w:rPr>
+          <w:color w:val="000000"/>
+          <w:sz w:val="20"/>
+        </w:rPr>
+        <w:t xml:space="preserve"> </w:t>
+      </w:r>
+      <w:r>
+        <w:rPr>
+          <w:color w:val="000000"/>
+          <w:sz w:val="20"/>
+        </w:rPr>
+        <w:t xml:space="preserve">모든 트럭이 시각 0에 가용하고 납기가 없는 기존 모델과 같으며, 본 연구의 확장을 껐을 때의</w:t>
+      </w:r>
+      <w:r>
+        <w:rPr>
+          <w:color w:val="000000"/>
+          <w:sz w:val="20"/>
+        </w:rPr>
+        <w:t xml:space="preserve"> </w:t>
+      </w:r>
+      <w:r>
+        <w:rPr>
+          <w:color w:val="000000"/>
+          <w:sz w:val="20"/>
+        </w:rPr>
+        <w:t xml:space="preserve">대조군 역할을 한다. medium과 tight에서는</w:t>
+      </w:r>
+      <w:r>
+        <w:rPr>
+          <w:color w:val="000000"/>
+          <w:sz w:val="20"/>
+        </w:rPr>
+        <w:t xml:space="preserve"> </w:t>
+      </w:r>
+      <m:oMath>
+        <m:sSub>
+          <m:e>
+            <m:r>
+              <m:t>r</m:t>
+            </m:r>
+          </m:e>
+          <m:sub>
+            <m:r>
+              <m:t>q</m:t>
+            </m:r>
+          </m:sub>
+        </m:sSub>
+        <m:r>
+          <m:rPr>
+            <m:sty m:val="p"/>
+          </m:rPr>
+          <m:t>∼</m:t>
+        </m:r>
+        <m:r>
+          <m:t>U</m:t>
+        </m:r>
+        <m:r>
+          <m:rPr>
+            <m:sty m:val="p"/>
+          </m:rPr>
+          <m:t>[</m:t>
+        </m:r>
+        <m:r>
+          <m:t>0</m:t>
+        </m:r>
+        <m:r>
+          <m:rPr>
+            <m:sty m:val="p"/>
+          </m:rPr>
+          <m:t>,</m:t>
+        </m:r>
+        <m:r>
+          <m:t>ρ</m:t>
+        </m:r>
+        <m:r>
+          <m:t>H</m:t>
+        </m:r>
+        <m:r>
+          <m:rPr>
+            <m:sty m:val="p"/>
+          </m:rPr>
+          <m:t>]</m:t>
+        </m:r>
+      </m:oMath>
+      <w:r>
+        <w:rPr>
+          <w:color w:val="000000"/>
+          <w:sz w:val="20"/>
+        </w:rPr>
+        <w:t xml:space="preserve">,</w:t>
+      </w:r>
+      <w:r>
+        <w:rPr>
+          <w:color w:val="000000"/>
+          <w:sz w:val="20"/>
+        </w:rPr>
+        <w:t xml:space="preserve"> </w:t>
+      </w:r>
+      <m:oMath>
+        <m:sSub>
+          <m:e>
+            <m:acc>
+              <m:accPr>
+                <m:chr m:val="‾"/>
+              </m:accPr>
+              <m:e>
+                <m:r>
+                  <m:t>d</m:t>
+                </m:r>
+              </m:e>
+            </m:acc>
+          </m:e>
+          <m:sub>
+            <m:r>
+              <m:t>q</m:t>
+            </m:r>
+          </m:sub>
+        </m:sSub>
+        <m:r>
+          <m:rPr>
+            <m:sty m:val="p"/>
+          </m:rPr>
+          <m:t>=</m:t>
+        </m:r>
+        <m:sSub>
+          <m:e>
+            <m:r>
+              <m:t>r</m:t>
+            </m:r>
+          </m:e>
+          <m:sub>
+            <m:r>
+              <m:t>q</m:t>
+            </m:r>
+          </m:sub>
+        </m:sSub>
         <m:r>
           <m:rPr>
             <m:sty m:val="p"/>
@@ -10583,13 +11608,202 @@
           <w:color w:val="000000"/>
           <w:sz w:val="20"/>
         </w:rPr>
-        <w:t xml:space="preserve">이다.</w:t>
+        <w:t xml:space="preserve">이다. 여기서</w:t>
+      </w:r>
+      <w:r>
+        <w:rPr>
+          <w:color w:val="000000"/>
+          <w:sz w:val="20"/>
+        </w:rPr>
+        <w:t xml:space="preserve"> </w:t>
+      </w:r>
+      <m:oMath>
+        <m:r>
+          <m:t>H</m:t>
+        </m:r>
+        <m:r>
+          <m:rPr>
+            <m:sty m:val="p"/>
+          </m:rPr>
+          <m:t>=</m:t>
+        </m:r>
+        <m:r>
+          <m:t>2</m:t>
+        </m:r>
+        <m:nary>
+          <m:naryPr>
+            <m:chr m:val="∑"/>
+            <m:limLoc m:val="undOvr"/>
+            <m:subHide m:val="off"/>
+            <m:supHide m:val="on"/>
+          </m:naryPr>
+          <m:sub>
+            <m:r>
+              <m:t>i</m:t>
+            </m:r>
+            <m:r>
+              <m:rPr>
+                <m:sty m:val="p"/>
+              </m:rPr>
+              <m:t>∈</m:t>
+            </m:r>
+            <m:r>
+              <m:t>I</m:t>
+            </m:r>
+          </m:sub>
+          <m:sup>
+            <m:r>
+              <m:t>​</m:t>
+            </m:r>
+          </m:sup>
+          <m:e>
+            <m:sSub>
+              <m:e>
+                <m:r>
+                  <m:t>H</m:t>
+                </m:r>
+              </m:e>
+              <m:sub>
+                <m:r>
+                  <m:t>i</m:t>
+                </m:r>
+              </m:sub>
+            </m:sSub>
+          </m:e>
+        </m:nary>
+        <m:r>
+          <m:rPr>
+            <m:sty m:val="p"/>
+          </m:rPr>
+          <m:t>/</m:t>
+        </m:r>
+        <m:r>
+          <m:rPr>
+            <m:sty m:val="p"/>
+          </m:rPr>
+          <m:t>|</m:t>
+        </m:r>
+        <m:r>
+          <m:t>M</m:t>
+        </m:r>
+        <m:r>
+          <m:rPr>
+            <m:sty m:val="p"/>
+          </m:rPr>
+          <m:t>|</m:t>
+        </m:r>
+      </m:oMath>
+      <w:r>
+        <w:rPr>
+          <w:color w:val="000000"/>
+          <w:sz w:val="20"/>
+        </w:rPr>
+        <w:t xml:space="preserve">는 시간</w:t>
+      </w:r>
+      <w:r>
+        <w:rPr>
+          <w:color w:val="000000"/>
+          <w:sz w:val="20"/>
+        </w:rPr>
+        <w:t xml:space="preserve"> </w:t>
+      </w:r>
+      <w:r>
+        <w:rPr>
+          <w:color w:val="000000"/>
+          <w:sz w:val="20"/>
+        </w:rPr>
+        <w:t xml:space="preserve">제약이 없을 때의 총 작업완료시간 추정치로, 화물 한 단위가 하역과 적재로 두 번 처리되므로</w:t>
+      </w:r>
+      <w:r>
+        <w:rPr>
+          <w:color w:val="000000"/>
+          <w:sz w:val="20"/>
+        </w:rPr>
+        <w:t xml:space="preserve"> </w:t>
+      </w:r>
+      <w:r>
+        <w:rPr>
+          <w:color w:val="000000"/>
+          <w:sz w:val="20"/>
+        </w:rPr>
+        <w:t xml:space="preserve">계수 2를 둔다. 시간 제약을</w:t>
+      </w:r>
+      <w:r>
+        <w:rPr>
+          <w:color w:val="000000"/>
+          <w:sz w:val="20"/>
+        </w:rPr>
+        <w:t xml:space="preserve"> </w:t>
+      </w:r>
+      <m:oMath>
+        <m:r>
+          <m:t>H</m:t>
+        </m:r>
+      </m:oMath>
+      <w:r>
+        <w:rPr>
+          <w:color w:val="000000"/>
+          <w:sz w:val="20"/>
+        </w:rPr>
+        <w:t xml:space="preserve">의 비율로 주면 규모가 달라져도 압박 수준이 유지된다.</w:t>
+      </w:r>
+      <w:r>
+        <w:rPr>
+          <w:color w:val="000000"/>
+          <w:sz w:val="20"/>
+        </w:rPr>
+        <w:t xml:space="preserve"> </w:t>
+      </w:r>
+      <m:oMath>
+        <m:r>
+          <m:t>ρ</m:t>
+        </m:r>
+      </m:oMath>
+      <w:r>
+        <w:rPr>
+          <w:color w:val="000000"/>
+          <w:sz w:val="20"/>
+        </w:rPr>
+        <w:t xml:space="preserve">는 도착이 퍼지는 폭,</w:t>
+      </w:r>
+      <w:r>
+        <w:rPr>
+          <w:color w:val="000000"/>
+          <w:sz w:val="20"/>
+        </w:rPr>
+        <w:t xml:space="preserve"> </w:t>
+      </w:r>
+      <m:oMath>
+        <m:r>
+          <m:t>δ</m:t>
+        </m:r>
+      </m:oMath>
+      <w:r>
+        <w:rPr>
+          <w:color w:val="000000"/>
+          <w:sz w:val="20"/>
+        </w:rPr>
+        <w:t xml:space="preserve">는 도착 후 납기까지의 여유를 뜻하므로, tight는 두</w:t>
+      </w:r>
+      <w:r>
+        <w:rPr>
+          <w:color w:val="000000"/>
+          <w:sz w:val="20"/>
+        </w:rPr>
+        <w:t xml:space="preserve"> </w:t>
+      </w:r>
+      <w:r>
+        <w:rPr>
+          <w:color w:val="000000"/>
+          <w:sz w:val="20"/>
+        </w:rPr>
+        <w:t xml:space="preserve">방향으로 동시에 어려워지는 조건이다.</w:t>
       </w:r>
     </w:p>
     <w:p>
       <w:pPr>
         <w:pStyle w:val="BodyText"/>
-        <w:spacing w:line="360" w:lineRule="auto"/>
+        <w:spacing w:line="300" w:lineRule="exact"/>
         <w:ind w:firstLine="216"/>
       </w:pPr>
       <w:r>
@@ -10597,36 +11811,132 @@
           <w:color w:val="000000"/>
           <w:sz w:val="20"/>
         </w:rPr>
-        <w:t xml:space="preserve">seed는 서로소인 train/tuning/test 집합으로 분리한다. 주 해품질 비교(Table </w:t>
-      </w:r>
-      <w:hyperlink w:anchor="tab:main">
-        <w:r>
-          <w:rPr>
-            <w:rStyle w:val="Hyperlink"/>
-          </w:rPr>
-          <w:t xml:space="preserve">2</w:t>
-        </w:r>
-      </w:hyperlink>
-      <w:r>
-        <w:rPr>
-          <w:color w:val="000000"/>
-          <w:sz w:val="20"/>
-        </w:rPr>
-        <w:t xml:space="preserve">)는</w:t>
-      </w:r>
-      <w:r>
-        <w:rPr>
-          <w:color w:val="000000"/>
-          <w:sz w:val="20"/>
-        </w:rPr>
-        <w:t xml:space="preserve"> </w:t>
-      </w:r>
-      <w:r>
-        <w:rPr>
-          <w:color w:val="000000"/>
-          <w:sz w:val="20"/>
-        </w:rPr>
-        <w:t xml:space="preserve">실험 조건당 test 인스턴스 20개</w:t>
+        <w:t xml:space="preserve">규모 3종과 시간 제약 3수준을 교차해 총 9개의 실험 조건을 만들고, 각 조건을 S-none,</w:t>
+      </w:r>
+      <w:r>
+        <w:rPr>
+          <w:color w:val="000000"/>
+          <w:sz w:val="20"/>
+        </w:rPr>
+        <w:t xml:space="preserve"> </w:t>
+      </w:r>
+      <w:r>
+        <w:rPr>
+          <w:color w:val="000000"/>
+          <w:sz w:val="20"/>
+        </w:rPr>
+        <w:t xml:space="preserve">M-tight와 같이 규모-수준 형태로 표기한다.</w:t>
+      </w:r>
+    </w:p>
+    <w:p>
+      <w:pPr>
+        <w:pStyle w:val="Heading2"/>
+        <w:spacing w:line="384" w:lineRule="exact"/>
+      </w:pPr>
+      <w:r>
+        <w:rPr>
+          <w:b/>
+          <w:color w:val="000000"/>
+          <w:sz w:val="24"/>
+        </w:rPr>
+        <w:t xml:space="preserve">5.3 비교 대상과 측정</w:t>
+      </w:r>
+    </w:p>
+    <w:p>
+      <w:pPr>
+        <w:pStyle w:val="FirstParagraph"/>
+        <w:spacing w:line="300" w:lineRule="exact"/>
+      </w:pPr>
+      <w:r>
+        <w:rPr>
+          <w:color w:val="000000"/>
+          <w:sz w:val="20"/>
+        </w:rPr>
+        <w:t xml:space="preserve">비교 대상은 다섯이다. (i) VAA는 구성 휴리스틱만 적용한 초기해, (ii) Paper-SA-RL5는 원</w:t>
+      </w:r>
+      <w:r>
+        <w:rPr>
+          <w:color w:val="000000"/>
+          <w:sz w:val="20"/>
+        </w:rPr>
+        <w:t xml:space="preserve"> </w:t>
+      </w:r>
+      <w:r>
+        <w:rPr>
+          <w:color w:val="000000"/>
+          <w:sz w:val="20"/>
+        </w:rPr>
+        <w:t xml:space="preserve">모델의 재구현이며, (iii)–(v) GILS-uniform, GILS-tabular, GILS-DQN은 선택 정책만 바꾼 제안</w:t>
+      </w:r>
+      <w:r>
+        <w:rPr>
+          <w:color w:val="000000"/>
+          <w:sz w:val="20"/>
+        </w:rPr>
+        <w:t xml:space="preserve"> </w:t>
+      </w:r>
+      <w:r>
+        <w:rPr>
+          <w:color w:val="000000"/>
+          <w:sz w:val="20"/>
+        </w:rPr>
+        <w:t xml:space="preserve">방법의 세 변형이다. 제안 방법의 기본값은 GILS-uniform이고 나머지 두 변형은 학습 기반</w:t>
+      </w:r>
+      <w:r>
+        <w:rPr>
+          <w:color w:val="000000"/>
+          <w:sz w:val="20"/>
+        </w:rPr>
+        <w:t xml:space="preserve"> </w:t>
+      </w:r>
+      <w:r>
+        <w:rPr>
+          <w:color w:val="000000"/>
+          <w:sz w:val="20"/>
+        </w:rPr>
+        <w:t xml:space="preserve">선택의 효과를 보기 위한 것이다. 여기에 CP-SAT 결과를 함께 보고한다. 원 모델은 도착</w:t>
+      </w:r>
+      <w:r>
+        <w:rPr>
+          <w:color w:val="000000"/>
+          <w:sz w:val="20"/>
+        </w:rPr>
+        <w:t xml:space="preserve"> </w:t>
+      </w:r>
+      <w:r>
+        <w:rPr>
+          <w:color w:val="000000"/>
+          <w:sz w:val="20"/>
+        </w:rPr>
+        <w:t xml:space="preserve">시각과 납기를 다루지 않으므로 Paper-SA-RL5는 none 조건에서만 비교한다.</w:t>
+      </w:r>
+    </w:p>
+    <w:p>
+      <w:pPr>
+        <w:pStyle w:val="BodyText"/>
+        <w:spacing w:line="300" w:lineRule="exact"/>
+        <w:ind w:firstLine="216"/>
+      </w:pPr>
+      <w:r>
+        <w:rPr>
+          <w:color w:val="000000"/>
+          <w:sz w:val="20"/>
+        </w:rPr>
+        <w:t xml:space="preserve">인스턴스 seed는 학습·조정·시험 세 집합으로 서로소가 되게 나눈다. 학습 정책은 학습</w:t>
+      </w:r>
+      <w:r>
+        <w:rPr>
+          <w:color w:val="000000"/>
+          <w:sz w:val="20"/>
+        </w:rPr>
+        <w:t xml:space="preserve"> </w:t>
+      </w:r>
+      <w:r>
+        <w:rPr>
+          <w:color w:val="000000"/>
+          <w:sz w:val="20"/>
+        </w:rPr>
+        <w:t xml:space="preserve">집합에서만 훈련하고</w:t>
       </w:r>
       <w:r>
         <w:rPr>
@@ -10637,10 +11947,7 @@
       </w:r>
       <m:oMath>
         <m:r>
-          <m:rPr>
-            <m:sty m:val="p"/>
-          </m:rPr>
-          <m:t>×</m:t>
+          <m:t>λ</m:t>
         </m:r>
       </m:oMath>
       <w:r>
@@ -10648,98 +11955,119 @@
           <w:color w:val="000000"/>
           <w:sz w:val="20"/>
         </w:rPr>
-        <w:t xml:space="preserve"> </w:t>
-      </w:r>
-      <w:r>
-        <w:rPr>
-          <w:color w:val="000000"/>
-          <w:sz w:val="20"/>
-        </w:rPr>
-        <w:t xml:space="preserve">replication 5회를 사용하고, 통제된 ablation은</w:t>
-      </w:r>
-      <w:r>
-        <w:rPr>
-          <w:color w:val="000000"/>
-          <w:sz w:val="20"/>
-        </w:rPr>
-        <w:t xml:space="preserve"> </w:t>
-      </w:r>
-      <w:r>
-        <w:rPr>
-          <w:color w:val="000000"/>
-          <w:sz w:val="20"/>
-        </w:rPr>
-        <w:t xml:space="preserve">동일한 반복 횟수·동일 구조 분해이므로 원래의 5-인스턴스 설계를 유지한다. 인스턴스별로</w:t>
-      </w:r>
-      <w:r>
-        <w:rPr>
-          <w:color w:val="000000"/>
-          <w:sz w:val="20"/>
-        </w:rPr>
-        <w:t xml:space="preserve"> </w:t>
-      </w:r>
-      <w:r>
-        <w:rPr>
-          <w:color w:val="000000"/>
-          <w:sz w:val="20"/>
-        </w:rPr>
-        <w:t xml:space="preserve">replication을 평균한 뒤 짝지은 인스턴스 평균에 양측 Wilcoxon signed-rank test를</w:t>
-      </w:r>
-      <w:r>
-        <w:rPr>
-          <w:color w:val="000000"/>
-          <w:sz w:val="20"/>
-        </w:rPr>
-        <w:t xml:space="preserve"> </w:t>
-      </w:r>
-      <w:r>
-        <w:rPr>
-          <w:color w:val="000000"/>
-          <w:sz w:val="20"/>
-        </w:rPr>
-        <w:t xml:space="preserve">적용한다. GILS의 종료 조건은 반복 횟수 1,000회다.</w:t>
-      </w:r>
-      <w:r>
-        <w:rPr>
-          <w:color w:val="000000"/>
-          <w:sz w:val="20"/>
-        </w:rPr>
-        <w:t xml:space="preserve"/>
-      </w:r>
-      <w:r>
-        <w:rPr>
-          <w:color w:val="000000"/>
-          <w:sz w:val="20"/>
-        </w:rPr>
-        <w:t xml:space="preserve"> CP-SAT는 인스턴스당 1회, 8 thread로 S</w:t>
-      </w:r>
-      <w:r>
-        <w:rPr>
-          <w:color w:val="000000"/>
-          <w:sz w:val="20"/>
-        </w:rPr>
-        <w:t xml:space="preserve"> </w:t>
-      </w:r>
-      <w:r>
-        <w:rPr>
-          <w:color w:val="000000"/>
-          <w:sz w:val="20"/>
-        </w:rPr>
-        <w:t xml:space="preserve">300초(5개), M/L 600초(조건당 2개) 실행하며 S-none 5개만 최적이 증명된다. 주 지표는</w:t>
-      </w:r>
-      <w:r>
-        <w:rPr>
-          <w:color w:val="000000"/>
-          <w:sz w:val="20"/>
-        </w:rPr>
-        <w:t xml:space="preserve"> </w:t>
-      </w:r>
-      <w:r>
-        <w:rPr>
-          <w:color w:val="000000"/>
-          <w:sz w:val="20"/>
-        </w:rPr>
-        <w:t xml:space="preserve">모든 방법과 반복 횟수 및 CP-SAT 결과를 포함하여 관측된 최선해에 대한 인스턴스별 gap</w:t>
+        <w:t xml:space="preserve">와 같은 설계 값은 조정 집합에서만 고르므로 시험 집합의</w:t>
+      </w:r>
+      <w:r>
+        <w:rPr>
+          <w:color w:val="000000"/>
+          <w:sz w:val="20"/>
+        </w:rPr>
+        <w:t xml:space="preserve"> </w:t>
+      </w:r>
+      <w:r>
+        <w:rPr>
+          <w:color w:val="000000"/>
+          <w:sz w:val="20"/>
+        </w:rPr>
+        <w:t xml:space="preserve">성능이 부풀려지지 않는다. 주 해품질 비교(&lt;Table 2&gt;)는 조건당 시험 인스턴스</w:t>
+      </w:r>
+      <w:r>
+        <w:rPr>
+          <w:color w:val="000000"/>
+          <w:sz w:val="20"/>
+        </w:rPr>
+        <w:t xml:space="preserve"> </w:t>
+      </w:r>
+      <w:r>
+        <w:rPr>
+          <w:color w:val="000000"/>
+          <w:sz w:val="20"/>
+        </w:rPr>
+        <w:t xml:space="preserve">20개를 각각 5회 반복 실행한다. 인스턴스마다 난이도가 다르므로 여러 개가 필요하고,</w:t>
+      </w:r>
+      <w:r>
+        <w:rPr>
+          <w:color w:val="000000"/>
+          <w:sz w:val="20"/>
+        </w:rPr>
+        <w:t xml:space="preserve"> </w:t>
+      </w:r>
+      <w:r>
+        <w:rPr>
+          <w:color w:val="000000"/>
+          <w:sz w:val="20"/>
+        </w:rPr>
+        <w:t xml:space="preserve">알고리즘에 무작위성이 있으므로 같은 인스턴스도 여러 번 실행한다. 통제된</w:t>
+      </w:r>
+      <w:r>
+        <w:rPr>
+          <w:color w:val="000000"/>
+          <w:sz w:val="20"/>
+        </w:rPr>
+        <w:t xml:space="preserve"> </w:t>
+      </w:r>
+      <w:r>
+        <w:rPr>
+          <w:color w:val="000000"/>
+          <w:sz w:val="20"/>
+        </w:rPr>
+        <w:t xml:space="preserve">ablation(&lt;Table 3&gt;–&lt;Table 5&gt;)은 같은 엔진에서 구성요소만 떼어내는</w:t>
+      </w:r>
+      <w:r>
+        <w:rPr>
+          <w:color w:val="000000"/>
+          <w:sz w:val="20"/>
+        </w:rPr>
+        <w:t xml:space="preserve"> </w:t>
+      </w:r>
+      <w:r>
+        <w:rPr>
+          <w:color w:val="000000"/>
+          <w:sz w:val="20"/>
+        </w:rPr>
+        <w:t xml:space="preserve">짝지은 비교여서 인스턴스 간 난이도 편차가 상쇄되므로 조건당 5개만 사용한다.</w:t>
+      </w:r>
+    </w:p>
+    <w:p>
+      <w:pPr>
+        <w:pStyle w:val="BodyText"/>
+        <w:spacing w:line="300" w:lineRule="exact"/>
+        <w:ind w:firstLine="216"/>
+      </w:pPr>
+      <w:r>
+        <w:rPr>
+          <w:color w:val="000000"/>
+          <w:sz w:val="20"/>
+        </w:rPr>
+        <w:t xml:space="preserve">같은 인스턴스의 5회 반복은 서로 독립이 아니므로, 먼저 인스턴스별로 평균해 조건당 값</w:t>
+      </w:r>
+      <w:r>
+        <w:rPr>
+          <w:color w:val="000000"/>
+          <w:sz w:val="20"/>
+        </w:rPr>
+        <w:t xml:space="preserve"> </w:t>
+      </w:r>
+      <w:r>
+        <w:rPr>
+          <w:color w:val="000000"/>
+          <w:sz w:val="20"/>
+        </w:rPr>
+        <w:t xml:space="preserve">하나를 만든 뒤 짝지은 인스턴스 평균에 양측 Wilcoxon signed-rank test를 적용한다. 주</w:t>
+      </w:r>
+      <w:r>
+        <w:rPr>
+          <w:color w:val="000000"/>
+          <w:sz w:val="20"/>
+        </w:rPr>
+        <w:t xml:space="preserve"> </w:t>
+      </w:r>
+      <w:r>
+        <w:rPr>
+          <w:color w:val="000000"/>
+          <w:sz w:val="20"/>
+        </w:rPr>
+        <w:t xml:space="preserve">지표는 인스턴스별 격차</w:t>
       </w:r>
       <w:r>
         <w:rPr>
@@ -10773,7 +12101,91 @@
           <w:color w:val="000000"/>
           <w:sz w:val="20"/>
         </w:rPr>
-        <w:t xml:space="preserve">이다.</w:t>
+        <w:t xml:space="preserve">이며, 해당 인스턴스에 대해 모든 방법과 모든 반복</w:t>
+      </w:r>
+      <w:r>
+        <w:rPr>
+          <w:color w:val="000000"/>
+          <w:sz w:val="20"/>
+        </w:rPr>
+        <w:t xml:space="preserve"> </w:t>
+      </w:r>
+      <w:r>
+        <w:rPr>
+          <w:color w:val="000000"/>
+          <w:sz w:val="20"/>
+        </w:rPr>
+        <w:t xml:space="preserve">횟수, CP-SAT 결과까지 통틀어 관측된 가장 좋은 목적값을 기준으로 삼는다. 대형 조건에서는</w:t>
+      </w:r>
+      <w:r>
+        <w:rPr>
+          <w:color w:val="000000"/>
+          <w:sz w:val="20"/>
+        </w:rPr>
+        <w:t xml:space="preserve"> </w:t>
+      </w:r>
+      <w:r>
+        <w:rPr>
+          <w:color w:val="000000"/>
+          <w:sz w:val="20"/>
+        </w:rPr>
+        <w:t xml:space="preserve">CP-SAT 기준해가 없어 최적해 대비 갭을 쓸 수 없기 때문이다.</w:t>
+      </w:r>
+    </w:p>
+    <w:p>
+      <w:pPr>
+        <w:pStyle w:val="BodyText"/>
+        <w:spacing w:line="300" w:lineRule="exact"/>
+        <w:ind w:firstLine="216"/>
+      </w:pPr>
+      <w:r>
+        <w:rPr>
+          <w:color w:val="000000"/>
+          <w:sz w:val="20"/>
+        </w:rPr>
+        <w:t xml:space="preserve">GILS 계열의 종료 조건은 반복 횟수 1</w:t>
+      </w:r>
+      <w:r>
+        <w:rPr>
+          <w:color w:val="000000"/>
+          <w:sz w:val="20"/>
+        </w:rPr>
+        <w:t xml:space="preserve">,</w:t>
+      </w:r>
+      <w:r>
+        <w:rPr>
+          <w:color w:val="000000"/>
+          <w:sz w:val="20"/>
+        </w:rPr>
+        <w:t xml:space="preserve">000회로 통일한다. CP-SAT는 인스턴스당 1회, 8</w:t>
+      </w:r>
+      <w:r>
+        <w:rPr>
+          <w:color w:val="000000"/>
+          <w:sz w:val="20"/>
+        </w:rPr>
+        <w:t xml:space="preserve"> </w:t>
+      </w:r>
+      <w:r>
+        <w:rPr>
+          <w:color w:val="000000"/>
+          <w:sz w:val="20"/>
+        </w:rPr>
+        <w:t xml:space="preserve">thread로 S에 300초(5개), M과 L에 600초(조건당 2개)를 부여하며 S-none 5개에서만 최적성이</w:t>
+      </w:r>
+      <w:r>
+        <w:rPr>
+          <w:color w:val="000000"/>
+          <w:sz w:val="20"/>
+        </w:rPr>
+        <w:t xml:space="preserve"> </w:t>
+      </w:r>
+      <w:r>
+        <w:rPr>
+          <w:color w:val="000000"/>
+          <w:sz w:val="20"/>
+        </w:rPr>
+        <w:t xml:space="preserve">증명된다. 실험은 Apple M2 칩(8코어)과 16 GB 메모리를 갖춘 macOS 환경에서 Python 3.12와 OR-Tools 9.15로 수행하였다.</w:t>
       </w:r>
     </w:p>
     <w:bookmarkEnd w:id="18"/>
@@ -10781,7 +12193,7 @@
     <w:p>
       <w:pPr>
         <w:pStyle w:val="Heading1"/>
-        <w:spacing w:line="360" w:lineRule="auto"/>
+        <w:spacing w:line="448" w:lineRule="exact"/>
       </w:pPr>
       <w:r>
         <w:rPr>
@@ -10796,7 +12208,7 @@
     <w:p>
       <w:pPr>
         <w:pStyle w:val="Heading2"/>
-        <w:spacing w:line="360" w:lineRule="auto"/>
+        <w:spacing w:line="384" w:lineRule="exact"/>
       </w:pPr>
       <w:r>
         <w:rPr>
@@ -10810,21 +12222,21 @@
     <w:p>
       <w:pPr>
         <w:pStyle w:val="FirstParagraph"/>
-        <w:spacing w:line="360" w:lineRule="auto"/>
+        <w:spacing w:line="300" w:lineRule="exact"/>
       </w:pPr>
       <w:r>
         <w:rPr>
           <w:color w:val="000000"/>
           <w:sz w:val="20"/>
         </w:rPr>
-        <w:t xml:space="preserve">Table </w:t>
+        <w:t xml:space="preserve">&lt;Table 2&gt;에 20개 인스턴스에 대한 시험 결과를 요약하였다.</w:t>
       </w:r>
       <w:hyperlink w:anchor="tab:main">
         <w:r>
           <w:rPr>
             <w:rStyle w:val="Hyperlink"/>
           </w:rPr>
-          <w:t xml:space="preserve">2</w:t>
+          <w:t xml:space="preserve"/>
         </w:r>
       </w:hyperlink>
       <w:r>
@@ -10832,35 +12244,35 @@
           <w:color w:val="000000"/>
           <w:sz w:val="20"/>
         </w:rPr>
-        <w:t xml:space="preserve">이 20-인스턴스 test 결과를 요약한다. CP-SAT가 기준해를 제공한</w:t>
-      </w:r>
-      <w:r>
-        <w:rPr>
-          <w:color w:val="000000"/>
-          <w:sz w:val="20"/>
-        </w:rPr>
-        <w:t xml:space="preserve"> </w:t>
-      </w:r>
-      <w:r>
-        <w:rPr>
-          <w:color w:val="000000"/>
-          <w:sz w:val="20"/>
-        </w:rPr>
-        <w:t xml:space="preserve">실험 조건에서 GILS는 이에 근접하며, 기본 selector인 uniform 기준 0.11–0.21%이다</w:t>
-      </w:r>
-      <w:r>
-        <w:rPr>
-          <w:color w:val="000000"/>
-          <w:sz w:val="20"/>
-        </w:rPr>
-        <w:t xml:space="preserve"> </w:t>
-      </w:r>
-      <w:r>
-        <w:rPr>
-          <w:color w:val="000000"/>
-          <w:sz w:val="20"/>
-        </w:rPr>
-        <w:t xml:space="preserve">(학습 selector를 포함한 전체 변형은 0.1–0.6%). 같은 selector 기준으로 GILS는</w:t>
+        <w:t xml:space="preserve"> CP-SAT가 기준해를 제공한</w:t>
+      </w:r>
+      <w:r>
+        <w:rPr>
+          <w:color w:val="000000"/>
+          <w:sz w:val="20"/>
+        </w:rPr>
+        <w:t xml:space="preserve"> </w:t>
+      </w:r>
+      <w:r>
+        <w:rPr>
+          <w:color w:val="000000"/>
+          <w:sz w:val="20"/>
+        </w:rPr>
+        <w:t xml:space="preserve">실험 조건에서 GILS는 이에 근접하며, 기본 선택 정책인 균등 선택 기준 0.11–0.21%이다</w:t>
+      </w:r>
+      <w:r>
+        <w:rPr>
+          <w:color w:val="000000"/>
+          <w:sz w:val="20"/>
+        </w:rPr>
+        <w:t xml:space="preserve"> </w:t>
+      </w:r>
+      <w:r>
+        <w:rPr>
+          <w:color w:val="000000"/>
+          <w:sz w:val="20"/>
+        </w:rPr>
+        <w:t xml:space="preserve">(학습 선택 정책을 포함한 전체 변형은 0.1–0.6%). 같은 선택 정책 기준으로 GILS는</w:t>
       </w:r>
       <w:r>
         <w:rPr>
@@ -15570,7 +16982,7 @@
     <w:p>
       <w:pPr>
         <w:pStyle w:val="Heading2"/>
-        <w:spacing w:line="360" w:lineRule="auto"/>
+        <w:spacing w:line="384" w:lineRule="exact"/>
       </w:pPr>
       <w:r>
         <w:rPr>
@@ -15584,7 +16996,7 @@
     <w:p>
       <w:pPr>
         <w:pStyle w:val="FirstParagraph"/>
-        <w:spacing w:line="360" w:lineRule="auto"/>
+        <w:spacing w:line="300" w:lineRule="exact"/>
       </w:pPr>
       <w:r>
         <w:rPr>
@@ -15611,7 +17023,7 @@
     <w:p>
       <w:pPr>
         <w:pStyle w:val="BodyText"/>
-        <w:spacing w:line="360" w:lineRule="auto"/>
+        <w:spacing w:line="300" w:lineRule="exact"/>
         <w:ind w:firstLine="216"/>
       </w:pPr>
       <w:r>
@@ -15635,21 +17047,21 @@
           <w:color w:val="000000"/>
           <w:sz w:val="20"/>
         </w:rPr>
-        <w:t xml:space="preserve">selection을 uniform으로 고정하고 연산자 집합만 generic(7)/</w:t>
-      </w:r>
-      <w:r>
-        <w:rPr>
-          <w:color w:val="000000"/>
-          <w:sz w:val="20"/>
-        </w:rPr>
-        <w:t xml:space="preserve"> </w:t>
-      </w:r>
-      <w:r>
-        <w:rPr>
-          <w:color w:val="000000"/>
-          <w:sz w:val="20"/>
-        </w:rPr>
-        <w:t xml:space="preserve">critical(+g1,g2)/full(+g3,g4)로 바꾸면</w:t>
+        <w:t xml:space="preserve">선택 정책을 균등 선택으로 고정하고 연산자 집합만 기본(7종)/ 핵심(+g1,g2)/전체(+g3,g4)로</w:t>
+      </w:r>
+      <w:r>
+        <w:rPr>
+          <w:color w:val="000000"/>
+          <w:sz w:val="20"/>
+        </w:rPr>
+        <w:t xml:space="preserve"/>
+      </w:r>
+      <w:r>
+        <w:rPr>
+          <w:color w:val="000000"/>
+          <w:sz w:val="20"/>
+        </w:rPr>
+        <w:t xml:space="preserve"> 바꾸면</w:t>
       </w:r>
       <w:r>
         <w:rPr>
@@ -15755,14 +17167,14 @@
           <w:color w:val="000000"/>
           <w:sz w:val="20"/>
         </w:rPr>
-        <w:t xml:space="preserve">full로 단조 감소한다(Figure </w:t>
+        <w:t xml:space="preserve">full로 단조 감소한다(&lt;Figure 1&gt;)</w:t>
       </w:r>
       <w:hyperlink w:anchor="fig:op">
         <w:r>
           <w:rPr>
             <w:rStyle w:val="Hyperlink"/>
           </w:rPr>
-          <w:t xml:space="preserve">1</w:t>
+          <w:t xml:space="preserve"/>
         </w:r>
       </w:hyperlink>
       <w:r>
@@ -15770,28 +17182,28 @@
           <w:color w:val="000000"/>
           <w:sz w:val="20"/>
         </w:rPr>
-        <w:t xml:space="preserve">). 짝지은</w:t>
-      </w:r>
-      <w:r>
-        <w:rPr>
-          <w:color w:val="000000"/>
-          <w:sz w:val="20"/>
-        </w:rPr>
-        <w:t xml:space="preserve"> </w:t>
-      </w:r>
-      <w:r>
-        <w:rPr>
-          <w:color w:val="000000"/>
-          <w:sz w:val="20"/>
-        </w:rPr>
-        <w:t xml:space="preserve">Wilcoxon(Table </w:t>
+        <w:t xml:space="preserve">. 짝지은</w:t>
+      </w:r>
+      <w:r>
+        <w:rPr>
+          <w:color w:val="000000"/>
+          <w:sz w:val="20"/>
+        </w:rPr>
+        <w:t xml:space="preserve"> </w:t>
+      </w:r>
+      <w:r>
+        <w:rPr>
+          <w:color w:val="000000"/>
+          <w:sz w:val="20"/>
+        </w:rPr>
+        <w:t xml:space="preserve">Wilcoxon(&lt;Table 3&gt;)</w:t>
       </w:r>
       <w:hyperlink w:anchor="tab:b1">
         <w:r>
           <w:rPr>
             <w:rStyle w:val="Hyperlink"/>
           </w:rPr>
-          <w:t xml:space="preserve">3</w:t>
+          <w:t xml:space="preserve"/>
         </w:r>
       </w:hyperlink>
       <w:r>
@@ -15799,7 +17211,7 @@
           <w:color w:val="000000"/>
           <w:sz w:val="20"/>
         </w:rPr>
-        <w:t xml:space="preserve">)은 유도 연산자가 목적값을 일관되게·유의하게 낮춤을</w:t>
+        <w:t xml:space="preserve">은 유도 연산자가 목적값을 일관되게·유의하게 낮춤을</w:t>
       </w:r>
       <w:r>
         <w:rPr>
@@ -16225,7 +17637,7 @@
         </w:rPr>
         <w:drawing>
           <wp:inline>
-            <wp:extent cx="5334000" cy="3167062"/>
+            <wp:extent cx="5334000" cy="3087159"/>
             <wp:effectExtent b="0" l="0" r="0" t="0"/>
             <wp:docPr descr="" title="" id="23" name="Picture"/>
             <a:graphic>
@@ -16246,7 +17658,7 @@
                   <pic:spPr bwMode="auto">
                     <a:xfrm>
                       <a:off x="0" y="0"/>
-                      <a:ext cx="5334000" cy="3167062"/>
+                      <a:ext cx="5334000" cy="2617767"/>
                     </a:xfrm>
                     <a:prstGeom prst="rect">
                       <a:avLst/>
@@ -16283,7 +17695,7 @@
     <w:p>
       <w:pPr>
         <w:pStyle w:val="BodyText"/>
-        <w:spacing w:line="360" w:lineRule="auto"/>
+        <w:spacing w:line="300" w:lineRule="exact"/>
         <w:ind w:firstLine="216"/>
       </w:pPr>
       <w:r>
@@ -16307,28 +17719,28 @@
           <w:color w:val="000000"/>
           <w:sz w:val="20"/>
         </w:rPr>
-        <w:t xml:space="preserve">연산자 집합을 full, selection을 uniform으로 고정하고 구성요소를</w:t>
-      </w:r>
-      <w:r>
-        <w:rPr>
-          <w:color w:val="000000"/>
-          <w:sz w:val="20"/>
-        </w:rPr>
-        <w:t xml:space="preserve"> </w:t>
-      </w:r>
-      <w:r>
-        <w:rPr>
-          <w:color w:val="000000"/>
-          <w:sz w:val="20"/>
-        </w:rPr>
-        <w:t xml:space="preserve">하나씩 제거하면(Table </w:t>
+        <w:t xml:space="preserve">연산자 집합을 full, 선택 정책을 균등 선택으로 고정하고 구성요소를</w:t>
+      </w:r>
+      <w:r>
+        <w:rPr>
+          <w:color w:val="000000"/>
+          <w:sz w:val="20"/>
+        </w:rPr>
+        <w:t xml:space="preserve"> </w:t>
+      </w:r>
+      <w:r>
+        <w:rPr>
+          <w:color w:val="000000"/>
+          <w:sz w:val="20"/>
+        </w:rPr>
+        <w:t xml:space="preserve">하나씩 제거하면(&lt;Table 4&gt;)</w:t>
       </w:r>
       <w:hyperlink w:anchor="tab:b2">
         <w:r>
           <w:rPr>
             <w:rStyle w:val="Hyperlink"/>
           </w:rPr>
-          <w:t xml:space="preserve">4</w:t>
+          <w:t xml:space="preserve"/>
         </w:r>
       </w:hyperlink>
       <w:r>
@@ -16336,7 +17748,7 @@
           <w:color w:val="000000"/>
           <w:sz w:val="20"/>
         </w:rPr>
-        <w:t xml:space="preserve">), best-improvement descent의 기여가 가장 크고 kick</w:t>
+        <w:t xml:space="preserve">, best-improvement descent의 기여가 가장 크고 kick</w:t>
       </w:r>
       <w:r>
         <w:rPr>
@@ -16364,14 +17776,14 @@
           <w:color w:val="000000"/>
           <w:sz w:val="20"/>
         </w:rPr>
-        <w:t xml:space="preserve">제거해도 목적값이 나빠지지 않는다(Figure </w:t>
+        <w:t xml:space="preserve">제거해도 목적값이 나빠지지 않는다(&lt;Figure 2&gt;)</w:t>
       </w:r>
       <w:hyperlink w:anchor="fig:comp">
         <w:r>
           <w:rPr>
             <w:rStyle w:val="Hyperlink"/>
           </w:rPr>
-          <w:t xml:space="preserve">2</w:t>
+          <w:t xml:space="preserve"/>
         </w:r>
       </w:hyperlink>
       <w:r>
@@ -16379,7 +17791,7 @@
           <w:color w:val="000000"/>
           <w:sz w:val="20"/>
         </w:rPr>
-        <w:t xml:space="preserve">).</w:t>
+        <w:t xml:space="preserve">.</w:t>
       </w:r>
     </w:p>
     <w:bookmarkStart w:id="26" w:name="tab:b2"/>
@@ -16869,7 +18281,7 @@
         </w:rPr>
         <w:drawing>
           <wp:inline>
-            <wp:extent cx="5334000" cy="2424545"/>
+            <wp:extent cx="5334000" cy="2617767"/>
             <wp:effectExtent b="0" l="0" r="0" t="0"/>
             <wp:docPr descr="" title="" id="28" name="Picture"/>
             <a:graphic>
@@ -16890,7 +18302,7 @@
                   <pic:spPr bwMode="auto">
                     <a:xfrm>
                       <a:off x="0" y="0"/>
-                      <a:ext cx="5334000" cy="2424545"/>
+                      <a:ext cx="5334000" cy="2617767"/>
                     </a:xfrm>
                     <a:prstGeom prst="rect">
                       <a:avLst/>
@@ -16929,7 +18341,7 @@
     <w:p>
       <w:pPr>
         <w:pStyle w:val="Heading2"/>
-        <w:spacing w:line="360" w:lineRule="auto"/>
+        <w:spacing w:line="384" w:lineRule="exact"/>
       </w:pPr>
       <w:r>
         <w:rPr>
@@ -16943,21 +18355,21 @@
     <w:p>
       <w:pPr>
         <w:pStyle w:val="FirstParagraph"/>
-        <w:spacing w:line="360" w:lineRule="auto"/>
+        <w:spacing w:line="300" w:lineRule="exact"/>
       </w:pPr>
       <w:r>
         <w:rPr>
           <w:color w:val="000000"/>
           <w:sz w:val="20"/>
         </w:rPr>
-        <w:t xml:space="preserve">연산자 집합과 구성요소를 full로 고정하고 selection만 바꾸면(Table </w:t>
+        <w:t xml:space="preserve">연산자 집합과 구성요소를 전체로 고정하고 선택 정책만 바꾸면(&lt;Table 5&gt;)</w:t>
       </w:r>
       <w:hyperlink w:anchor="tab:sel">
         <w:r>
           <w:rPr>
             <w:rStyle w:val="Hyperlink"/>
           </w:rPr>
-          <w:t xml:space="preserve">5</w:t>
+          <w:t xml:space="preserve"/>
         </w:r>
       </w:hyperlink>
       <w:r>
@@ -16965,21 +18377,21 @@
           <w:color w:val="000000"/>
           <w:sz w:val="20"/>
         </w:rPr>
-        <w:t xml:space="preserve">), 어떤</w:t>
-      </w:r>
-      <w:r>
-        <w:rPr>
-          <w:color w:val="000000"/>
-          <w:sz w:val="20"/>
-        </w:rPr>
-        <w:t xml:space="preserve"> </w:t>
-      </w:r>
-      <w:r>
-        <w:rPr>
-          <w:color w:val="000000"/>
-          <w:sz w:val="20"/>
-        </w:rPr>
-        <w:t xml:space="preserve">learned policy도 uniform을 실용적으로 능가하지 못한다. 반복 횟수를 50–3,000회로 바꾸어도 결과는 같고 우열의 방향이 반복 횟수에 따라 뒤집히며</w:t>
+        <w:t xml:space="preserve">, 어떤</w:t>
+      </w:r>
+      <w:r>
+        <w:rPr>
+          <w:color w:val="000000"/>
+          <w:sz w:val="20"/>
+        </w:rPr>
+        <w:t xml:space="preserve"> </w:t>
+      </w:r>
+      <w:r>
+        <w:rPr>
+          <w:color w:val="000000"/>
+          <w:sz w:val="20"/>
+        </w:rPr>
+        <w:t xml:space="preserve">학습 정책도 균등 선택을 실용적으로 능가하지 못한다. 반복 횟수를 50–3,000회로 바꾸어도 결과는 같고 우열의 방향이 반복 횟수에 따라 뒤집히며</w:t>
       </w:r>
       <w:r>
         <w:rPr>
@@ -17007,14 +18419,14 @@
           <w:color w:val="000000"/>
           <w:sz w:val="20"/>
         </w:rPr>
-        <w:t xml:space="preserve">(Figure </w:t>
+        <w:t xml:space="preserve">(&lt;Figure 4&gt;)</w:t>
       </w:r>
       <w:hyperlink w:anchor="fig:sel">
         <w:r>
           <w:rPr>
             <w:rStyle w:val="Hyperlink"/>
           </w:rPr>
-          <w:t xml:space="preserve">4</w:t>
+          <w:t xml:space="preserve"/>
         </w:r>
       </w:hyperlink>
       <w:r>
@@ -17022,7 +18434,7 @@
           <w:color w:val="000000"/>
           <w:sz w:val="20"/>
         </w:rPr>
-        <w:t xml:space="preserve">),</w:t>
+        <w:t xml:space="preserve">,</w:t>
       </w:r>
       <w:r>
         <w:rPr>
@@ -17453,7 +18865,7 @@
     <w:p>
       <w:pPr>
         <w:pStyle w:val="Heading2"/>
-        <w:spacing w:line="360" w:lineRule="auto"/>
+        <w:spacing w:line="384" w:lineRule="exact"/>
       </w:pPr>
       <w:r>
         <w:rPr>
@@ -17467,14 +18879,14 @@
     <w:p>
       <w:pPr>
         <w:pStyle w:val="FirstParagraph"/>
-        <w:spacing w:line="360" w:lineRule="auto"/>
+        <w:spacing w:line="300" w:lineRule="exact"/>
       </w:pPr>
       <w:r>
         <w:rPr>
           <w:color w:val="000000"/>
           <w:sz w:val="20"/>
         </w:rPr>
-        <w:t xml:space="preserve">식 (16)이 시간 단위 성분 둘을 합치므로 tuning 집합에서</w:t>
+        <w:t xml:space="preserve">식 (16)이 시간 단위 성분 둘을 합치므로 조정 집합에서</w:t>
       </w:r>
       <w:r>
         <w:rPr>
@@ -17568,28 +18980,28 @@
           <w:color w:val="000000"/>
           <w:sz w:val="20"/>
         </w:rPr>
-        <w:t xml:space="preserve">을 스윕한다. 물리적 makespan과 총 tardiness를</w:t>
-      </w:r>
-      <w:r>
-        <w:rPr>
-          <w:color w:val="000000"/>
-          <w:sz w:val="20"/>
-        </w:rPr>
-        <w:t xml:space="preserve"> </w:t>
-      </w:r>
-      <w:r>
-        <w:rPr>
-          <w:color w:val="000000"/>
-          <w:sz w:val="20"/>
-        </w:rPr>
-        <w:t xml:space="preserve">인스턴스별로 min–max 정규화해 평균한다(Figure </w:t>
+        <w:t xml:space="preserve">을 스윕한다. 물리적 총 작업완료시간과 총 납기지연을</w:t>
+      </w:r>
+      <w:r>
+        <w:rPr>
+          <w:color w:val="000000"/>
+          <w:sz w:val="20"/>
+        </w:rPr>
+        <w:t xml:space="preserve"> </w:t>
+      </w:r>
+      <w:r>
+        <w:rPr>
+          <w:color w:val="000000"/>
+          <w:sz w:val="20"/>
+        </w:rPr>
+        <w:t xml:space="preserve">인스턴스별로 min–max 정규화해 평균한다(&lt;Figure 3&gt;)</w:t>
       </w:r>
       <w:hyperlink w:anchor="fig:lam">
         <w:r>
           <w:rPr>
             <w:rStyle w:val="Hyperlink"/>
           </w:rPr>
-          <w:t xml:space="preserve">3</w:t>
+          <w:t xml:space="preserve"/>
         </w:r>
       </w:hyperlink>
       <w:r>
@@ -17597,7 +19009,7 @@
           <w:color w:val="000000"/>
           <w:sz w:val="20"/>
         </w:rPr>
-        <w:t xml:space="preserve">). tardiness 감소의</w:t>
+        <w:t xml:space="preserve">. 납기지연 감소의</w:t>
       </w:r>
       <w:r>
         <w:rPr>
@@ -17679,7 +19091,7 @@
           <w:color w:val="000000"/>
           <w:sz w:val="20"/>
         </w:rPr>
-        <w:t xml:space="preserve">makespan은 약 1% 상승, 평균 tardiness는 2–3% 하락한다.</w:t>
+        <w:t xml:space="preserve">총 작업완료시간은 약 1% 상승, 평균 납기지연은 2–3% 하락한다.</w:t>
       </w:r>
       <w:r>
         <w:rPr>
@@ -17721,21 +19133,21 @@
           <w:color w:val="000000"/>
           <w:sz w:val="20"/>
         </w:rPr>
-        <w:t xml:space="preserve">완만한 makespan 비용으로 tardiness가 거의 최소에 이르고 두 시간 성분에 동일</w:t>
-      </w:r>
-      <w:r>
-        <w:rPr>
-          <w:color w:val="000000"/>
-          <w:sz w:val="20"/>
-        </w:rPr>
-        <w:t xml:space="preserve"> </w:t>
-      </w:r>
-      <w:r>
-        <w:rPr>
-          <w:color w:val="000000"/>
-          <w:sz w:val="20"/>
-        </w:rPr>
-        <w:t xml:space="preserve">가중을 준다. 이 스윕은 test가 아닌 tuning 인스턴스를 사용한 설계 정당화이다.</w:t>
+        <w:t xml:space="preserve">완만한 총 작업완료시간 비용으로 납기지연이 거의 최소에 이르고 두 시간 성분에 동일</w:t>
+      </w:r>
+      <w:r>
+        <w:rPr>
+          <w:color w:val="000000"/>
+          <w:sz w:val="20"/>
+        </w:rPr>
+        <w:t xml:space="preserve"> </w:t>
+      </w:r>
+      <w:r>
+        <w:rPr>
+          <w:color w:val="000000"/>
+          <w:sz w:val="20"/>
+        </w:rPr>
+        <w:t xml:space="preserve">가중을 준다. 이 스윕은 시험이 아닌 조정 인스턴스를 사용한 설계 정당화이다.</w:t>
       </w:r>
     </w:p>
     <w:bookmarkStart w:id="37" w:name="fig:lam"/>
@@ -17752,7 +19164,7 @@
         </w:rPr>
         <w:drawing>
           <wp:inline>
-            <wp:extent cx="3840480" cy="2743200"/>
+            <wp:extent cx="3840480" cy="2668222"/>
             <wp:effectExtent b="0" l="0" r="0" t="0"/>
             <wp:docPr descr="" title="" id="35" name="Picture"/>
             <a:graphic>
@@ -17773,7 +19185,7 @@
                   <pic:spPr bwMode="auto">
                     <a:xfrm>
                       <a:off x="0" y="0"/>
-                      <a:ext cx="3840480" cy="2743200"/>
+                      <a:ext cx="3840480" cy="2820298"/>
                     </a:xfrm>
                     <a:prstGeom prst="rect">
                       <a:avLst/>
@@ -17813,7 +19225,7 @@
     <w:p>
       <w:pPr>
         <w:pStyle w:val="Heading1"/>
-        <w:spacing w:line="360" w:lineRule="auto"/>
+        <w:spacing w:line="448" w:lineRule="exact"/>
       </w:pPr>
       <w:r>
         <w:rPr>
@@ -17827,14 +19239,14 @@
     <w:p>
       <w:pPr>
         <w:pStyle w:val="FirstParagraph"/>
-        <w:spacing w:line="360" w:lineRule="auto"/>
+        <w:spacing w:line="300" w:lineRule="exact"/>
       </w:pPr>
       <w:r>
         <w:rPr>
           <w:color w:val="000000"/>
           <w:sz w:val="20"/>
         </w:rPr>
-        <w:t xml:space="preserve">학습 기반 selector가 uniform 대비 이득을 주지 못한 것은 학습 일반에 대한 결론이 아니라 본 논문의 탐색 구조가 낳은 결과다. 후보 하나의 평가에 수십 </w:t>
+        <w:t xml:space="preserve">학습 기반 선택 정책이 균등 선택 대비 이득을 주지 못한 것은 학습 일반에 대한 결론이 아니라 본 논문의 탐색 구조가 낳은 결과다. 후보 하나의 평가에 수십 </w:t>
       </w:r>
       <w:r>
         <w:rPr>
@@ -17881,7 +19293,7 @@
           <w:color w:val="000000"/>
           <w:sz w:val="20"/>
         </w:rPr>
-        <w:t xml:space="preserve">s밖에 들지 않아 연산자를 잘 고르는 것보다 많이 시도하는 편이 유리하고, 모든 신규 최선해 뒤에 결정론적 descent가 따라붙어 어떤 연산자로 그 지점에 이르렀는지의 차이를 상당 부분 흡수한다. 반복 횟수별 gap 곡선도 대부분의 test 인스턴스에서 해 품질이 1,000회 이전에 평탄해짐을 보인다. SA acceptance와 reheating은 원 모델과 비교할 수 있도록 유지하였으나, ablation은 본 설정에서 이 둘이 해 품질에 필수적이지 않음을 보인다.</w:t>
+        <w:t xml:space="preserve">s밖에 들지 않아 연산자를 잘 고르는 것보다 많이 시도하는 편이 유리하고, 모든 신규 최선해 뒤에 결정론적 descent가 따라붙어 어떤 연산자로 그 지점에 이르렀는지의 차이를 상당 부분 흡수한다. 반복 횟수별 격차 곡선도 대부분의 시험 인스턴스에서 해 품질이 1,000회 이전에 평탄해짐을 보인다. SA acceptance와 reheating은 원 모델과 비교할 수 있도록 유지하였으나, ablation은 본 설정에서 이 둘이 해 품질에 필수적이지 않음을 보인다.</w:t>
       </w:r>
       <w:r>
         <w:rPr>
@@ -17971,7 +19383,7 @@
     <w:p>
       <w:pPr>
         <w:pStyle w:val="BodyText"/>
-        <w:spacing w:line="360" w:lineRule="auto"/>
+        <w:spacing w:line="300" w:lineRule="exact"/>
         <w:ind w:firstLine="216"/>
       </w:pPr>
       <w:r>
@@ -17979,7 +19391,7 @@
           <w:color w:val="000000"/>
           <w:sz w:val="20"/>
         </w:rPr>
-        <w:t xml:space="preserve">selector가 예측할 대상이 마땅치 않다는 점도 작용한다. 본 문제의 인스턴스는 정적이고 모든 release time이 최적화 이전에 알려져 있어, 실행 도중 새로 드러나 정책이 활용할 정보가 없다. 도착 정보가 시간에 따라 공개되는 동적 도크 운영이나 이동 하나의 평가가 비싼 시뮬레이션 기반 모형에서는 판단이 달라질 수 있다. 따라서 본 결과의 함의는 학습이 무용하다는 것이 아니라 비교 조건에 있다. learned selector는 동일한 엔진과 동일한 반복 횟수 아래 uniform sampling과 견주어야 하며, 그 통제가 없으면 descent·restart·강한 연산자 집합의 이득이 정책의 성과로 잘못 귀속될 수 있다.</w:t>
+        <w:t xml:space="preserve">선택 정책이 예측할 대상이 마땅치 않다는 점도 작용한다. 본 문제의 인스턴스는 정적이고 모든 도착 시각이 최적화 이전에 알려져 있어, 실행 도중 새로 드러나 정책이 활용할 정보가 없다. 도착 정보가 시간에 따라 공개되는 동적 도크 운영이나 이동 하나의 평가가 비싼 시뮬레이션 기반 모형에서는 판단이 달라질 수 있다. 따라서 본 결과의 함의는 학습이 무용하다는 것이 아니라 비교 조건에 있다. 학습 기반 선택 정책은 동일한 엔진과 동일한 반복 횟수 아래 균등 선택과 견주어야 하며, 그 통제가 없으면 descent·restart·강한 연산자 집합의 이득이 정책의 성과로 잘못 귀속될 수 있다.</w:t>
       </w:r>
       <w:r>
         <w:rPr>
@@ -18059,7 +19471,7 @@
     <w:p>
       <w:pPr>
         <w:pStyle w:val="Heading1"/>
-        <w:spacing w:line="360" w:lineRule="auto"/>
+        <w:spacing w:line="448" w:lineRule="exact"/>
       </w:pPr>
       <w:r>
         <w:rPr>
@@ -18067,20 +19479,20 @@
           <w:color w:val="000000"/>
           <w:sz w:val="28"/>
         </w:rPr>
-        <w:t xml:space="preserve">8. 결론</w:t>
+        <w:t xml:space="preserve">8. 결 론</w:t>
       </w:r>
     </w:p>
     <w:p>
       <w:pPr>
         <w:pStyle w:val="FirstParagraph"/>
-        <w:spacing w:line="360" w:lineRule="auto"/>
+        <w:spacing w:line="300" w:lineRule="exact"/>
       </w:pPr>
       <w:r>
         <w:rPr>
           <w:color w:val="000000"/>
           <w:sz w:val="20"/>
         </w:rPr>
-        <w:t xml:space="preserve">본 연구는 부분 하역 병행 트럭 스케줄링에 release time과 soft due date를</w:t>
+        <w:t xml:space="preserve">본 연구는 부분 하역 병행 트럭 스케줄링에 도착 시각과 soft due date를</w:t>
       </w:r>
       <w:r>
         <w:rPr>
@@ -18186,7 +19598,7 @@
     <w:p>
       <w:pPr>
         <w:pStyle w:val="Heading1"/>
-        <w:spacing w:line="360" w:lineRule="auto"/>
+        <w:spacing w:line="448" w:lineRule="exact"/>
       </w:pPr>
       <w:r>
         <w:rPr>
@@ -18200,7 +19612,7 @@
     <w:p>
       <w:pPr>
         <w:pStyle w:val="FirstParagraph"/>
-        <w:spacing w:line="360" w:lineRule="auto"/>
+        <w:spacing w:line="300" w:lineRule="exact"/>
       </w:pPr>
       <w:r>
         <w:rPr>
@@ -18509,7 +19921,7 @@
           <w:color w:val="000000"/>
           <w:sz w:val="20"/>
         </w:rPr>
-        <w:t xml:space="preserve">, 갱신 없음)으로 적용한다. 결과가 uniform 대비 개선이 없다는</w:t>
+        <w:t xml:space="preserve">, 갱신 없음)으로 적용한다. 결과가 균등 선택 대비 개선이 없다는</w:t>
       </w:r>
       <w:r>
         <w:rPr>
@@ -18540,7 +19952,7 @@
         </w:rPr>
         <w:drawing>
           <wp:inline>
-            <wp:extent cx="3840480" cy="2606040"/>
+            <wp:extent cx="3840480" cy="2820298"/>
             <wp:effectExtent b="0" l="0" r="0" t="0"/>
             <wp:docPr descr="" title="" id="43" name="Picture"/>
             <a:graphic>
@@ -18561,7 +19973,7 @@
                   <pic:spPr bwMode="auto">
                     <a:xfrm>
                       <a:off x="0" y="0"/>
-                      <a:ext cx="3840480" cy="2606040"/>
+                      <a:ext cx="3840480" cy="2820298"/>
                     </a:xfrm>
                     <a:prstGeom prst="rect">
                       <a:avLst/>
@@ -18600,7 +20012,7 @@
     <w:p>
       <w:pPr>
         <w:pStyle w:val="Heading1"/>
-        <w:spacing w:line="360" w:lineRule="auto"/>
+        <w:spacing w:line="448" w:lineRule="exact"/>
       </w:pPr>
       <w:r>
         <w:rPr>
@@ -18614,7 +20026,7 @@
     <w:p>
       <w:pPr>
         <w:pStyle w:val="FirstParagraph"/>
-        <w:spacing w:line="360" w:lineRule="auto"/>
+        <w:spacing w:line="300" w:lineRule="exact"/>
       </w:pPr>
       <w:r>
         <w:rPr>
@@ -18657,7 +20069,7 @@
     <w:p>
       <w:pPr>
         <w:pStyle w:val="Heading1"/>
-        <w:spacing w:line="360" w:lineRule="auto"/>
+        <w:spacing w:line="448" w:lineRule="exact"/>
       </w:pPr>
       <w:r>
         <w:rPr>
@@ -18671,7 +20083,7 @@
     <w:p>
       <w:pPr>
         <w:pStyle w:val="FirstParagraph"/>
-        <w:spacing w:line="360" w:lineRule="auto"/>
+        <w:spacing w:line="300" w:lineRule="exact"/>
       </w:pPr>
       <w:r>
         <w:rPr>
@@ -18707,7 +20119,7 @@
     <w:p>
       <w:pPr>
         <w:pStyle w:val="BodyText"/>
-        <w:spacing w:line="360" w:lineRule="auto"/>
+        <w:spacing w:line="300" w:lineRule="exact"/>
         <w:ind w:firstLine="216"/>
       </w:pPr>
       <w:r>
@@ -18744,7 +20156,7 @@
     <w:p>
       <w:pPr>
         <w:pStyle w:val="BodyText"/>
-        <w:spacing w:line="360" w:lineRule="auto"/>
+        <w:spacing w:line="300" w:lineRule="exact"/>
         <w:ind w:firstLine="216"/>
       </w:pPr>
       <w:r>
@@ -18781,7 +20193,7 @@
     <w:p>
       <w:pPr>
         <w:pStyle w:val="BodyText"/>
-        <w:spacing w:line="360" w:lineRule="auto"/>
+        <w:spacing w:line="300" w:lineRule="exact"/>
         <w:ind w:firstLine="216"/>
       </w:pPr>
       <w:r>
@@ -18818,7 +20230,7 @@
     <w:p>
       <w:pPr>
         <w:pStyle w:val="BodyText"/>
-        <w:spacing w:line="360" w:lineRule="auto"/>
+        <w:spacing w:line="300" w:lineRule="exact"/>
         <w:ind w:firstLine="216"/>
       </w:pPr>
       <w:r>
@@ -18855,7 +20267,7 @@
     <w:p>
       <w:pPr>
         <w:pStyle w:val="BodyText"/>
-        <w:spacing w:line="360" w:lineRule="auto"/>
+        <w:spacing w:line="300" w:lineRule="exact"/>
         <w:ind w:firstLine="216"/>
       </w:pPr>
       <w:r>
@@ -18892,7 +20304,7 @@
     <w:p>
       <w:pPr>
         <w:pStyle w:val="BodyText"/>
-        <w:spacing w:line="360" w:lineRule="auto"/>
+        <w:spacing w:line="300" w:lineRule="exact"/>
         <w:ind w:firstLine="216"/>
       </w:pPr>
       <w:r>
@@ -18929,7 +20341,7 @@
     <w:p>
       <w:pPr>
         <w:pStyle w:val="BodyText"/>
-        <w:spacing w:line="360" w:lineRule="auto"/>
+        <w:spacing w:line="300" w:lineRule="exact"/>
         <w:ind w:firstLine="216"/>
       </w:pPr>
       <w:r>
@@ -18966,7 +20378,7 @@
     <w:p>
       <w:pPr>
         <w:pStyle w:val="BodyText"/>
-        <w:spacing w:line="360" w:lineRule="auto"/>
+        <w:spacing w:line="300" w:lineRule="exact"/>
         <w:ind w:firstLine="216"/>
       </w:pPr>
       <w:r>
@@ -19003,7 +20415,7 @@
     <w:p>
       <w:pPr>
         <w:pStyle w:val="BodyText"/>
-        <w:spacing w:line="360" w:lineRule="auto"/>
+        <w:spacing w:line="300" w:lineRule="exact"/>
         <w:ind w:firstLine="216"/>
       </w:pPr>
       <w:r>
@@ -19040,7 +20452,7 @@
     <w:p>
       <w:pPr>
         <w:pStyle w:val="BodyText"/>
-        <w:spacing w:line="360" w:lineRule="auto"/>
+        <w:spacing w:line="300" w:lineRule="exact"/>
         <w:ind w:firstLine="216"/>
       </w:pPr>
       <w:r>
@@ -19077,7 +20489,7 @@
     <w:p>
       <w:pPr>
         <w:pStyle w:val="BodyText"/>
-        <w:spacing w:line="360" w:lineRule="auto"/>
+        <w:spacing w:line="300" w:lineRule="exact"/>
         <w:ind w:firstLine="216"/>
       </w:pPr>
       <w:r>
@@ -19114,7 +20526,7 @@
     <w:p>
       <w:pPr>
         <w:pStyle w:val="BodyText"/>
-        <w:spacing w:line="360" w:lineRule="auto"/>
+        <w:spacing w:line="300" w:lineRule="exact"/>
         <w:ind w:firstLine="216"/>
       </w:pPr>
       <w:r>
@@ -19151,7 +20563,7 @@
     <w:p>
       <w:pPr>
         <w:pStyle w:val="BodyText"/>
-        <w:spacing w:line="360" w:lineRule="auto"/>
+        <w:spacing w:line="300" w:lineRule="exact"/>
         <w:ind w:firstLine="216"/>
       </w:pPr>
       <w:r>
@@ -19188,7 +20600,7 @@
     <w:p>
       <w:pPr>
         <w:pStyle w:val="BodyText"/>
-        <w:spacing w:line="360" w:lineRule="auto"/>
+        <w:spacing w:line="300" w:lineRule="exact"/>
         <w:ind w:firstLine="216"/>
       </w:pPr>
       <w:r>
@@ -19225,7 +20637,7 @@
     <w:p>
       <w:pPr>
         <w:pStyle w:val="BodyText"/>
-        <w:spacing w:line="360" w:lineRule="auto"/>
+        <w:spacing w:line="300" w:lineRule="exact"/>
         <w:ind w:firstLine="216"/>
       </w:pPr>
       <w:r>
@@ -19262,7 +20674,7 @@
     <w:p>
       <w:pPr>
         <w:pStyle w:val="BodyText"/>
-        <w:spacing w:line="360" w:lineRule="auto"/>
+        <w:spacing w:line="300" w:lineRule="exact"/>
         <w:ind w:firstLine="216"/>
       </w:pPr>
       <w:r>

</xml_diff>

<commit_message>
feat: 용례 확인 #3
</commit_message>
<xml_diff>
--- a/paper/jkiie_submit_body.docx
+++ b/paper/jkiie_submit_body.docx
@@ -2979,6 +2979,73 @@
         <w:t xml:space="preserve">는 최대 완료 시각이다.</w:t>
       </w:r>
     </w:p>
+    <w:p>
+      <w:pPr>
+        <w:pStyle w:val="CaptionedFigure"/>
+        <w:spacing w:line="240" w:lineRule="auto" w:after="120"/>
+        <w:jc w:val="center"/>
+      </w:pPr>
+      <w:r>
+        <w:rPr>
+          <w:color w:val="000000"/>
+          <w:sz w:val="18"/>
+        </w:rPr>
+        <w:drawing>
+          <wp:inline>
+            <wp:extent cx="5334000" cy="1927094"/>
+            <wp:effectExtent b="0" l="0" r="0" t="0"/>
+            <wp:docPr descr="" title="" id="23" name="Picture"/>
+            <a:graphic>
+              <a:graphicData uri="http://schemas.openxmlformats.org/drawingml/2006/picture">
+                <pic:pic>
+                  <pic:nvPicPr>
+                    <pic:cNvPr descr="fig2_operator_pool.pdf" id="24" name="Picture"/>
+                    <pic:cNvPicPr>
+                      <a:picLocks noChangeArrowheads="1" noChangeAspect="1"/>
+                    </pic:cNvPicPr>
+                  </pic:nvPicPr>
+                  <pic:blipFill>
+                    <a:blip r:embed="rId43"/>
+                    <a:stretch>
+                      <a:fillRect/>
+                    </a:stretch>
+                  </pic:blipFill>
+                  <pic:spPr bwMode="auto">
+                    <a:xfrm>
+                      <a:off x="0" y="0"/>
+                      <a:ext cx="5334000" cy="1927094"/>
+                    </a:xfrm>
+                    <a:prstGeom prst="rect">
+                      <a:avLst/>
+                    </a:prstGeom>
+                    <a:noFill/>
+                    <a:ln w="9525">
+                      <a:noFill/>
+                      <a:headEnd/>
+                      <a:tailEnd/>
+                    </a:ln>
+                  </pic:spPr>
+                </pic:pic>
+              </a:graphicData>
+            </a:graphic>
+          </wp:inline>
+        </w:drawing>
+      </w:r>
+    </w:p>
+    <w:p>
+      <w:pPr>
+        <w:pStyle w:val="ImageCaption"/>
+        <w:spacing w:line="240" w:lineRule="auto" w:after="120"/>
+        <w:jc w:val="center"/>
+      </w:pPr>
+      <w:r>
+        <w:rPr>
+          <w:color w:val="000000"/>
+          <w:sz w:val="18"/>
+        </w:rPr>
+        <w:t xml:space="preserve">Figure 1. Processing timeline of a compound truck and the outbound truck of its retained destination.</w:t>
+      </w:r>
+    </w:p>
     <w:bookmarkEnd w:id="11"/>
     <w:bookmarkStart w:id="12" w:name="mixed-integer-정식화"/>
     <w:p>
@@ -10826,369 +10893,902 @@
           <w:color w:val="000000"/>
           <w:sz w:val="20"/>
         </w:rPr>
-        <w:t xml:space="preserve">상품은 3종이며 트럭</w:t>
-      </w:r>
-      <w:r>
-        <w:rPr>
-          <w:color w:val="000000"/>
-          <w:sz w:val="20"/>
-        </w:rPr>
-        <w:t xml:space="preserve"> </w:t>
+        <w:t xml:space="preserve">나머지 생성 파라미터는 &lt;Table </w:t>
+      </w:r>
+      <w:hyperlink w:anchor="tab:param">
+        <w:r>
+          <w:rPr>
+            <w:color w:val="000000"/>
+            <w:sz w:val="20"/>
+          </w:rPr>
+          <w:t xml:space="preserve">[tab:param]</w:t>
+        </w:r>
+      </w:hyperlink>
+      <w:r>
+        <w:rPr>
+          <w:color w:val="000000"/>
+          <w:sz w:val="20"/>
+        </w:rPr>
+        <w:t xml:space="preserve">&gt;에 정리하였다. 화물이 특정 목적지로</w:t>
+      </w:r>
+      <w:r>
+        <w:rPr>
+          <w:color w:val="000000"/>
+          <w:sz w:val="20"/>
+        </w:rPr>
+        <w:t xml:space="preserve"> </w:t>
+      </w:r>
+      <w:r>
+        <w:rPr>
+          <w:color w:val="000000"/>
+          <w:sz w:val="20"/>
+        </w:rPr>
+        <w:t xml:space="preserve">쏠리는 정도는 이와 별개의 조건이며, 보고하는 모든 실험은 쏠림이 없는 조건을 사용한다(쏠린</w:t>
+      </w:r>
+      <w:r>
+        <w:rPr>
+          <w:color w:val="000000"/>
+          <w:sz w:val="20"/>
+        </w:rPr>
+        <w:t xml:space="preserve"> </w:t>
+      </w:r>
+      <w:r>
+        <w:rPr>
+          <w:color w:val="000000"/>
+          <w:sz w:val="20"/>
+        </w:rPr>
+        <w:t xml:space="preserve">조건과 군집 조건은 부록 A의 transfer DQN 학습에만 쓴다). 도어를 일렬로 늘어놓으면</w:t>
+      </w:r>
+      <w:r>
+        <w:rPr>
+          <w:color w:val="000000"/>
+          <w:sz w:val="20"/>
+        </w:rPr>
+        <w:t xml:space="preserve"> </w:t>
+      </w:r>
+      <w:r>
+        <w:rPr>
+          <w:color w:val="000000"/>
+          <w:sz w:val="20"/>
+        </w:rPr>
+        <w:t xml:space="preserve">이송시간이 도어 번호 차이로 정해져 도어 배정이 해에 미치는 영향이 작아지므로, 배정</w:t>
+      </w:r>
+      <w:r>
+        <w:rPr>
+          <w:color w:val="000000"/>
+          <w:sz w:val="20"/>
+        </w:rPr>
+        <w:t xml:space="preserve"> </w:t>
+      </w:r>
+      <w:r>
+        <w:rPr>
+          <w:color w:val="000000"/>
+          <w:sz w:val="20"/>
+        </w:rPr>
+        <w:t xml:space="preserve">결정이 실제로 품질을 가르도록 무작위 배치를 쓴다. 이송 거리를 10으로 나누는 것은</w:t>
+      </w:r>
+      <w:r>
+        <w:rPr>
+          <w:color w:val="000000"/>
+          <w:sz w:val="20"/>
+        </w:rPr>
+        <w:t xml:space="preserve"> </w:t>
+      </w:r>
+      <w:r>
+        <w:rPr>
+          <w:color w:val="000000"/>
+          <w:sz w:val="20"/>
+        </w:rPr>
+        <w:t xml:space="preserve">이송시간을 처리시간과 같은 크기 범위에 두기 위해서다.</w:t>
+      </w:r>
+    </w:p>
+    <w:tbl>
+      <w:tblPr>
+        <w:tblStyle w:val="Table"/>
+        <w:tblW w:type="auto" w:w="0"/>
+        <w:tblLook w:firstRow="1" w:lastRow="0" w:firstColumn="0" w:lastColumn="0" w:noHBand="0" w:noVBand="0" w:val="0020"/>
+        <w:tblCaption w:val="Table 1. Structural comparison of the base SA-RL5 and VAA-GILS."/>
+        <w:tblLayout w:type="fixed"/>
+        <w:tblBorders>
+          <w:top w:val="single" w:sz="8" w:space="0" w:color="000000"/>
+          <w:bottom w:val="single" w:sz="8" w:space="0" w:color="000000"/>
+          <w:left w:val="none" w:sz="0" w:space="0" w:color="000000"/>
+          <w:right w:val="none" w:sz="0" w:space="0" w:color="000000"/>
+          <w:insideH w:val="none" w:sz="0" w:space="0" w:color="000000"/>
+          <w:insideV w:val="none" w:sz="0" w:space="0" w:color="000000"/>
+        </w:tblBorders>
+      </w:tblPr>
+      <w:tblGrid>
+        <w:gridCol w:w="2448"/>
+        <w:gridCol w:w="3311"/>
+        <w:gridCol w:w="3311"/>
+      </w:tblGrid>
+      <w:tr>
+        <w:trPr>
+          <w:tblHeader w:val="on"/>
+        </w:trPr>
+        <w:tc>
+          <w:tcPr>
+            <w:tcW w:type="dxa" w:w="2448"/>
+            <w:tcBorders>
+              <w:bottom w:val="single" w:sz="6" w:space="0" w:color="000000"/>
+            </w:tcBorders>
+          </w:tcPr>
+          <w:p>
+            <w:pPr>
+              <w:pStyle w:val="Compact"/>
+              <w:spacing w:line="240" w:lineRule="auto" w:after="0"/>
+              <w:jc w:val="left"/>
+            </w:pPr>
+            <w:r>
+              <w:rPr>
+                <w:color w:val="000000"/>
+                <w:sz w:val="18"/>
+              </w:rPr>
+              <w:t xml:space="preserve">Item</w:t>
+            </w:r>
+          </w:p>
+        </w:tc>
+        <w:tc>
+          <w:tcPr>
+            <w:tcW w:type="dxa" w:w="3312"/>
+            <w:tcBorders>
+              <w:bottom w:val="single" w:sz="6" w:space="0" w:color="000000"/>
+            </w:tcBorders>
+          </w:tcPr>
+          <w:p>
+            <w:pPr>
+              <w:pStyle w:val="Compact"/>
+              <w:spacing w:line="240" w:lineRule="auto" w:after="0"/>
+              <w:jc w:val="left"/>
+            </w:pPr>
+            <w:r>
+              <w:rPr>
+                <w:color w:val="000000"/>
+                <w:sz w:val="18"/>
+              </w:rPr>
+              <w:t xml:space="preserve">Symbol</w:t>
+            </w:r>
+          </w:p>
+        </w:tc>
+        <w:tc>
+          <w:tcPr>
+            <w:tcW w:type="dxa" w:w="3312"/>
+            <w:tcBorders>
+              <w:bottom w:val="single" w:sz="6" w:space="0" w:color="000000"/>
+            </w:tcBorders>
+          </w:tcPr>
+          <w:p>
+            <w:pPr>
+              <w:pStyle w:val="Compact"/>
+              <w:spacing w:line="240" w:lineRule="auto" w:after="0"/>
+              <w:jc w:val="left"/>
+            </w:pPr>
+            <w:r>
+              <w:rPr>
+                <w:color w:val="000000"/>
+                <w:sz w:val="18"/>
+              </w:rPr>
+              <w:t xml:space="preserve">Value</w:t>
+            </w:r>
+          </w:p>
+        </w:tc>
+      </w:tr>
+      <w:tr>
+        <w:tc>
+          <w:tcPr>
+            <w:tcW w:type="dxa" w:w="2448"/>
+          </w:tcPr>
+          <w:p>
+            <w:pPr>
+              <w:pStyle w:val="Compact"/>
+              <w:spacing w:line="240" w:lineRule="auto" w:after="0"/>
+              <w:jc w:val="left"/>
+            </w:pPr>
+            <w:r>
+              <w:rPr>
+                <w:color w:val="000000"/>
+                <w:sz w:val="18"/>
+              </w:rPr>
+              <w:t xml:space="preserve">Size (compound/outbound/destination/door)</w:t>
+            </w:r>
+          </w:p>
+        </w:tc>
+        <w:tc>
+          <w:tcPr>
+            <w:tcW w:type="dxa" w:w="3312"/>
+          </w:tcPr>
+          <w:p>
+            <w:pPr>
+              <w:pStyle w:val="Compact"/>
+              <w:spacing w:line="240" w:lineRule="auto" w:after="0"/>
+              <w:jc w:val="left"/>
+            </w:pPr>
+            <w:r>
+              <w:rPr>
+                <w:color w:val="000000"/>
+                <w:sz w:val="18"/>
+              </w:rPr>
+              <w:t xml:space="preserve">(|I|,|F|,|D|,|M|)</w:t>
+            </w:r>
+          </w:p>
+        </w:tc>
+        <w:tc>
+          <w:tcPr>
+            <w:tcW w:type="dxa" w:w="3312"/>
+          </w:tcPr>
+          <w:p>
+            <w:pPr>
+              <w:pStyle w:val="Compact"/>
+              <w:spacing w:line="240" w:lineRule="auto" w:after="0"/>
+              <w:jc w:val="left"/>
+            </w:pPr>
+            <w:r>
+              <w:rPr>
+                <w:color w:val="000000"/>
+                <w:sz w:val="18"/>
+              </w:rPr>
+              <w:t xml:space="preserve">S (6,3,9,6); M (12,6,18,12); L (20,10,30,20)</w:t>
+            </w:r>
+          </w:p>
+        </w:tc>
+      </w:tr>
+      <w:tr>
+        <w:tc>
+          <w:tcPr>
+            <w:tcW w:type="dxa" w:w="2448"/>
+          </w:tcPr>
+          <w:p>
+            <w:pPr>
+              <w:pStyle w:val="Compact"/>
+              <w:spacing w:line="240" w:lineRule="auto" w:after="0"/>
+              <w:jc w:val="left"/>
+            </w:pPr>
+            <w:r>
+              <w:rPr>
+                <w:color w:val="000000"/>
+                <w:sz w:val="18"/>
+              </w:rPr>
+              <w:t xml:space="preserve">Compound-truck ratio</w:t>
+            </w:r>
+          </w:p>
+        </w:tc>
+        <w:tc>
+          <w:tcPr>
+            <w:tcW w:type="dxa" w:w="3312"/>
+          </w:tcPr>
+          <w:p>
+            <w:pPr>
+              <w:pStyle w:val="Compact"/>
+              <w:spacing w:line="240" w:lineRule="auto" w:after="0"/>
+              <w:jc w:val="left"/>
+            </w:pPr>
+            <w:r>
+              <w:rPr>
+                <w:color w:val="000000"/>
+                <w:sz w:val="18"/>
+              </w:rPr>
+              <w:t xml:space="preserve">|I|/|D|</w:t>
+            </w:r>
+          </w:p>
+        </w:tc>
+        <w:tc>
+          <w:tcPr>
+            <w:tcW w:type="dxa" w:w="3312"/>
+          </w:tcPr>
+          <w:p>
+            <w:pPr>
+              <w:pStyle w:val="Compact"/>
+              <w:spacing w:line="240" w:lineRule="auto" w:after="0"/>
+              <w:jc w:val="left"/>
+            </w:pPr>
+            <w:r>
+              <w:rPr>
+                <w:color w:val="000000"/>
+                <w:sz w:val="18"/>
+              </w:rPr>
+              <w:t xml:space="preserve">2/3</w:t>
+            </w:r>
+          </w:p>
+        </w:tc>
+      </w:tr>
+      <w:tr>
+        <w:tc>
+          <w:tcPr>
+            <w:tcW w:type="dxa" w:w="2448"/>
+          </w:tcPr>
+          <w:p>
+            <w:pPr>
+              <w:pStyle w:val="Compact"/>
+              <w:spacing w:line="240" w:lineRule="auto" w:after="0"/>
+              <w:jc w:val="left"/>
+            </w:pPr>
+            <w:r>
+              <w:rPr>
+                <w:color w:val="000000"/>
+                <w:sz w:val="18"/>
+              </w:rPr>
+              <w:t xml:space="preserve">Number of product types</w:t>
+            </w:r>
+          </w:p>
+        </w:tc>
+        <w:tc>
+          <w:tcPr>
+            <w:tcW w:type="dxa" w:w="3312"/>
+          </w:tcPr>
+          <w:p>
+            <w:pPr>
+              <w:pStyle w:val="Compact"/>
+              <w:spacing w:line="240" w:lineRule="auto" w:after="0"/>
+              <w:jc w:val="left"/>
+            </w:pPr>
+            <w:r>
+              <w:rPr>
+                <w:color w:val="000000"/>
+                <w:sz w:val="18"/>
+              </w:rPr>
+              <w:t xml:space="preserve">|K|</w:t>
+            </w:r>
+          </w:p>
+        </w:tc>
+        <w:tc>
+          <w:tcPr>
+            <w:tcW w:type="dxa" w:w="3312"/>
+          </w:tcPr>
+          <w:p>
+            <w:pPr>
+              <w:pStyle w:val="Compact"/>
+              <w:spacing w:line="240" w:lineRule="auto" w:after="0"/>
+              <w:jc w:val="left"/>
+            </w:pPr>
+            <w:r>
+              <w:rPr>
+                <w:color w:val="000000"/>
+                <w:sz w:val="18"/>
+              </w:rPr>
+              <w:t xml:space="preserve">3</w:t>
+            </w:r>
+          </w:p>
+        </w:tc>
+      </w:tr>
+      <w:tr>
+        <w:tc>
+          <w:tcPr>
+            <w:tcW w:type="dxa" w:w="2448"/>
+          </w:tcPr>
+          <w:p>
+            <w:pPr>
+              <w:pStyle w:val="Compact"/>
+              <w:spacing w:line="240" w:lineRule="auto" w:after="0"/>
+              <w:jc w:val="left"/>
+            </w:pPr>
+            <w:r>
+              <w:rPr>
+                <w:color w:val="000000"/>
+                <w:sz w:val="18"/>
+              </w:rPr>
+              <w:t xml:space="preserve">Flow</w:t>
+            </w:r>
+          </w:p>
+        </w:tc>
+        <w:tc>
+          <w:tcPr>
+            <w:tcW w:type="dxa" w:w="3312"/>
+          </w:tcPr>
+          <w:p>
+            <w:pPr>
+              <w:pStyle w:val="Compact"/>
+              <w:spacing w:line="240" w:lineRule="auto" w:after="0"/>
+              <w:jc w:val="left"/>
+            </w:pPr>
+            <w:r>
+              <w:rPr>
+                <w:color w:val="000000"/>
+                <w:sz w:val="18"/>
+              </w:rPr>
+              <w:t xml:space="preserve">f_idk</w:t>
+            </w:r>
+          </w:p>
+        </w:tc>
+        <w:tc>
+          <w:tcPr>
+            <w:tcW w:type="dxa" w:w="3312"/>
+          </w:tcPr>
+          <w:p>
+            <w:pPr>
+              <w:pStyle w:val="Compact"/>
+              <w:spacing w:line="240" w:lineRule="auto" w:after="0"/>
+              <w:jc w:val="left"/>
+            </w:pPr>
+            <w:r>
+              <w:rPr>
+                <w:color w:val="000000"/>
+                <w:sz w:val="18"/>
+              </w:rPr>
+              <w:t xml:space="preserve">U[0,20]</w:t>
+            </w:r>
+          </w:p>
+        </w:tc>
+      </w:tr>
+      <w:tr>
+        <w:tc>
+          <w:tcPr>
+            <w:tcW w:type="dxa" w:w="2448"/>
+          </w:tcPr>
+          <w:p>
+            <w:pPr>
+              <w:pStyle w:val="Compact"/>
+              <w:spacing w:line="240" w:lineRule="auto" w:after="0"/>
+              <w:jc w:val="left"/>
+            </w:pPr>
+            <w:r>
+              <w:rPr>
+                <w:color w:val="000000"/>
+                <w:sz w:val="18"/>
+              </w:rPr>
+              <w:t xml:space="preserve">Unit handling time</w:t>
+            </w:r>
+          </w:p>
+        </w:tc>
+        <w:tc>
+          <w:tcPr>
+            <w:tcW w:type="dxa" w:w="3312"/>
+          </w:tcPr>
+          <w:p>
+            <w:pPr>
+              <w:pStyle w:val="Compact"/>
+              <w:spacing w:line="240" w:lineRule="auto" w:after="0"/>
+              <w:jc w:val="left"/>
+            </w:pPr>
+            <w:r>
+              <w:rPr>
+                <w:color w:val="000000"/>
+                <w:sz w:val="18"/>
+              </w:rPr>
+              <w:t xml:space="preserve">t_k</w:t>
+            </w:r>
+          </w:p>
+        </w:tc>
+        <w:tc>
+          <w:tcPr>
+            <w:tcW w:type="dxa" w:w="3312"/>
+          </w:tcPr>
+          <w:p>
+            <w:pPr>
+              <w:pStyle w:val="Compact"/>
+              <w:spacing w:line="240" w:lineRule="auto" w:after="0"/>
+              <w:jc w:val="left"/>
+            </w:pPr>
+            <w:r>
+              <w:rPr>
+                <w:color w:val="000000"/>
+                <w:sz w:val="18"/>
+              </w:rPr>
+              <w:t xml:space="preserve">U[1,4]</w:t>
+            </w:r>
+          </w:p>
+        </w:tc>
+      </w:tr>
+      <w:tr>
+        <w:tc>
+          <w:tcPr>
+            <w:tcW w:type="dxa" w:w="2448"/>
+          </w:tcPr>
+          <w:p>
+            <w:pPr>
+              <w:pStyle w:val="Compact"/>
+              <w:spacing w:line="240" w:lineRule="auto" w:after="0"/>
+              <w:jc w:val="left"/>
+            </w:pPr>
+            <w:r>
+              <w:rPr>
+                <w:color w:val="000000"/>
+                <w:sz w:val="18"/>
+              </w:rPr>
+              <w:t xml:space="preserve">Enter/leave time</w:t>
+            </w:r>
+          </w:p>
+        </w:tc>
+        <w:tc>
+          <w:tcPr>
+            <w:tcW w:type="dxa" w:w="3312"/>
+          </w:tcPr>
+          <w:p>
+            <w:pPr>
+              <w:pStyle w:val="Compact"/>
+              <w:spacing w:line="240" w:lineRule="auto" w:after="0"/>
+              <w:jc w:val="left"/>
+            </w:pPr>
+            <w:r>
+              <w:rPr>
+                <w:color w:val="000000"/>
+                <w:sz w:val="18"/>
+              </w:rPr>
+              <w:t xml:space="preserve">DE_q, DL_q</w:t>
+            </w:r>
+          </w:p>
+        </w:tc>
+        <w:tc>
+          <w:tcPr>
+            <w:tcW w:type="dxa" w:w="3312"/>
+          </w:tcPr>
+          <w:p>
+            <w:pPr>
+              <w:pStyle w:val="Compact"/>
+              <w:spacing w:line="240" w:lineRule="auto" w:after="0"/>
+              <w:jc w:val="left"/>
+            </w:pPr>
+            <w:r>
+              <w:rPr>
+                <w:color w:val="000000"/>
+                <w:sz w:val="18"/>
+              </w:rPr>
+              <w:t xml:space="preserve">U[1,5]</w:t>
+            </w:r>
+          </w:p>
+        </w:tc>
+      </w:tr>
+      <w:tr>
+        <w:tc>
+          <w:tcPr>
+            <w:tcW w:type="dxa" w:w="2448"/>
+          </w:tcPr>
+          <w:p>
+            <w:pPr>
+              <w:pStyle w:val="Compact"/>
+              <w:spacing w:line="240" w:lineRule="auto" w:after="0"/>
+              <w:jc w:val="left"/>
+            </w:pPr>
+            <w:r>
+              <w:rPr>
+                <w:color w:val="000000"/>
+                <w:sz w:val="18"/>
+              </w:rPr>
+              <w:t xml:space="preserve">Door coordinates</w:t>
+            </w:r>
+          </w:p>
+        </w:tc>
+        <w:tc>
+          <w:tcPr>
+            <w:tcW w:type="dxa" w:w="3312"/>
+          </w:tcPr>
+          <w:p>
+            <w:pPr>
+              <w:pStyle w:val="Compact"/>
+              <w:spacing w:line="240" w:lineRule="auto" w:after="0"/>
+              <w:jc w:val="left"/>
+            </w:pPr>
+            <w:r>
+              <w:rPr>
+                <w:color w:val="000000"/>
+                <w:sz w:val="18"/>
+              </w:rPr>
+              <w:t xml:space="preserve">—</w:t>
+            </w:r>
+          </w:p>
+        </w:tc>
+        <w:tc>
+          <w:tcPr>
+            <w:tcW w:type="dxa" w:w="3312"/>
+          </w:tcPr>
+          <w:p>
+            <w:pPr>
+              <w:pStyle w:val="Compact"/>
+              <w:spacing w:line="240" w:lineRule="auto" w:after="0"/>
+              <w:jc w:val="left"/>
+            </w:pPr>
+            <w:r>
+              <w:rPr>
+                <w:color w:val="000000"/>
+                <w:sz w:val="18"/>
+              </w:rPr>
+              <w:t xml:space="preserve">uniform on [0,100]²</w:t>
+            </w:r>
+          </w:p>
+        </w:tc>
+      </w:tr>
+      <w:tr>
+        <w:tc>
+          <w:tcPr>
+            <w:tcW w:type="dxa" w:w="2448"/>
+          </w:tcPr>
+          <w:p>
+            <w:pPr>
+              <w:pStyle w:val="Compact"/>
+              <w:spacing w:line="240" w:lineRule="auto" w:after="0"/>
+              <w:jc w:val="left"/>
+            </w:pPr>
+            <w:r>
+              <w:rPr>
+                <w:color w:val="000000"/>
+                <w:sz w:val="18"/>
+              </w:rPr>
+              <w:t xml:space="preserve">Inter-door travel time</w:t>
+            </w:r>
+          </w:p>
+        </w:tc>
+        <w:tc>
+          <w:tcPr>
+            <w:tcW w:type="dxa" w:w="3312"/>
+          </w:tcPr>
+          <w:p>
+            <w:pPr>
+              <w:pStyle w:val="Compact"/>
+              <w:spacing w:line="240" w:lineRule="auto" w:after="0"/>
+              <w:jc w:val="left"/>
+            </w:pPr>
+            <w:r>
+              <w:rPr>
+                <w:color w:val="000000"/>
+                <w:sz w:val="18"/>
+              </w:rPr>
+              <w:t xml:space="preserve">t_mn</w:t>
+            </w:r>
+          </w:p>
+        </w:tc>
+        <w:tc>
+          <w:tcPr>
+            <w:tcW w:type="dxa" w:w="3312"/>
+          </w:tcPr>
+          <w:p>
+            <w:pPr>
+              <w:pStyle w:val="Compact"/>
+              <w:spacing w:line="240" w:lineRule="auto" w:after="0"/>
+              <w:jc w:val="left"/>
+            </w:pPr>
+            <w:r>
+              <w:rPr>
+                <w:color w:val="000000"/>
+                <w:sz w:val="18"/>
+              </w:rPr>
+              <w:t xml:space="preserve">Euclidean distance / 10</w:t>
+            </w:r>
+          </w:p>
+        </w:tc>
+      </w:tr>
+      <w:tr>
+        <w:tc>
+          <w:tcPr>
+            <w:tcW w:type="dxa" w:w="2448"/>
+          </w:tcPr>
+          <w:p>
+            <w:pPr>
+              <w:pStyle w:val="Compact"/>
+              <w:spacing w:line="240" w:lineRule="auto" w:after="0"/>
+              <w:jc w:val="left"/>
+            </w:pPr>
+            <w:r>
+              <w:rPr>
+                <w:color w:val="000000"/>
+                <w:sz w:val="18"/>
+              </w:rPr>
+              <w:t xml:space="preserve">Release time</w:t>
+            </w:r>
+          </w:p>
+        </w:tc>
+        <w:tc>
+          <w:tcPr>
+            <w:tcW w:type="dxa" w:w="3312"/>
+          </w:tcPr>
+          <w:p>
+            <w:pPr>
+              <w:pStyle w:val="Compact"/>
+              <w:spacing w:line="240" w:lineRule="auto" w:after="0"/>
+              <w:jc w:val="left"/>
+            </w:pPr>
+            <w:r>
+              <w:rPr>
+                <w:color w:val="000000"/>
+                <w:sz w:val="18"/>
+              </w:rPr>
+              <w:t xml:space="preserve">r_q</w:t>
+            </w:r>
+          </w:p>
+        </w:tc>
+        <w:tc>
+          <w:tcPr>
+            <w:tcW w:type="dxa" w:w="3312"/>
+          </w:tcPr>
+          <w:p>
+            <w:pPr>
+              <w:pStyle w:val="Compact"/>
+              <w:spacing w:line="240" w:lineRule="auto" w:after="0"/>
+              <w:jc w:val="left"/>
+            </w:pPr>
+            <w:r>
+              <w:rPr>
+                <w:color w:val="000000"/>
+                <w:sz w:val="18"/>
+              </w:rPr>
+              <w:t xml:space="preserve">none: 0; otherwise U[0,ρH]</w:t>
+            </w:r>
+          </w:p>
+        </w:tc>
+      </w:tr>
+      <w:tr>
+        <w:tc>
+          <w:tcPr>
+            <w:tcW w:type="dxa" w:w="2448"/>
+          </w:tcPr>
+          <w:p>
+            <w:pPr>
+              <w:pStyle w:val="Compact"/>
+              <w:spacing w:line="240" w:lineRule="auto" w:after="0"/>
+              <w:jc w:val="left"/>
+            </w:pPr>
+            <w:r>
+              <w:rPr>
+                <w:color w:val="000000"/>
+                <w:sz w:val="18"/>
+              </w:rPr>
+              <w:t xml:space="preserve">Soft due date</w:t>
+            </w:r>
+          </w:p>
+        </w:tc>
+        <w:tc>
+          <w:tcPr>
+            <w:tcW w:type="dxa" w:w="3312"/>
+          </w:tcPr>
+          <w:p>
+            <w:pPr>
+              <w:pStyle w:val="Compact"/>
+              <w:spacing w:line="240" w:lineRule="auto" w:after="0"/>
+              <w:jc w:val="left"/>
+            </w:pPr>
+            <w:r>
+              <w:rPr>
+                <w:color w:val="000000"/>
+                <w:sz w:val="18"/>
+              </w:rPr>
+              <w:t xml:space="preserve">d̄_q</w:t>
+            </w:r>
+          </w:p>
+        </w:tc>
+        <w:tc>
+          <w:tcPr>
+            <w:tcW w:type="dxa" w:w="3312"/>
+          </w:tcPr>
+          <w:p>
+            <w:pPr>
+              <w:pStyle w:val="Compact"/>
+              <w:spacing w:line="240" w:lineRule="auto" w:after="0"/>
+              <w:jc w:val="left"/>
+            </w:pPr>
+            <w:r>
+              <w:rPr>
+                <w:color w:val="000000"/>
+                <w:sz w:val="18"/>
+              </w:rPr>
+              <w:t xml:space="preserve">none: ∞; otherwise r_q + δH</w:t>
+            </w:r>
+          </w:p>
+        </w:tc>
+      </w:tr>
+      <w:tr>
+        <w:tc>
+          <w:tcPr>
+            <w:tcW w:type="dxa" w:w="2448"/>
+          </w:tcPr>
+          <w:p>
+            <w:pPr>
+              <w:pStyle w:val="Compact"/>
+              <w:spacing w:line="240" w:lineRule="auto" w:after="0"/>
+              <w:jc w:val="left"/>
+            </w:pPr>
+            <w:r>
+              <w:rPr>
+                <w:color w:val="000000"/>
+                <w:sz w:val="18"/>
+              </w:rPr>
+              <w:t xml:space="preserve">Time-constraint level</w:t>
+            </w:r>
+          </w:p>
+        </w:tc>
+        <w:tc>
+          <w:tcPr>
+            <w:tcW w:type="dxa" w:w="3312"/>
+          </w:tcPr>
+          <w:p>
+            <w:pPr>
+              <w:pStyle w:val="Compact"/>
+              <w:spacing w:line="240" w:lineRule="auto" w:after="0"/>
+              <w:jc w:val="left"/>
+            </w:pPr>
+            <w:r>
+              <w:rPr>
+                <w:color w:val="000000"/>
+                <w:sz w:val="18"/>
+              </w:rPr>
+              <w:t xml:space="preserve">(ρ,δ)</w:t>
+            </w:r>
+          </w:p>
+        </w:tc>
+        <w:tc>
+          <w:tcPr>
+            <w:tcW w:type="dxa" w:w="3312"/>
+          </w:tcPr>
+          <w:p>
+            <w:pPr>
+              <w:pStyle w:val="Compact"/>
+              <w:spacing w:line="240" w:lineRule="auto" w:after="0"/>
+              <w:jc w:val="left"/>
+            </w:pPr>
+            <w:r>
+              <w:rPr>
+                <w:color w:val="000000"/>
+                <w:sz w:val="18"/>
+              </w:rPr>
+              <w:t xml:space="preserve">medium (0.25,0.60); tight (0.50,0.35)</w:t>
+            </w:r>
+          </w:p>
+        </w:tc>
+      </w:tr>
+    </w:tbl>
+    <w:p>
+      <w:pPr>
+        <w:pStyle w:val="TableCaption"/>
+        <w:spacing w:line="240" w:lineRule="auto" w:after="120"/>
+        <w:jc w:val="center"/>
+      </w:pPr>
+      <w:r>
+        <w:rPr>
+          <w:color w:val="000000"/>
+          <w:sz w:val="18"/>
+        </w:rPr>
+        <w:t xml:space="preserve">Table 2. Instance generation parameters. Flow, handling and enter/leave times are drawn from integer uniform distributions.</w:t>
+      </w:r>
+      <w:r>
+        <w:rPr>
+          <w:color w:val="000000"/>
+          <w:sz w:val="18"/>
+        </w:rPr>
+        <w:t xml:space="preserve"/>
       </w:r>
       <m:oMath>
-        <m:r>
-          <m:t>q</m:t>
-        </m:r>
         <m:r>
           <m:rPr>
             <m:sty m:val="p"/>
           </m:rPr>
-          <m:t>∈</m:t>
-        </m:r>
-        <m:r>
-          <m:t>I</m:t>
-        </m:r>
-        <m:r>
-          <m:rPr>
-            <m:sty m:val="p"/>
-          </m:rPr>
-          <m:t>∪</m:t>
-        </m:r>
-        <m:r>
-          <m:t>F</m:t>
+          <m:t>×</m:t>
         </m:r>
       </m:oMath>
       <w:r>
         <w:rPr>
           <w:color w:val="000000"/>
-          <w:sz w:val="20"/>
-        </w:rPr>
-        <w:t xml:space="preserve">에 대해</w:t>
-      </w:r>
-      <w:r>
-        <w:rPr>
-          <w:color w:val="000000"/>
-          <w:sz w:val="20"/>
-        </w:rPr>
-        <w:t xml:space="preserve"> </w:t>
+          <w:sz w:val="18"/>
+        </w:rPr>
+        <w:t xml:space="preserve"/>
+      </w:r>
+      <w:r>
+        <w:rPr>
+          <w:color w:val="000000"/>
+          <w:sz w:val="18"/>
+        </w:rPr>
+        <w:t xml:space="preserve"/>
+      </w:r>
+      <w:r>
+        <w:rPr>
+          <w:color w:val="000000"/>
+          <w:sz w:val="18"/>
+        </w:rPr>
+        <w:t xml:space="preserve"/>
       </w:r>
       <m:oMath>
         <m:sSub>
-          <m:e>
-            <m:r>
-              <m:t>f</m:t>
-            </m:r>
-          </m:e>
-          <m:sub>
-            <m:r>
-              <m:t>i</m:t>
-            </m:r>
-            <m:r>
-              <m:t>d</m:t>
-            </m:r>
-            <m:r>
-              <m:t>k</m:t>
-            </m:r>
-          </m:sub>
-        </m:sSub>
-        <m:r>
-          <m:rPr>
-            <m:sty m:val="p"/>
-          </m:rPr>
-          <m:t>∼</m:t>
-        </m:r>
-        <m:r>
-          <m:t>U</m:t>
-        </m:r>
-        <m:r>
-          <m:rPr>
-            <m:sty m:val="p"/>
-          </m:rPr>
-          <m:t>[</m:t>
-        </m:r>
-        <m:r>
-          <m:t>0</m:t>
-        </m:r>
-        <m:r>
-          <m:rPr>
-            <m:sty m:val="p"/>
-          </m:rPr>
-          <m:t>,</m:t>
-        </m:r>
-        <m:r>
-          <m:t>20</m:t>
-        </m:r>
-        <m:r>
-          <m:rPr>
-            <m:sty m:val="p"/>
-          </m:rPr>
-          <m:t>]</m:t>
-        </m:r>
-      </m:oMath>
-      <w:r>
-        <w:rPr>
-          <w:color w:val="000000"/>
-          <w:sz w:val="20"/>
-        </w:rPr>
-        <w:t xml:space="preserve">,</w:t>
-      </w:r>
-      <w:r>
-        <w:rPr>
-          <w:color w:val="000000"/>
-          <w:sz w:val="20"/>
-        </w:rPr>
-        <w:t xml:space="preserve"> </w:t>
-      </w:r>
-      <m:oMath>
-        <m:sSub>
-          <m:e>
-            <m:r>
-              <m:t>t</m:t>
-            </m:r>
-          </m:e>
-          <m:sub>
-            <m:r>
-              <m:t>k</m:t>
-            </m:r>
-          </m:sub>
-        </m:sSub>
-        <m:r>
-          <m:rPr>
-            <m:sty m:val="p"/>
-          </m:rPr>
-          <m:t>∼</m:t>
-        </m:r>
-        <m:r>
-          <m:t>U</m:t>
-        </m:r>
-        <m:r>
-          <m:rPr>
-            <m:sty m:val="p"/>
-          </m:rPr>
-          <m:t>[</m:t>
-        </m:r>
-        <m:r>
-          <m:t>1</m:t>
-        </m:r>
-        <m:r>
-          <m:rPr>
-            <m:sty m:val="p"/>
-          </m:rPr>
-          <m:t>,</m:t>
-        </m:r>
-        <m:r>
-          <m:t>4</m:t>
-        </m:r>
-        <m:r>
-          <m:rPr>
-            <m:sty m:val="p"/>
-          </m:rPr>
-          <m:t>]</m:t>
-        </m:r>
-      </m:oMath>
-      <w:r>
-        <w:rPr>
-          <w:color w:val="000000"/>
-          <w:sz w:val="20"/>
-        </w:rPr>
-        <w:t xml:space="preserve">,</w:t>
-      </w:r>
-      <w:r>
-        <w:rPr>
-          <w:color w:val="000000"/>
-          <w:sz w:val="20"/>
-        </w:rPr>
-        <w:t xml:space="preserve"> </w:t>
-      </w:r>
-      <m:oMath>
-        <m:r>
-          <m:t>D</m:t>
-        </m:r>
-        <m:sSub>
-          <m:e>
-            <m:r>
-              <m:t>E</m:t>
-            </m:r>
-          </m:e>
-          <m:sub>
-            <m:r>
-              <m:t>q</m:t>
-            </m:r>
-          </m:sub>
-        </m:sSub>
-        <m:r>
-          <m:rPr>
-            <m:sty m:val="p"/>
-          </m:rPr>
-          <m:t>,</m:t>
-        </m:r>
-        <m:r>
-          <m:t>D</m:t>
-        </m:r>
-        <m:sSub>
-          <m:e>
-            <m:r>
-              <m:t>L</m:t>
-            </m:r>
-          </m:e>
-          <m:sub>
-            <m:r>
-              <m:t>q</m:t>
-            </m:r>
-          </m:sub>
-        </m:sSub>
-        <m:r>
-          <m:rPr>
-            <m:sty m:val="p"/>
-          </m:rPr>
-          <m:t>∼</m:t>
-        </m:r>
-        <m:r>
-          <m:t>U</m:t>
-        </m:r>
-        <m:r>
-          <m:rPr>
-            <m:sty m:val="p"/>
-          </m:rPr>
-          <m:t>[</m:t>
-        </m:r>
-        <m:r>
-          <m:t>1</m:t>
-        </m:r>
-        <m:r>
-          <m:rPr>
-            <m:sty m:val="p"/>
-          </m:rPr>
-          <m:t>,</m:t>
-        </m:r>
-        <m:r>
-          <m:t>5</m:t>
-        </m:r>
-        <m:r>
-          <m:rPr>
-            <m:sty m:val="p"/>
-          </m:rPr>
-          <m:t>]</m:t>
-        </m:r>
-      </m:oMath>
-      <w:r>
-        <w:rPr>
-          <w:color w:val="000000"/>
-          <w:sz w:val="20"/>
-        </w:rPr>
-        <w:t xml:space="preserve">로 모두 정수 균등분포에서 뽑는다. 화물이 특정 목적지로 쏠리는</w:t>
-      </w:r>
-      <w:r>
-        <w:rPr>
-          <w:color w:val="000000"/>
-          <w:sz w:val="20"/>
-        </w:rPr>
-        <w:t xml:space="preserve"> </w:t>
-      </w:r>
-      <w:r>
-        <w:rPr>
-          <w:color w:val="000000"/>
-          <w:sz w:val="20"/>
-        </w:rPr>
-        <w:t xml:space="preserve">정도는 이와 별개의 조건이며, 보고하는 모든 실험은 쏠림이 없는 조건을 사용한다(쏠린</w:t>
-      </w:r>
-      <w:r>
-        <w:rPr>
-          <w:color w:val="000000"/>
-          <w:sz w:val="20"/>
-        </w:rPr>
-        <w:t xml:space="preserve"> </w:t>
-      </w:r>
-      <w:r>
-        <w:rPr>
-          <w:color w:val="000000"/>
-          <w:sz w:val="20"/>
-        </w:rPr>
-        <w:t xml:space="preserve">조건과 군집 조건은 부록 A의 transfer DQN 학습에만 쓴다). 도어는</w:t>
-      </w:r>
-      <w:r>
-        <w:rPr>
-          <w:color w:val="000000"/>
-          <w:sz w:val="20"/>
-        </w:rPr>
-        <w:t xml:space="preserve"> </w:t>
-      </w:r>
-      <m:oMath>
-        <m:r>
-          <m:rPr>
-            <m:sty m:val="p"/>
-          </m:rPr>
-          <m:t>[</m:t>
-        </m:r>
-        <m:r>
-          <m:t>0</m:t>
-        </m:r>
-        <m:r>
-          <m:rPr>
-            <m:sty m:val="p"/>
-          </m:rPr>
-          <m:t>,</m:t>
-        </m:r>
-        <m:r>
-          <m:t>100</m:t>
-        </m:r>
-        <m:sSup>
           <m:e>
             <m:r>
               <m:rPr>
                 <m:sty m:val="p"/>
               </m:rPr>
-              <m:t>]</m:t>
-            </m:r>
-          </m:e>
-          <m:sup>
-            <m:r>
-              <m:t>2</m:t>
-            </m:r>
-          </m:sup>
-        </m:sSup>
-      </m:oMath>
-      <w:r>
-        <w:rPr>
-          <w:color w:val="000000"/>
-          <w:sz w:val="20"/>
-        </w:rPr>
-        <w:t xml:space="preserve">에 균등 랜덤</w:t>
-      </w:r>
-      <w:r>
-        <w:rPr>
-          <w:color w:val="000000"/>
-          <w:sz w:val="20"/>
-        </w:rPr>
-        <w:t xml:space="preserve"> </w:t>
-      </w:r>
-      <w:r>
-        <w:rPr>
-          <w:color w:val="000000"/>
-          <w:sz w:val="20"/>
-        </w:rPr>
-        <w:t xml:space="preserve">좌표로 배치하고 도어 간 이송시간</w:t>
-      </w:r>
-      <w:r>
-        <w:rPr>
-          <w:color w:val="000000"/>
-          <w:sz w:val="20"/>
-        </w:rPr>
-        <w:t xml:space="preserve"> </w:t>
-      </w:r>
-      <m:oMath>
-        <m:sSub>
-          <m:e>
-            <m:r>
-              <m:t>t</m:t>
+              <m:t>Δ</m:t>
             </m:r>
           </m:e>
           <m:sub>
             <m:r>
-              <m:t>m</m:t>
+              <m:t>b</m:t>
             </m:r>
             <m:r>
-              <m:t>n</m:t>
+              <m:t>o</m:t>
             </m:r>
           </m:sub>
         </m:sSub>
@@ -11196,51 +11796,16 @@
       <w:r>
         <w:rPr>
           <w:color w:val="000000"/>
-          <w:sz w:val="20"/>
-        </w:rPr>
-        <w:t xml:space="preserve">은 두 좌표 사이 유클리드 거리를 10으로 나눈</w:t>
-      </w:r>
-      <w:r>
-        <w:rPr>
-          <w:color w:val="000000"/>
-          <w:sz w:val="20"/>
-        </w:rPr>
-        <w:t xml:space="preserve"> </w:t>
-      </w:r>
-      <w:r>
-        <w:rPr>
-          <w:color w:val="000000"/>
-          <w:sz w:val="20"/>
-        </w:rPr>
-        <w:t xml:space="preserve">값이다. 도어를 일렬로 늘어놓으면 이송시간이 도어 번호 차이로 정해져 도어 배정이 해에</w:t>
-      </w:r>
-      <w:r>
-        <w:rPr>
-          <w:color w:val="000000"/>
-          <w:sz w:val="20"/>
-        </w:rPr>
-        <w:t xml:space="preserve"> </w:t>
-      </w:r>
-      <w:r>
-        <w:rPr>
-          <w:color w:val="000000"/>
-          <w:sz w:val="20"/>
-        </w:rPr>
-        <w:t xml:space="preserve">미치는 영향이 작아지므로, 배정 결정이 실제로 품질을 가르도록 무작위 배치를 쓴다. 거리를</w:t>
-      </w:r>
-      <w:r>
-        <w:rPr>
-          <w:color w:val="000000"/>
-          <w:sz w:val="20"/>
-        </w:rPr>
-        <w:t xml:space="preserve"> </w:t>
-      </w:r>
-      <w:r>
-        <w:rPr>
-          <w:color w:val="000000"/>
-          <w:sz w:val="20"/>
-        </w:rPr>
-        <w:t xml:space="preserve">10으로 나누는 것은 이송시간을 처리시간과 같은 크기 범위에 두기 위해서다.</w:t>
+          <w:sz w:val="18"/>
+        </w:rPr>
+        <w:t xml:space="preserve"/>
+      </w:r>
+      <w:r>
+        <w:rPr>
+          <w:color w:val="000000"/>
+          <w:sz w:val="18"/>
+        </w:rPr>
+        <w:t xml:space="preserve"/>
       </w:r>
     </w:p>
     <w:p>
@@ -12229,7 +12794,7 @@
           <w:color w:val="000000"/>
           <w:sz w:val="20"/>
         </w:rPr>
-        <w:t xml:space="preserve">&lt;Table 2&gt;에 20개 인스턴스에 대한 시험 결과를 요약하였다.</w:t>
+        <w:t xml:space="preserve">&lt;Table 3&gt;에 20개 인스턴스에 대한 시험 결과를 요약하였다.</w:t>
       </w:r>
       <w:hyperlink w:anchor="tab:main">
         <w:r>
@@ -12457,7 +13022,7 @@
           <w:color w:val="000000"/>
           <w:sz w:val="18"/>
         </w:rPr>
-        <w:t xml:space="preserve">Table 2. Test results over 20 instances per experimental condition (20 instances</w:t>
+        <w:t xml:space="preserve">Table 3. Test results over 20 instances per experimental condition (20 instances</w:t>
       </w:r>
       <w:r>
         <w:rPr>
@@ -17167,7 +17732,7 @@
           <w:color w:val="000000"/>
           <w:sz w:val="20"/>
         </w:rPr>
-        <w:t xml:space="preserve">full로 단조 감소한다(&lt;Figure 1&gt;)</w:t>
+        <w:t xml:space="preserve">full로 단조 감소한다(&lt;Figure 2&gt;)</w:t>
       </w:r>
       <w:hyperlink w:anchor="fig:op">
         <w:r>
@@ -17196,7 +17761,7 @@
           <w:color w:val="000000"/>
           <w:sz w:val="20"/>
         </w:rPr>
-        <w:t xml:space="preserve">Wilcoxon(&lt;Table 3&gt;)</w:t>
+        <w:t xml:space="preserve">Wilcoxon(&lt;Table 4&gt;)</w:t>
       </w:r>
       <w:hyperlink w:anchor="tab:b1">
         <w:r>
@@ -17240,7 +17805,7 @@
           <w:color w:val="000000"/>
           <w:sz w:val="18"/>
         </w:rPr>
-        <w:t xml:space="preserve">Table 3. Operator-pool ablation (5 instances</w:t>
+        <w:t xml:space="preserve">Table 4. Operator-pool ablation (5 instances</w:t>
       </w:r>
       <w:r>
         <w:rPr>
@@ -17688,7 +18253,7 @@
           <w:color w:val="000000"/>
           <w:sz w:val="18"/>
         </w:rPr>
-        <w:t xml:space="preserve">Figure 1. Mean gap to the best observed solution by operator set.</w:t>
+        <w:t xml:space="preserve">Figure 2. Mean gap to the best observed solution by operator set.</w:t>
       </w:r>
     </w:p>
     <w:bookmarkEnd w:id="25"/>
@@ -17733,7 +18298,7 @@
           <w:color w:val="000000"/>
           <w:sz w:val="20"/>
         </w:rPr>
-        <w:t xml:space="preserve">하나씩 제거하면(&lt;Table 4&gt;)</w:t>
+        <w:t xml:space="preserve">하나씩 제거하면(&lt;Table 5&gt;)</w:t>
       </w:r>
       <w:hyperlink w:anchor="tab:b2">
         <w:r>
@@ -17776,7 +18341,7 @@
           <w:color w:val="000000"/>
           <w:sz w:val="20"/>
         </w:rPr>
-        <w:t xml:space="preserve">제거해도 목적값이 나빠지지 않는다(&lt;Figure 2&gt;)</w:t>
+        <w:t xml:space="preserve">제거해도 목적값이 나빠지지 않는다(&lt;Figure 3&gt;)</w:t>
       </w:r>
       <w:hyperlink w:anchor="fig:comp">
         <w:r>
@@ -17806,7 +18371,7 @@
           <w:color w:val="000000"/>
           <w:sz w:val="18"/>
         </w:rPr>
-        <w:t xml:space="preserve">Table 4. Engine-component ablation (5 instances</w:t>
+        <w:t xml:space="preserve">Table 5. Engine-component ablation (5 instances</w:t>
       </w:r>
       <w:r>
         <w:rPr>
@@ -18332,7 +18897,7 @@
           <w:color w:val="000000"/>
           <w:sz w:val="18"/>
         </w:rPr>
-        <w:t xml:space="preserve">Figure 2. Objective degradation when each component is removed.</w:t>
+        <w:t xml:space="preserve">Figure 3. Objective degradation when each component is removed.</w:t>
       </w:r>
     </w:p>
     <w:bookmarkEnd w:id="30"/>
@@ -18362,7 +18927,7 @@
           <w:color w:val="000000"/>
           <w:sz w:val="20"/>
         </w:rPr>
-        <w:t xml:space="preserve">연산자 집합과 구성요소를 전체로 고정하고 선택 정책만 바꾸면(&lt;Table 5&gt;)</w:t>
+        <w:t xml:space="preserve">연산자 집합과 구성요소를 전체로 고정하고 선택 정책만 바꾸면(&lt;Table 6&gt;)</w:t>
       </w:r>
       <w:hyperlink w:anchor="tab:sel">
         <w:r>
@@ -18419,7 +18984,7 @@
           <w:color w:val="000000"/>
           <w:sz w:val="20"/>
         </w:rPr>
-        <w:t xml:space="preserve">(&lt;Figure 4&gt;)</w:t>
+        <w:t xml:space="preserve">(&lt;Figure 5&gt;)</w:t>
       </w:r>
       <w:hyperlink w:anchor="fig:sel">
         <w:r>
@@ -18477,7 +19042,7 @@
           <w:color w:val="000000"/>
           <w:sz w:val="18"/>
         </w:rPr>
-        <w:t xml:space="preserve">Table 5. Effect of the selection policy (5 instances</w:t>
+        <w:t xml:space="preserve">Table 6. Effect of the selection policy (5 instances</w:t>
       </w:r>
       <w:r>
         <w:rPr>
@@ -18994,7 +19559,7 @@
           <w:color w:val="000000"/>
           <w:sz w:val="20"/>
         </w:rPr>
-        <w:t xml:space="preserve">인스턴스별로 min–max 정규화해 평균한다(&lt;Figure 3&gt;)</w:t>
+        <w:t xml:space="preserve">인스턴스별로 min–max 정규화해 평균한다(&lt;Figure 4&gt;)</w:t>
       </w:r>
       <w:hyperlink w:anchor="fig:lam">
         <w:r>
@@ -19215,7 +19780,7 @@
           <w:color w:val="000000"/>
           <w:sz w:val="18"/>
         </w:rPr>
-        <w:t xml:space="preserve">Figure 3. Normalized makespan-tardiness trade-off on tuning instances.</w:t>
+        <w:t xml:space="preserve">Figure 4. Normalized makespan-tardiness trade-off on tuning instances.</w:t>
       </w:r>
     </w:p>
     <w:bookmarkEnd w:id="37"/>
@@ -20003,7 +20568,7 @@
           <w:color w:val="000000"/>
           <w:sz w:val="18"/>
         </w:rPr>
-        <w:t xml:space="preserve">Figure 4. Mean gap to the best observed solution versus the number of iterations.</w:t>
+        <w:t xml:space="preserve">Figure 5. Mean gap to the best observed solution versus the number of iterations.</w:t>
       </w:r>
     </w:p>
     <w:bookmarkEnd w:id="45"/>

</xml_diff>